<commit_message>
Recolha integrada (YouTube e sítios públicos/RSS) e SQLite explícito na arquitectura
- sistema/recolha.py: fontes registadas, robots.txt, pausa por sítio, sem sessão; YouTube Data API v3
- tabela fontes e lotes.id_fonte (com migração); página Fontes e recolha; comandos fonte-adicionar, fontes, recolher
- 42 testes; README e uan.env.exemplo actualizados
- dissertação: 3.8.3 com camada de recolha e SQLite, Tabela 3.3 (RF1, RF4, RNF5), Figs 3.3-3.6, Apêndice F

Co-Authored-By: Claude Opus 5.5 <noreply@anthropic.com>
Claude-Session: https://claude.ai/code/session_01RTNCrmFuFcvA7Trjn3iBm1
</commit_message>
<xml_diff>
--- a/docs/Dissertacao_UAN.docx
+++ b/docs/Dissertacao_UAN.docx
@@ -5065,7 +5065,7 @@
               <w:sz w:val="24"/>
               <w:szCs w:val="24"/>
             </w:rPr>
-            <w:t>21</w:t>
+            <w:t>22</w:t>
           </w:r>
         </w:p>
         <w:p>
@@ -5133,7 +5133,7 @@
               <w:sz w:val="24"/>
               <w:szCs w:val="24"/>
             </w:rPr>
-            <w:t>24</w:t>
+            <w:t>25</w:t>
           </w:r>
         </w:p>
         <w:p>
@@ -5167,7 +5167,7 @@
               <w:sz w:val="24"/>
               <w:szCs w:val="24"/>
             </w:rPr>
-            <w:t>26</w:t>
+            <w:t>27</w:t>
           </w:r>
         </w:p>
         <w:p>
@@ -5201,7 +5201,7 @@
               <w:sz w:val="24"/>
               <w:szCs w:val="24"/>
             </w:rPr>
-            <w:t>27</w:t>
+            <w:t>28</w:t>
           </w:r>
         </w:p>
         <w:p>
@@ -5235,7 +5235,7 @@
               <w:sz w:val="24"/>
               <w:szCs w:val="24"/>
             </w:rPr>
-            <w:t>28</w:t>
+            <w:t>29</w:t>
           </w:r>
         </w:p>
         <w:p>
@@ -5271,7 +5271,7 @@
               <w:sz w:val="24"/>
               <w:szCs w:val="24"/>
             </w:rPr>
-            <w:t>29</w:t>
+            <w:t>30</w:t>
           </w:r>
         </w:p>
         <w:p>
@@ -5305,7 +5305,7 @@
               <w:sz w:val="24"/>
               <w:szCs w:val="24"/>
             </w:rPr>
-            <w:t>29</w:t>
+            <w:t>30</w:t>
           </w:r>
         </w:p>
         <w:p>
@@ -5339,7 +5339,7 @@
               <w:sz w:val="24"/>
               <w:szCs w:val="24"/>
             </w:rPr>
-            <w:t>30</w:t>
+            <w:t>31</w:t>
           </w:r>
         </w:p>
         <w:p>
@@ -5373,7 +5373,7 @@
               <w:sz w:val="24"/>
               <w:szCs w:val="24"/>
             </w:rPr>
-            <w:t>31</w:t>
+            <w:t>32</w:t>
           </w:r>
         </w:p>
         <w:p>
@@ -5407,7 +5407,7 @@
               <w:sz w:val="24"/>
               <w:szCs w:val="24"/>
             </w:rPr>
-            <w:t>32</w:t>
+            <w:t>33</w:t>
           </w:r>
         </w:p>
         <w:p>
@@ -5441,7 +5441,7 @@
               <w:sz w:val="24"/>
               <w:szCs w:val="24"/>
             </w:rPr>
-            <w:t>35</w:t>
+            <w:t>36</w:t>
           </w:r>
         </w:p>
         <w:p>
@@ -5475,7 +5475,7 @@
               <w:sz w:val="24"/>
               <w:szCs w:val="24"/>
             </w:rPr>
-            <w:t>35</w:t>
+            <w:t>36</w:t>
           </w:r>
         </w:p>
         <w:p>
@@ -5509,7 +5509,7 @@
               <w:sz w:val="24"/>
               <w:szCs w:val="24"/>
             </w:rPr>
-            <w:t>36</w:t>
+            <w:t>37</w:t>
           </w:r>
         </w:p>
         <w:p>
@@ -5543,7 +5543,7 @@
               <w:sz w:val="24"/>
               <w:szCs w:val="24"/>
             </w:rPr>
-            <w:t>37</w:t>
+            <w:t>38</w:t>
           </w:r>
         </w:p>
         <w:p>
@@ -5577,7 +5577,7 @@
               <w:sz w:val="24"/>
               <w:szCs w:val="24"/>
             </w:rPr>
-            <w:t>38</w:t>
+            <w:t>39</w:t>
           </w:r>
         </w:p>
         <w:p>
@@ -5611,7 +5611,7 @@
               <w:sz w:val="24"/>
               <w:szCs w:val="24"/>
             </w:rPr>
-            <w:t>38</w:t>
+            <w:t>39</w:t>
           </w:r>
         </w:p>
         <w:p>
@@ -5645,7 +5645,7 @@
               <w:sz w:val="24"/>
               <w:szCs w:val="24"/>
             </w:rPr>
-            <w:t>40</w:t>
+            <w:t>41</w:t>
           </w:r>
         </w:p>
         <w:p>
@@ -5679,7 +5679,7 @@
               <w:sz w:val="24"/>
               <w:szCs w:val="24"/>
             </w:rPr>
-            <w:t>40</w:t>
+            <w:t>41</w:t>
           </w:r>
         </w:p>
         <w:p>
@@ -5713,7 +5713,7 @@
               <w:sz w:val="24"/>
               <w:szCs w:val="24"/>
             </w:rPr>
-            <w:t>40</w:t>
+            <w:t>41</w:t>
           </w:r>
         </w:p>
         <w:p>
@@ -5749,7 +5749,7 @@
               <w:sz w:val="24"/>
               <w:szCs w:val="24"/>
             </w:rPr>
-            <w:t>43</w:t>
+            <w:t>44</w:t>
           </w:r>
         </w:p>
         <w:p>
@@ -5783,7 +5783,7 @@
               <w:sz w:val="24"/>
               <w:szCs w:val="24"/>
             </w:rPr>
-            <w:t>43</w:t>
+            <w:t>44</w:t>
           </w:r>
         </w:p>
         <w:p>
@@ -5817,7 +5817,7 @@
               <w:sz w:val="24"/>
               <w:szCs w:val="24"/>
             </w:rPr>
-            <w:t>43</w:t>
+            <w:t>44</w:t>
           </w:r>
         </w:p>
         <w:p>
@@ -5851,7 +5851,7 @@
               <w:sz w:val="24"/>
               <w:szCs w:val="24"/>
             </w:rPr>
-            <w:t>44</w:t>
+            <w:t>45</w:t>
           </w:r>
         </w:p>
         <w:p>
@@ -5885,7 +5885,7 @@
               <w:sz w:val="24"/>
               <w:szCs w:val="24"/>
             </w:rPr>
-            <w:t>44</w:t>
+            <w:t>45</w:t>
           </w:r>
         </w:p>
         <w:p>
@@ -5919,7 +5919,7 @@
               <w:sz w:val="24"/>
               <w:szCs w:val="24"/>
             </w:rPr>
-            <w:t>45</w:t>
+            <w:t>46</w:t>
           </w:r>
         </w:p>
         <w:p>
@@ -5953,7 +5953,7 @@
               <w:sz w:val="24"/>
               <w:szCs w:val="24"/>
             </w:rPr>
-            <w:t>46</w:t>
+            <w:t>47</w:t>
           </w:r>
         </w:p>
         <w:p>
@@ -5989,7 +5989,7 @@
               <w:sz w:val="24"/>
               <w:szCs w:val="24"/>
             </w:rPr>
-            <w:t>47</w:t>
+            <w:t>48</w:t>
           </w:r>
         </w:p>
         <w:p>
@@ -6025,7 +6025,7 @@
               <w:sz w:val="24"/>
               <w:szCs w:val="24"/>
             </w:rPr>
-            <w:t>51</w:t>
+            <w:t>52</w:t>
           </w:r>
         </w:p>
         <w:p>
@@ -6955,7 +6955,7 @@
               <w:sz w:val="24"/>
               <w:szCs w:val="24"/>
             </w:rPr>
-            <w:t>F1</w:t>
+            <w:t>F2</w:t>
           </w:r>
         </w:p>
         <w:p>
@@ -6973,7 +6973,7 @@
               <w:sz w:val="24"/>
               <w:szCs w:val="24"/>
             </w:rPr>
-            <w:t xml:space="preserve">F.4 Linha de comandos</w:t>
+            <w:t xml:space="preserve">F.4 Recolha de novos dados</w:t>
           </w:r>
           <w:r>
             <w:rPr>
@@ -7007,7 +7007,7 @@
               <w:sz w:val="24"/>
               <w:szCs w:val="24"/>
             </w:rPr>
-            <w:t xml:space="preserve">F.5 Guardar o modelo depois do treino</w:t>
+            <w:t xml:space="preserve">F.5 Linha de comandos</w:t>
           </w:r>
           <w:r>
             <w:rPr>
@@ -7023,7 +7023,41 @@
               <w:sz w:val="24"/>
               <w:szCs w:val="24"/>
             </w:rPr>
-            <w:t>F2</w:t>
+            <w:t>F3</w:t>
+          </w:r>
+        </w:p>
+        <w:p>
+          <w:pPr>
+            <w:tabs>
+              <w:tab w:val="right" w:leader="dot" w:pos="8221"/>
+            </w:tabs>
+            <w:spacing w:before="0" w:after="60" w:line="276" w:lineRule="auto"/>
+            <w:ind w:left="400" w:right="560" w:hanging="0"/>
+            <w:jc w:val="left"/>
+          </w:pPr>
+          <w:r>
+            <w:rPr>
+              <w:rFonts w:ascii="Times New Roman" w:hAnsi="Times New Roman" w:cs="Times New Roman"/>
+              <w:sz w:val="24"/>
+              <w:szCs w:val="24"/>
+            </w:rPr>
+            <w:t xml:space="preserve">F.6 Guardar o modelo depois do treino</w:t>
+          </w:r>
+          <w:r>
+            <w:rPr>
+              <w:rFonts w:ascii="Times New Roman" w:hAnsi="Times New Roman" w:cs="Times New Roman"/>
+              <w:sz w:val="24"/>
+              <w:szCs w:val="24"/>
+            </w:rPr>
+            <w:tab/>
+          </w:r>
+          <w:r>
+            <w:rPr>
+              <w:rFonts w:ascii="Times New Roman" w:hAnsi="Times New Roman" w:cs="Times New Roman"/>
+              <w:sz w:val="24"/>
+              <w:szCs w:val="24"/>
+            </w:rPr>
+            <w:t>F3</w:t>
           </w:r>
         </w:p>
         <w:p>
@@ -7298,7 +7332,7 @@
               <w:sz w:val="24"/>
               <w:szCs w:val="24"/>
             </w:rPr>
-            <w:t>28</w:t>
+            <w:t>29</w:t>
           </w:r>
         </w:p>
         <w:p>
@@ -7332,7 +7366,7 @@
               <w:sz w:val="24"/>
               <w:szCs w:val="24"/>
             </w:rPr>
-            <w:t>29</w:t>
+            <w:t>30</w:t>
           </w:r>
         </w:p>
         <w:p>
@@ -7366,7 +7400,7 @@
               <w:sz w:val="24"/>
               <w:szCs w:val="24"/>
             </w:rPr>
-            <w:t>30</w:t>
+            <w:t>31</w:t>
           </w:r>
         </w:p>
         <w:p>
@@ -7400,7 +7434,7 @@
               <w:sz w:val="24"/>
               <w:szCs w:val="24"/>
             </w:rPr>
-            <w:t>32</w:t>
+            <w:t>33</w:t>
           </w:r>
         </w:p>
         <w:p>
@@ -7434,7 +7468,7 @@
               <w:sz w:val="24"/>
               <w:szCs w:val="24"/>
             </w:rPr>
-            <w:t>32</w:t>
+            <w:t>33</w:t>
           </w:r>
         </w:p>
         <w:p>
@@ -7468,7 +7502,7 @@
               <w:sz w:val="24"/>
               <w:szCs w:val="24"/>
             </w:rPr>
-            <w:t>35</w:t>
+            <w:t>36</w:t>
           </w:r>
         </w:p>
         <w:p>
@@ -7502,7 +7536,7 @@
               <w:sz w:val="24"/>
               <w:szCs w:val="24"/>
             </w:rPr>
-            <w:t>36</w:t>
+            <w:t>37</w:t>
           </w:r>
         </w:p>
         <w:p>
@@ -7536,7 +7570,7 @@
               <w:sz w:val="24"/>
               <w:szCs w:val="24"/>
             </w:rPr>
-            <w:t>37</w:t>
+            <w:t>38</w:t>
           </w:r>
         </w:p>
         <w:p>
@@ -7570,7 +7604,7 @@
               <w:sz w:val="24"/>
               <w:szCs w:val="24"/>
             </w:rPr>
-            <w:t>39</w:t>
+            <w:t>40</w:t>
           </w:r>
         </w:p>
         <w:p>
@@ -7604,7 +7638,7 @@
               <w:sz w:val="24"/>
               <w:szCs w:val="24"/>
             </w:rPr>
-            <w:t>40</w:t>
+            <w:t>41</w:t>
           </w:r>
         </w:p>
         <w:p>
@@ -7638,7 +7672,7 @@
               <w:sz w:val="24"/>
               <w:szCs w:val="24"/>
             </w:rPr>
-            <w:t>43</w:t>
+            <w:t>44</w:t>
           </w:r>
         </w:p>
         <w:p>
@@ -7910,7 +7944,7 @@
               <w:sz w:val="24"/>
               <w:szCs w:val="24"/>
             </w:rPr>
-            <w:t>F2</w:t>
+            <w:t>F3</w:t>
           </w:r>
         </w:p>
         <w:p>
@@ -8117,7 +8151,7 @@
               <w:sz w:val="24"/>
               <w:szCs w:val="24"/>
             </w:rPr>
-            <w:t>24</w:t>
+            <w:t>25</w:t>
           </w:r>
         </w:p>
         <w:p>
@@ -8151,7 +8185,7 @@
               <w:sz w:val="24"/>
               <w:szCs w:val="24"/>
             </w:rPr>
-            <w:t>25</w:t>
+            <w:t>26</w:t>
           </w:r>
         </w:p>
         <w:p>
@@ -8169,7 +8203,7 @@
               <w:sz w:val="24"/>
               <w:szCs w:val="24"/>
             </w:rPr>
-            <w:t xml:space="preserve">Figura 3.6 – Diagrama de sequência (UML): da importação à revisão</w:t>
+            <w:t xml:space="preserve">Figura 3.6 – Diagrama de sequência (UML): da recolha à revisão</w:t>
           </w:r>
           <w:r>
             <w:rPr>
@@ -8185,7 +8219,7 @@
               <w:sz w:val="24"/>
               <w:szCs w:val="24"/>
             </w:rPr>
-            <w:t>25</w:t>
+            <w:t>26</w:t>
           </w:r>
         </w:p>
         <w:p>
@@ -8219,7 +8253,7 @@
               <w:sz w:val="24"/>
               <w:szCs w:val="24"/>
             </w:rPr>
-            <w:t>26</w:t>
+            <w:t>27</w:t>
           </w:r>
         </w:p>
         <w:p>
@@ -8253,7 +8287,7 @@
               <w:sz w:val="24"/>
               <w:szCs w:val="24"/>
             </w:rPr>
-            <w:t>31</w:t>
+            <w:t>32</w:t>
           </w:r>
         </w:p>
         <w:p>
@@ -8287,7 +8321,7 @@
               <w:sz w:val="24"/>
               <w:szCs w:val="24"/>
             </w:rPr>
-            <w:t>34</w:t>
+            <w:t>35</w:t>
           </w:r>
         </w:p>
         <w:p>
@@ -8321,7 +8355,7 @@
               <w:sz w:val="24"/>
               <w:szCs w:val="24"/>
             </w:rPr>
-            <w:t>37</w:t>
+            <w:t>38</w:t>
           </w:r>
         </w:p>
         <w:p>
@@ -13892,7 +13926,7 @@
                 <w:sz w:val="19"/>
                 <w:szCs w:val="19"/>
               </w:rPr>
-              <w:t xml:space="preserve">YouTube Data API v3; recolha manual de páginas públicas</w:t>
+              <w:t xml:space="preserve">YouTube Data API v3; leitura de páginas web e feeds RSS públicos (biblioteca padrão do Python, com respeito pelo robots.txt); recolha manual</w:t>
             </w:r>
           </w:p>
         </w:tc>
@@ -13966,7 +14000,81 @@
                 <w:sz w:val="19"/>
                 <w:szCs w:val="19"/>
               </w:rPr>
-              <w:t xml:space="preserve">FastAPI, Jinja2, Uvicorn, SQLite (aplicação web sem dependências de compilação)</w:t>
+              <w:t xml:space="preserve">FastAPI, Jinja2 e Uvicorn (aplicação web sem dependências de compilação)</w:t>
+            </w:r>
+          </w:p>
+        </w:tc>
+      </w:tr>
+      <w:tr>
+        <w:trPr>
+          <w:cantSplit/>
+          <w:tblHeader w:val="false"/>
+        </w:trPr>
+        <w:tc>
+          <w:tcPr>
+            <w:tcW w:type="dxa" w:w="3200"/>
+            <w:tcBorders>
+              <w:top w:val="none" w:color="FFFFFF" w:sz="0"/>
+              <w:left w:val="none" w:color="FFFFFF" w:sz="0"/>
+              <w:bottom w:val="none" w:color="FFFFFF" w:sz="0"/>
+              <w:right w:val="none" w:color="FFFFFF" w:sz="0"/>
+            </w:tcBorders>
+            <w:tcMar>
+              <w:top w:type="dxa" w:w="50"/>
+              <w:left w:type="dxa" w:w="80"/>
+              <w:bottom w:type="dxa" w:w="50"/>
+              <w:right w:type="dxa" w:w="80"/>
+            </w:tcMar>
+            <w:vAlign w:val="center"/>
+          </w:tcPr>
+          <w:p>
+            <w:pPr>
+              <w:spacing w:line="240"/>
+              <w:jc w:val="left"/>
+            </w:pPr>
+            <w:r>
+              <w:rPr>
+                <w:rFonts w:ascii="Times New Roman" w:cs="Times New Roman" w:eastAsia="Times New Roman" w:hAnsi="Times New Roman"/>
+                <w:b w:val="false"/>
+                <w:bCs w:val="false"/>
+                <w:sz w:val="19"/>
+                <w:szCs w:val="19"/>
+              </w:rPr>
+              <w:t xml:space="preserve">Armazenamento</w:t>
+            </w:r>
+          </w:p>
+        </w:tc>
+        <w:tc>
+          <w:tcPr>
+            <w:tcW w:type="dxa" w:w="5020"/>
+            <w:tcBorders>
+              <w:top w:val="none" w:color="FFFFFF" w:sz="0"/>
+              <w:left w:val="none" w:color="FFFFFF" w:sz="0"/>
+              <w:bottom w:val="none" w:color="FFFFFF" w:sz="0"/>
+              <w:right w:val="none" w:color="FFFFFF" w:sz="0"/>
+            </w:tcBorders>
+            <w:tcMar>
+              <w:top w:type="dxa" w:w="50"/>
+              <w:left w:type="dxa" w:w="80"/>
+              <w:bottom w:type="dxa" w:w="50"/>
+              <w:right w:type="dxa" w:w="80"/>
+            </w:tcMar>
+            <w:vAlign w:val="center"/>
+          </w:tcPr>
+          <w:p>
+            <w:pPr>
+              <w:spacing w:line="240"/>
+              <w:jc w:val="left"/>
+            </w:pPr>
+            <w:r>
+              <w:rPr>
+                <w:rFonts w:ascii="Times New Roman" w:cs="Times New Roman" w:eastAsia="Times New Roman" w:hAnsi="Times New Roman"/>
+                <w:b w:val="false"/>
+                <w:bCs w:val="false"/>
+                <w:sz w:val="19"/>
+                <w:szCs w:val="19"/>
+              </w:rPr>
+              <w:t xml:space="preserve">SQLite 3 (base de dados num único ficheiro, com transacções e chaves estrangeiras)</w:t>
             </w:r>
           </w:p>
         </w:tc>
@@ -14558,7 +14666,7 @@
                 <w:sz w:val="19"/>
                 <w:szCs w:val="19"/>
               </w:rPr>
-              <w:t xml:space="preserve">Importar lotes de publicações públicas de várias vias, registando a proveniência</w:t>
+              <w:t xml:space="preserve">Recolher publicações de fontes públicas registadas: comentários do YouTube pela interface oficial e artigos de sítios de notícias e feeds RSS que não exigem conta</w:t>
             </w:r>
           </w:p>
         </w:tc>
@@ -14632,7 +14740,7 @@
                 <w:sz w:val="19"/>
                 <w:szCs w:val="19"/>
               </w:rPr>
-              <w:t xml:space="preserve">Anonimizar autores e identificadores directos antes de gravar</w:t>
+              <w:t xml:space="preserve">Importar lotes de ficheiros de outras vias, registando a proveniência de cada lote</w:t>
             </w:r>
           </w:p>
         </w:tc>
@@ -14706,7 +14814,7 @@
                 <w:sz w:val="19"/>
                 <w:szCs w:val="19"/>
               </w:rPr>
-              <w:t xml:space="preserve">Classificar as publicações em lote com o modelo seleccionado</w:t>
+              <w:t xml:space="preserve">Anonimizar autores e identificadores directos antes de gravar</w:t>
             </w:r>
           </w:p>
         </w:tc>
@@ -14780,7 +14888,7 @@
                 <w:sz w:val="19"/>
                 <w:szCs w:val="19"/>
               </w:rPr>
-              <w:t xml:space="preserve">Apresentar uma fila de revisão ordenada por prioridade</w:t>
+              <w:t xml:space="preserve">Guardar lotes, publicações, classificações, revisões e auditoria numa base de dados relacional</w:t>
             </w:r>
           </w:p>
         </w:tc>
@@ -14854,7 +14962,7 @@
                 <w:sz w:val="19"/>
                 <w:szCs w:val="19"/>
               </w:rPr>
-              <w:t xml:space="preserve">Registar a decisão do analista e exportá-la para novo treino</w:t>
+              <w:t xml:space="preserve">Classificar as publicações em lote com o modelo seleccionado</w:t>
             </w:r>
           </w:p>
         </w:tc>
@@ -14928,7 +15036,7 @@
                 <w:sz w:val="19"/>
                 <w:szCs w:val="19"/>
               </w:rPr>
-              <w:t xml:space="preserve">Calcular métricas operacionais: precisão nos primeiros K, κ analista–sistema e entre analistas, sensibilidade estimada, latência</w:t>
+              <w:t xml:space="preserve">Apresentar uma fila de revisão ordenada por prioridade</w:t>
             </w:r>
           </w:p>
         </w:tc>
@@ -15002,7 +15110,7 @@
                 <w:sz w:val="19"/>
                 <w:szCs w:val="19"/>
               </w:rPr>
-              <w:t xml:space="preserve">Controlar o acesso por contas individuais com dois papéis (analista e supervisor)</w:t>
+              <w:t xml:space="preserve">Registar a decisão do analista e exportá-la para novo treino</w:t>
             </w:r>
           </w:p>
         </w:tc>
@@ -15076,7 +15184,7 @@
                 <w:sz w:val="19"/>
                 <w:szCs w:val="19"/>
               </w:rPr>
-              <w:t xml:space="preserve">Permitir a avaliação independente por vários analistas, com revisão cega e amostra de controlo</w:t>
+              <w:t xml:space="preserve">Calcular métricas operacionais: precisão nos primeiros K, κ analista–sistema e entre analistas, sensibilidade estimada, latência</w:t>
             </w:r>
           </w:p>
         </w:tc>
@@ -15116,7 +15224,7 @@
                 <w:sz w:val="19"/>
                 <w:szCs w:val="19"/>
               </w:rPr>
-              <w:t xml:space="preserve">RNF1</w:t>
+              <w:t xml:space="preserve">RF9</w:t>
             </w:r>
           </w:p>
         </w:tc>
@@ -15150,7 +15258,7 @@
                 <w:sz w:val="19"/>
                 <w:szCs w:val="19"/>
               </w:rPr>
-              <w:t xml:space="preserve">Funcionar num único servidor, com software livre e sem serviços externos obrigatórios</w:t>
+              <w:t xml:space="preserve">Controlar o acesso por contas individuais com dois papéis (analista e supervisor)</w:t>
             </w:r>
           </w:p>
         </w:tc>
@@ -15190,7 +15298,7 @@
                 <w:sz w:val="19"/>
                 <w:szCs w:val="19"/>
               </w:rPr>
-              <w:t xml:space="preserve">RNF2</w:t>
+              <w:t xml:space="preserve">RF10</w:t>
             </w:r>
           </w:p>
         </w:tc>
@@ -15224,7 +15332,229 @@
                 <w:sz w:val="19"/>
                 <w:szCs w:val="19"/>
               </w:rPr>
+              <w:t xml:space="preserve">Permitir a avaliação independente por vários analistas, com revisão cega e amostra de controlo</w:t>
+            </w:r>
+          </w:p>
+        </w:tc>
+      </w:tr>
+      <w:tr>
+        <w:trPr>
+          <w:cantSplit/>
+          <w:tblHeader w:val="false"/>
+        </w:trPr>
+        <w:tc>
+          <w:tcPr>
+            <w:tcW w:type="dxa" w:w="1100"/>
+            <w:tcBorders>
+              <w:top w:val="none" w:color="FFFFFF" w:sz="0"/>
+              <w:left w:val="none" w:color="FFFFFF" w:sz="0"/>
+              <w:bottom w:val="none" w:color="FFFFFF" w:sz="0"/>
+              <w:right w:val="none" w:color="FFFFFF" w:sz="0"/>
+            </w:tcBorders>
+            <w:tcMar>
+              <w:top w:type="dxa" w:w="50"/>
+              <w:left w:type="dxa" w:w="80"/>
+              <w:bottom w:type="dxa" w:w="50"/>
+              <w:right w:type="dxa" w:w="80"/>
+            </w:tcMar>
+            <w:vAlign w:val="center"/>
+          </w:tcPr>
+          <w:p>
+            <w:pPr>
+              <w:spacing w:line="240"/>
+              <w:jc w:val="left"/>
+            </w:pPr>
+            <w:r>
+              <w:rPr>
+                <w:rFonts w:ascii="Times New Roman" w:cs="Times New Roman" w:eastAsia="Times New Roman" w:hAnsi="Times New Roman"/>
+                <w:b w:val="false"/>
+                <w:bCs w:val="false"/>
+                <w:sz w:val="19"/>
+                <w:szCs w:val="19"/>
+              </w:rPr>
+              <w:t xml:space="preserve">RNF1</w:t>
+            </w:r>
+          </w:p>
+        </w:tc>
+        <w:tc>
+          <w:tcPr>
+            <w:tcW w:type="dxa" w:w="7120"/>
+            <w:tcBorders>
+              <w:top w:val="none" w:color="FFFFFF" w:sz="0"/>
+              <w:left w:val="none" w:color="FFFFFF" w:sz="0"/>
+              <w:bottom w:val="none" w:color="FFFFFF" w:sz="0"/>
+              <w:right w:val="none" w:color="FFFFFF" w:sz="0"/>
+            </w:tcBorders>
+            <w:tcMar>
+              <w:top w:type="dxa" w:w="50"/>
+              <w:left w:type="dxa" w:w="80"/>
+              <w:bottom w:type="dxa" w:w="50"/>
+              <w:right w:type="dxa" w:w="80"/>
+            </w:tcMar>
+            <w:vAlign w:val="center"/>
+          </w:tcPr>
+          <w:p>
+            <w:pPr>
+              <w:spacing w:line="240"/>
+              <w:jc w:val="left"/>
+            </w:pPr>
+            <w:r>
+              <w:rPr>
+                <w:rFonts w:ascii="Times New Roman" w:cs="Times New Roman" w:eastAsia="Times New Roman" w:hAnsi="Times New Roman"/>
+                <w:b w:val="false"/>
+                <w:bCs w:val="false"/>
+                <w:sz w:val="19"/>
+                <w:szCs w:val="19"/>
+              </w:rPr>
+              <w:t xml:space="preserve">Funcionar num único servidor, com software livre e sem serviços externos obrigatórios</w:t>
+            </w:r>
+          </w:p>
+        </w:tc>
+      </w:tr>
+      <w:tr>
+        <w:trPr>
+          <w:cantSplit/>
+          <w:tblHeader w:val="false"/>
+        </w:trPr>
+        <w:tc>
+          <w:tcPr>
+            <w:tcW w:type="dxa" w:w="1100"/>
+            <w:tcBorders>
+              <w:top w:val="none" w:color="FFFFFF" w:sz="0"/>
+              <w:left w:val="none" w:color="FFFFFF" w:sz="0"/>
+              <w:bottom w:val="none" w:color="FFFFFF" w:sz="0"/>
+              <w:right w:val="none" w:color="FFFFFF" w:sz="0"/>
+            </w:tcBorders>
+            <w:tcMar>
+              <w:top w:type="dxa" w:w="50"/>
+              <w:left w:type="dxa" w:w="80"/>
+              <w:bottom w:type="dxa" w:w="50"/>
+              <w:right w:type="dxa" w:w="80"/>
+            </w:tcMar>
+            <w:vAlign w:val="center"/>
+          </w:tcPr>
+          <w:p>
+            <w:pPr>
+              <w:spacing w:line="240"/>
+              <w:jc w:val="left"/>
+            </w:pPr>
+            <w:r>
+              <w:rPr>
+                <w:rFonts w:ascii="Times New Roman" w:cs="Times New Roman" w:eastAsia="Times New Roman" w:hAnsi="Times New Roman"/>
+                <w:b w:val="false"/>
+                <w:bCs w:val="false"/>
+                <w:sz w:val="19"/>
+                <w:szCs w:val="19"/>
+              </w:rPr>
+              <w:t xml:space="preserve">RNF2</w:t>
+            </w:r>
+          </w:p>
+        </w:tc>
+        <w:tc>
+          <w:tcPr>
+            <w:tcW w:type="dxa" w:w="7120"/>
+            <w:tcBorders>
+              <w:top w:val="none" w:color="FFFFFF" w:sz="0"/>
+              <w:left w:val="none" w:color="FFFFFF" w:sz="0"/>
+              <w:bottom w:val="none" w:color="FFFFFF" w:sz="0"/>
+              <w:right w:val="none" w:color="FFFFFF" w:sz="0"/>
+            </w:tcBorders>
+            <w:tcMar>
+              <w:top w:type="dxa" w:w="50"/>
+              <w:left w:type="dxa" w:w="80"/>
+              <w:bottom w:type="dxa" w:w="50"/>
+              <w:right w:type="dxa" w:w="80"/>
+            </w:tcMar>
+            <w:vAlign w:val="center"/>
+          </w:tcPr>
+          <w:p>
+            <w:pPr>
+              <w:spacing w:line="240"/>
+              <w:jc w:val="left"/>
+            </w:pPr>
+            <w:r>
+              <w:rPr>
+                <w:rFonts w:ascii="Times New Roman" w:cs="Times New Roman" w:eastAsia="Times New Roman" w:hAnsi="Times New Roman"/>
+                <w:b w:val="false"/>
+                <w:bCs w:val="false"/>
+                <w:sz w:val="19"/>
+                <w:szCs w:val="19"/>
+              </w:rPr>
               <w:t xml:space="preserve">Conformidade com a Lei n.º 22/11: minimização, pseudonimização, conservação limitada, auditoria</w:t>
+            </w:r>
+          </w:p>
+        </w:tc>
+      </w:tr>
+      <w:tr>
+        <w:trPr>
+          <w:cantSplit/>
+          <w:tblHeader w:val="false"/>
+        </w:trPr>
+        <w:tc>
+          <w:tcPr>
+            <w:tcW w:type="dxa" w:w="1100"/>
+            <w:tcBorders>
+              <w:top w:val="none" w:color="FFFFFF" w:sz="0"/>
+              <w:left w:val="none" w:color="FFFFFF" w:sz="0"/>
+              <w:bottom w:val="none" w:color="FFFFFF" w:sz="0"/>
+              <w:right w:val="none" w:color="FFFFFF" w:sz="0"/>
+            </w:tcBorders>
+            <w:tcMar>
+              <w:top w:type="dxa" w:w="50"/>
+              <w:left w:type="dxa" w:w="80"/>
+              <w:bottom w:type="dxa" w:w="50"/>
+              <w:right w:type="dxa" w:w="80"/>
+            </w:tcMar>
+            <w:vAlign w:val="center"/>
+          </w:tcPr>
+          <w:p>
+            <w:pPr>
+              <w:spacing w:line="240"/>
+              <w:jc w:val="left"/>
+            </w:pPr>
+            <w:r>
+              <w:rPr>
+                <w:rFonts w:ascii="Times New Roman" w:cs="Times New Roman" w:eastAsia="Times New Roman" w:hAnsi="Times New Roman"/>
+                <w:b w:val="false"/>
+                <w:bCs w:val="false"/>
+                <w:sz w:val="19"/>
+                <w:szCs w:val="19"/>
+              </w:rPr>
+              <w:t xml:space="preserve">RNF5</w:t>
+            </w:r>
+          </w:p>
+        </w:tc>
+        <w:tc>
+          <w:tcPr>
+            <w:tcW w:type="dxa" w:w="7120"/>
+            <w:tcBorders>
+              <w:top w:val="none" w:color="FFFFFF" w:sz="0"/>
+              <w:left w:val="none" w:color="FFFFFF" w:sz="0"/>
+              <w:bottom w:val="none" w:color="FFFFFF" w:sz="0"/>
+              <w:right w:val="none" w:color="FFFFFF" w:sz="0"/>
+            </w:tcBorders>
+            <w:tcMar>
+              <w:top w:type="dxa" w:w="50"/>
+              <w:left w:type="dxa" w:w="80"/>
+              <w:bottom w:type="dxa" w:w="50"/>
+              <w:right w:type="dxa" w:w="80"/>
+            </w:tcMar>
+            <w:vAlign w:val="center"/>
+          </w:tcPr>
+          <w:p>
+            <w:pPr>
+              <w:spacing w:line="240"/>
+              <w:jc w:val="left"/>
+            </w:pPr>
+            <w:r>
+              <w:rPr>
+                <w:rFonts w:ascii="Times New Roman" w:cs="Times New Roman" w:eastAsia="Times New Roman" w:hAnsi="Times New Roman"/>
+                <w:b w:val="false"/>
+                <w:bCs w:val="false"/>
+                <w:sz w:val="19"/>
+                <w:szCs w:val="19"/>
+              </w:rPr>
+              <w:t xml:space="preserve">Recolher apenas conteúdo público, sem contornar protecções técnicas nem condições de acesso dos sítios</w:t>
             </w:r>
           </w:p>
         </w:tc>
@@ -16116,7 +16446,7 @@
                 <w:sz w:val="18"/>
                 <w:szCs w:val="18"/>
               </w:rPr>
-              <w:t xml:space="preserve">Interfaces oficiais, recolha manual e exportações</w:t>
+              <w:t xml:space="preserve">Interfaces oficiais, sítios públicos sem conta (respeitando o robots.txt), recolha manual e exportações</w:t>
             </w:r>
           </w:p>
         </w:tc>
@@ -16388,7 +16718,7 @@
           <w:sz w:val="24"/>
           <w:szCs w:val="24"/>
         </w:rPr>
-        <w:t xml:space="preserve">A Figura 3.3 apresenta a arquitectura adoptada, organizada em cinco camadas.</w:t>
+        <w:t xml:space="preserve">A Figura 3.3 apresenta a arquitectura adoptada, organizada em seis camadas.</w:t>
       </w:r>
     </w:p>
     <w:p>
@@ -16400,7 +16730,7 @@
       <w:r>
         <w:drawing>
           <wp:inline distT="0" distB="0" distL="0" distR="0">
-            <wp:extent cx="5581650" cy="3590925"/>
+            <wp:extent cx="5581650" cy="4381500"/>
             <wp:effectExtent t="0" r="0" b="0" l="0"/>
             <wp:docPr id="1" name="fig3_3_arquitectura.png" descr="fig3_3_arquitectura.png" title="fig3_3_arquitectura.png"/>
             <wp:cNvGraphicFramePr>
@@ -16425,7 +16755,7 @@
                   <pic:spPr bwMode="auto">
                     <a:xfrm>
                       <a:off x="0" y="0"/>
-                      <a:ext cx="5581650" cy="3590925"/>
+                      <a:ext cx="5581650" cy="4381500"/>
                     </a:xfrm>
                     <a:prstGeom prst="rect">
                       <a:avLst/>
@@ -16481,7 +16811,7 @@
           <w:sz w:val="24"/>
           <w:szCs w:val="24"/>
         </w:rPr>
-        <w:t xml:space="preserve"> Comentários obtidos pela interface oficial do YouTube, recolha manual de páginas públicas e conjuntos de dados doados ou de terceiros. Cada via é declarada no momento da importação.</w:t>
+        <w:t xml:space="preserve"> O sistema recolhe ele próprio de duas origens. A primeira é o YouTube, pela interface oficial (YouTube Data API v3): para um vídeo ou para os vídeos mais recentes de um canal, obtém os comentários e as respostas. A segunda são sítios da internet de acesso livre, que não exigem conta nem estão protegidos por barreiras de acesso, como os portais dos órgãos de comunicação angolanos: o sistema lê feeds RSS, artigos isolados ou a página inicial de uma secção, a partir da qual segue as ligações para artigos do mesmo sítio. Das redes que exigem conta, como o Facebook, o conteúdo público entra por importação de ficheiros, tal como os conjuntos de dados doados ou de terceiros. Cada fonte e cada via ficam registadas com o lote.</w:t>
       </w:r>
     </w:p>
     <w:p>
@@ -16502,15 +16832,15 @@
           <w:sz w:val="24"/>
           <w:szCs w:val="24"/>
         </w:rPr>
-        <w:t xml:space="preserve">Ingestão.</w:t>
-      </w:r>
-      <w:r>
-        <w:rPr>
-          <w:rFonts w:ascii="Times New Roman" w:cs="Times New Roman" w:eastAsia="Times New Roman" w:hAnsi="Times New Roman"/>
-          <w:sz w:val="24"/>
-          <w:szCs w:val="24"/>
-        </w:rPr>
-        <w:t xml:space="preserve"> O módulo de importação lê ficheiros CSV ou JSON, reconhece os nomes de colunas habituais dos </w:t>
+        <w:t xml:space="preserve">Recolha.</w:t>
+      </w:r>
+      <w:r>
+        <w:rPr>
+          <w:rFonts w:ascii="Times New Roman" w:cs="Times New Roman" w:eastAsia="Times New Roman" w:hAnsi="Times New Roman"/>
+          <w:sz w:val="24"/>
+          <w:szCs w:val="24"/>
+        </w:rPr>
+        <w:t xml:space="preserve"> O supervisor regista as fontes na aplicação, indicando o tipo, o endereço e o número máximo de itens, e lança a recolha a pedido ou por tarefa agendada. Antes de cada pedido a um sítio, o módulo de recolha consulta o ficheiro robots.txt e respeita as exclusões; identifica-se como ferramenta de investigação, espera alguns segundos entre pedidos ao mesmo sítio e não guarda </w:t>
       </w:r>
       <w:r>
         <w:rPr>
@@ -16520,15 +16850,15 @@
           <w:sz w:val="24"/>
           <w:szCs w:val="24"/>
         </w:rPr>
-        <w:t xml:space="preserve">scripts</w:t>
-      </w:r>
-      <w:r>
-        <w:rPr>
-          <w:rFonts w:ascii="Times New Roman" w:cs="Times New Roman" w:eastAsia="Times New Roman" w:hAnsi="Times New Roman"/>
-          <w:sz w:val="24"/>
-          <w:szCs w:val="24"/>
-        </w:rPr>
-        <w:t xml:space="preserve"> de recolha, mascara identificadores no texto e substitui o autor por um pseudónimo HMAC-SHA-256 com um segredo guardado fora do código. Sem esse segredo, o </w:t>
+        <w:t xml:space="preserve">cookies</w:t>
+      </w:r>
+      <w:r>
+        <w:rPr>
+          <w:rFonts w:ascii="Times New Roman" w:cs="Times New Roman" w:eastAsia="Times New Roman" w:hAnsi="Times New Roman"/>
+          <w:sz w:val="24"/>
+          <w:szCs w:val="24"/>
+        </w:rPr>
+        <w:t xml:space="preserve">. Páginas com formulário de palavra-passe ou respostas de acesso negado são ignoradas. Não há rotação de endereços IP, identidades falsas nem resolução de </w:t>
       </w:r>
       <w:r>
         <w:rPr>
@@ -16538,15 +16868,15 @@
           <w:sz w:val="24"/>
           <w:szCs w:val="24"/>
         </w:rPr>
-        <w:t xml:space="preserve">hash</w:t>
-      </w:r>
-      <w:r>
-        <w:rPr>
-          <w:rFonts w:ascii="Times New Roman" w:cs="Times New Roman" w:eastAsia="Times New Roman" w:hAnsi="Times New Roman"/>
-          <w:sz w:val="24"/>
-          <w:szCs w:val="24"/>
-        </w:rPr>
-        <w:t xml:space="preserve"> de um nome de utilizador podia ser revertido por dicionário. O ficheiro original não é guardado.</w:t>
+        <w:t xml:space="preserve">captchas</w:t>
+      </w:r>
+      <w:r>
+        <w:rPr>
+          <w:rFonts w:ascii="Times New Roman" w:cs="Times New Roman" w:eastAsia="Times New Roman" w:hAnsi="Times New Roman"/>
+          <w:sz w:val="24"/>
+          <w:szCs w:val="24"/>
+        </w:rPr>
+        <w:t xml:space="preserve">. De cada artigo guarda-se o título, a data e os primeiros parágrafos, o suficiente para a classificação, sem copiar o artigo inteiro. Cada recolha cria um lote e entrega os registos à camada de ingestão.</w:t>
       </w:r>
     </w:p>
     <w:p>
@@ -16567,15 +16897,51 @@
           <w:sz w:val="24"/>
           <w:szCs w:val="24"/>
         </w:rPr>
-        <w:t xml:space="preserve">Dados.</w:t>
-      </w:r>
-      <w:r>
-        <w:rPr>
-          <w:rFonts w:ascii="Times New Roman" w:cs="Times New Roman" w:eastAsia="Times New Roman" w:hAnsi="Times New Roman"/>
-          <w:sz w:val="24"/>
-          <w:szCs w:val="24"/>
-        </w:rPr>
-        <w:t xml:space="preserve"> Uma base de dados relacional guarda os lotes, as publicações, as classificações, as revisões (uma por analista e publicação), a amostra de controlo, os utilizadores e as sessões, as definições e o registo de auditoria (Figura 3.4).</w:t>
+        <w:t xml:space="preserve">Ingestão.</w:t>
+      </w:r>
+      <w:r>
+        <w:rPr>
+          <w:rFonts w:ascii="Times New Roman" w:cs="Times New Roman" w:eastAsia="Times New Roman" w:hAnsi="Times New Roman"/>
+          <w:sz w:val="24"/>
+          <w:szCs w:val="24"/>
+        </w:rPr>
+        <w:t xml:space="preserve"> Os registos recolhidos e os ficheiros importados passam pelo mesmo módulo. Este lê ficheiros CSV ou JSON, reconhece os nomes de colunas habituais dos </w:t>
+      </w:r>
+      <w:r>
+        <w:rPr>
+          <w:rFonts w:ascii="Times New Roman" w:cs="Times New Roman" w:eastAsia="Times New Roman" w:hAnsi="Times New Roman"/>
+          <w:i/>
+          <w:iCs/>
+          <w:sz w:val="24"/>
+          <w:szCs w:val="24"/>
+        </w:rPr>
+        <w:t xml:space="preserve">scripts</w:t>
+      </w:r>
+      <w:r>
+        <w:rPr>
+          <w:rFonts w:ascii="Times New Roman" w:cs="Times New Roman" w:eastAsia="Times New Roman" w:hAnsi="Times New Roman"/>
+          <w:sz w:val="24"/>
+          <w:szCs w:val="24"/>
+        </w:rPr>
+        <w:t xml:space="preserve"> de recolha, mascara identificadores no texto e substitui o autor por um pseudónimo HMAC-SHA-256 com um segredo guardado fora do código. Sem esse segredo, o </w:t>
+      </w:r>
+      <w:r>
+        <w:rPr>
+          <w:rFonts w:ascii="Times New Roman" w:cs="Times New Roman" w:eastAsia="Times New Roman" w:hAnsi="Times New Roman"/>
+          <w:i/>
+          <w:iCs/>
+          <w:sz w:val="24"/>
+          <w:szCs w:val="24"/>
+        </w:rPr>
+        <w:t xml:space="preserve">hash</w:t>
+      </w:r>
+      <w:r>
+        <w:rPr>
+          <w:rFonts w:ascii="Times New Roman" w:cs="Times New Roman" w:eastAsia="Times New Roman" w:hAnsi="Times New Roman"/>
+          <w:sz w:val="24"/>
+          <w:szCs w:val="24"/>
+        </w:rPr>
+        <w:t xml:space="preserve"> de um nome de utilizador podia ser revertido por dicionário. O ficheiro original não é guardado.</w:t>
       </w:r>
     </w:p>
     <w:p>
@@ -16596,15 +16962,15 @@
           <w:sz w:val="24"/>
           <w:szCs w:val="24"/>
         </w:rPr>
-        <w:t xml:space="preserve">Inferência.</w:t>
-      </w:r>
-      <w:r>
-        <w:rPr>
-          <w:rFonts w:ascii="Times New Roman" w:cs="Times New Roman" w:eastAsia="Times New Roman" w:hAnsi="Times New Roman"/>
-          <w:sz w:val="24"/>
-          <w:szCs w:val="24"/>
-        </w:rPr>
-        <w:t xml:space="preserve"> O serviço carrega o BERTimbau afinado uma única vez e classifica as publicações pendentes em segundo plano, gravando os resultados por sublotes de 32, para que as primeiras publicações cheguem à fila sem esperar pelo lote inteiro. A prioridade de cada publicação é a probabilidade de não ser Normal, 1 − P(Normal). Esta escolha faz subir na fila uma publicação com 45% de probabilidade de Mobilização Hostil, mesmo que a categoria mais provável seja Normal.</w:t>
+        <w:t xml:space="preserve">Dados.</w:t>
+      </w:r>
+      <w:r>
+        <w:rPr>
+          <w:rFonts w:ascii="Times New Roman" w:cs="Times New Roman" w:eastAsia="Times New Roman" w:hAnsi="Times New Roman"/>
+          <w:sz w:val="24"/>
+          <w:szCs w:val="24"/>
+        </w:rPr>
+        <w:t xml:space="preserve"> O armazenamento usa SQLite, um motor de base de dados relacional que guarda tudo num único ficheiro (por omissão, dados\sistema.db), não precisa de servidor próprio e suporta transacções e chaves estrangeiras. A base de dados guarda as fontes de recolha, os lotes, as publicações, as classificações, as revisões (uma por analista e publicação), a amostra de controlo, os utilizadores e as sessões, as definições e o registo de auditoria (Figura 3.4). O modo de diário WAL permite que a classificação em segundo plano grave enquanto os analistas consultam a fila. A cópia de segurança é feita com a função de cópia em linha do SQLite, sem parar o serviço. Para vários servidores ou volumes maiores, o mesmo esquema pode passar para PostgreSQL.</w:t>
       </w:r>
     </w:p>
     <w:p>
@@ -16625,6 +16991,35 @@
           <w:sz w:val="24"/>
           <w:szCs w:val="24"/>
         </w:rPr>
+        <w:t xml:space="preserve">Inferência.</w:t>
+      </w:r>
+      <w:r>
+        <w:rPr>
+          <w:rFonts w:ascii="Times New Roman" w:cs="Times New Roman" w:eastAsia="Times New Roman" w:hAnsi="Times New Roman"/>
+          <w:sz w:val="24"/>
+          <w:szCs w:val="24"/>
+        </w:rPr>
+        <w:t xml:space="preserve"> O serviço carrega o BERTimbau afinado uma única vez e classifica as publicações pendentes em segundo plano, gravando os resultados por sublotes de 32, para que as primeiras publicações cheguem à fila sem esperar pelo lote inteiro. A prioridade de cada publicação é a probabilidade de não ser Normal, 1 − P(Normal). Esta escolha faz subir na fila uma publicação com 45% de probabilidade de Mobilização Hostil, mesmo que a categoria mais provável seja Normal.</w:t>
+      </w:r>
+    </w:p>
+    <w:p>
+      <w:pPr>
+        <w:pStyle w:val="ListParagraph"/>
+        <w:numPr>
+          <w:ilvl w:val="0"/>
+          <w:numId w:val="2"/>
+        </w:numPr>
+        <w:spacing w:after="60" w:line="360"/>
+        <w:jc w:val="both"/>
+      </w:pPr>
+      <w:r>
+        <w:rPr>
+          <w:rFonts w:ascii="Times New Roman" w:cs="Times New Roman" w:eastAsia="Times New Roman" w:hAnsi="Times New Roman"/>
+          <w:b/>
+          <w:bCs/>
+          <w:sz w:val="24"/>
+          <w:szCs w:val="24"/>
+        </w:rPr>
         <w:t xml:space="preserve">Apresentação.</w:t>
       </w:r>
       <w:r>
@@ -16676,7 +17071,7 @@
       <w:r>
         <w:drawing>
           <wp:inline distT="0" distB="0" distL="0" distR="0">
-            <wp:extent cx="5400675" cy="3514725"/>
+            <wp:extent cx="5400675" cy="4333875"/>
             <wp:effectExtent t="0" r="0" b="0" l="0"/>
             <wp:docPr id="1" name="fig3_4_dados.png" descr="fig3_4_dados.png" title="fig3_4_dados.png"/>
             <wp:cNvGraphicFramePr>
@@ -16701,7 +17096,7 @@
                   <pic:spPr bwMode="auto">
                     <a:xfrm>
                       <a:off x="0" y="0"/>
-                      <a:ext cx="5400675" cy="3514725"/>
+                      <a:ext cx="5400675" cy="4333875"/>
                     </a:xfrm>
                     <a:prstGeom prst="rect">
                       <a:avLst/>
@@ -16760,7 +17155,7 @@
           <w:sz w:val="24"/>
           <w:szCs w:val="24"/>
         </w:rPr>
-        <w:t xml:space="preserve">O sistema tem quatro actores (Figura 3.5). O analista revê a sua fila e a amostra de controlo e consulta o panorama. O supervisor, que também pode rever, importa lotes, sorteia a amostra de controlo, gere as contas, consulta métricas e auditoria, activa a revisão cega e aplica o prazo de conservação. O serviço de inferência classifica em segundo plano cada lote importado. O investigador exporta as revisões e treina novas versões do modelo.</w:t>
+        <w:t xml:space="preserve">O sistema tem quatro actores (Figura 3.5). O analista revê a sua fila e a amostra de controlo e consulta o panorama. O supervisor, que também pode rever, regista as fontes públicas e lança a recolha, importa lotes, sorteia a amostra de controlo, gere as contas, consulta métricas e auditoria, activa a revisão cega e aplica o prazo de conservação. O serviço de inferência classifica em segundo plano cada lote recolhido ou importado. O investigador exporta as revisões e treina novas versões do modelo.</w:t>
       </w:r>
     </w:p>
     <w:p>
@@ -16839,7 +17234,7 @@
           <w:sz w:val="24"/>
           <w:szCs w:val="24"/>
         </w:rPr>
-        <w:t xml:space="preserve">A Figura 3.6 mostra a sequência de operações desde a importação de um lote até à gravação da decisão do analista.</w:t>
+        <w:t xml:space="preserve">A Figura 3.6 mostra a sequência de operações desde a recolha ou importação de um lote até à gravação da decisão do analista.</w:t>
       </w:r>
     </w:p>
     <w:p>
@@ -16903,7 +17298,7 @@
           <w:sz w:val="20"/>
           <w:szCs w:val="20"/>
         </w:rPr>
-        <w:t xml:space="preserve">Figura 3.6 – Diagrama de sequência (UML): da importação à revisão</w:t>
+        <w:t xml:space="preserve">Figura 3.6 – Diagrama de sequência (UML): da recolha à revisão</w:t>
       </w:r>
     </w:p>
     <w:p>
@@ -17045,7 +17440,7 @@
           <w:sz w:val="24"/>
           <w:szCs w:val="24"/>
         </w:rPr>
-        <w:t xml:space="preserve">As principais funções estão também disponíveis numa interface de programação JSON, protegida por chave, para integração com outros componentes, e numa linha de comandos, para tarefas agendadas como a importação, a limpeza e as cópias de segurança. O manual de instalação e utilização consta do Apêndice F.</w:t>
+        <w:t xml:space="preserve">As principais funções estão também disponíveis numa interface de programação JSON, protegida por chave, para integração com outros componentes, e numa linha de comandos, para tarefas agendadas como a recolha periódica das fontes, a importação, a limpeza e as cópias de segurança. O manual de instalação e utilização consta do Apêndice F.</w:t>
       </w:r>
     </w:p>
     <w:p>
@@ -17078,7 +17473,7 @@
           <w:sz w:val="24"/>
           <w:szCs w:val="24"/>
         </w:rPr>
-        <w:t xml:space="preserve">O sistema tem 31 testes automáticos. Cobrem a anonimização (máscaras e pseudónimos), a importação (deduplicação e rejeição de vias não previstas), o fluxo completo de importação, classificação, revisão, métricas e exportação, a gravação por sublotes, o prazo de conservação e as cópias de segurança, o carregamento de um modelo BERT guardado em disco e a interface de programação. Do lado da aplicação web, testam o controlo de acesso por papel, o bloqueio após tentativas falhadas, a protecção CSRF, o escape de texto malicioso, a revisão independente por dois analistas, a revisão cega, a amostra de controlo reprodutível e a migração automática do esquema da base de dados. Os testes são executados com o comando </w:t>
+        <w:t xml:space="preserve">O sistema tem 42 testes automáticos. Cobrem a anonimização (máscaras e pseudónimos), a importação (deduplicação e rejeição de vias não previstas), a recolha (com um sítio de notícias simulado localmente, verifica-se que o robots.txt é respeitado, que as páginas com início de sessão e as de outros sítios ficam de fora, que os feeds RSS são lidos e que os comentários do YouTube, obtidos de um cliente simulado, chegam anonimizados à base de dados), o fluxo completo de importação, classificação, revisão, métricas e exportação, a gravação por sublotes, o prazo de conservação e as cópias de segurança, o carregamento de um modelo BERT guardado em disco e a interface de programação. Do lado da aplicação web, testam o controlo de acesso por papel, o bloqueio após tentativas falhadas, a protecção CSRF, o escape de texto malicioso, a revisão independente por dois analistas, a revisão cega, a amostra de controlo reprodutível e a migração automática do esquema da base de dados. Os testes são executados com o comando </w:t>
       </w:r>
       <w:r>
         <w:rPr>
@@ -29789,7 +30184,7 @@
                 <w:sz w:val="18"/>
                 <w:szCs w:val="18"/>
               </w:rPr>
-              <w:t xml:space="preserve">Aplicação web com contas e papéis, ingestão anonimizada, base de dados auditada, classificação em segundo plano, fila por analista, revisão cega e amostra de controlo; 31 testes; tempo de processamento medido (0,63 s por publicação em CPU; primeiras publicações na fila em 36 s com sublotes); avaliação com analistas por fazer</w:t>
+              <w:t xml:space="preserve">Aplicação web com contas e papéis, ingestão anonimizada, base de dados auditada, classificação em segundo plano, fila por analista, revisão cega e amostra de controlo; recolha integrada do YouTube e de sítios públicos; base de dados SQLite; 42 testes; tempo de processamento medido (0,63 s por publicação em CPU; primeiras publicações na fila em 36 s com sublotes); avaliação com analistas por fazer</w:t>
             </w:r>
           </w:p>
         </w:tc>
@@ -45799,7 +46194,7 @@
             <w:tcBorders>
               <w:top w:val="none" w:color="FFFFFF" w:sz="0"/>
               <w:left w:val="none" w:color="FFFFFF" w:sz="0"/>
-              <w:bottom w:val="single" w:color="000000" w:sz="4"/>
+              <w:bottom w:val="none" w:color="FFFFFF" w:sz="0"/>
               <w:right w:val="none" w:color="FFFFFF" w:sz="0"/>
             </w:tcBorders>
             <w:tcMar>
@@ -45833,7 +46228,7 @@
             <w:tcBorders>
               <w:top w:val="none" w:color="FFFFFF" w:sz="0"/>
               <w:left w:val="none" w:color="FFFFFF" w:sz="0"/>
-              <w:bottom w:val="single" w:color="000000" w:sz="4"/>
+              <w:bottom w:val="none" w:color="FFFFFF" w:sz="0"/>
               <w:right w:val="none" w:color="FFFFFF" w:sz="0"/>
             </w:tcBorders>
             <w:tcMar>
@@ -45867,7 +46262,7 @@
             <w:tcBorders>
               <w:top w:val="none" w:color="FFFFFF" w:sz="0"/>
               <w:left w:val="none" w:color="FFFFFF" w:sz="0"/>
-              <w:bottom w:val="single" w:color="000000" w:sz="4"/>
+              <w:bottom w:val="none" w:color="FFFFFF" w:sz="0"/>
               <w:right w:val="none" w:color="FFFFFF" w:sz="0"/>
             </w:tcBorders>
             <w:tcMar>
@@ -45892,6 +46287,330 @@
                 <w:szCs w:val="18"/>
               </w:rPr>
               <w:t xml:space="preserve">1 quando o sistema for servido por HTTPS</w:t>
+            </w:r>
+          </w:p>
+        </w:tc>
+      </w:tr>
+      <w:tr>
+        <w:trPr>
+          <w:cantSplit/>
+          <w:tblHeader w:val="false"/>
+        </w:trPr>
+        <w:tc>
+          <w:tcPr>
+            <w:tcW w:type="dxa" w:w="2400"/>
+            <w:tcBorders>
+              <w:top w:val="none" w:color="FFFFFF" w:sz="0"/>
+              <w:left w:val="none" w:color="FFFFFF" w:sz="0"/>
+              <w:bottom w:val="none" w:color="FFFFFF" w:sz="0"/>
+              <w:right w:val="none" w:color="FFFFFF" w:sz="0"/>
+            </w:tcBorders>
+            <w:tcMar>
+              <w:top w:type="dxa" w:w="50"/>
+              <w:left w:type="dxa" w:w="80"/>
+              <w:bottom w:type="dxa" w:w="50"/>
+              <w:right w:type="dxa" w:w="80"/>
+            </w:tcMar>
+            <w:vAlign w:val="center"/>
+          </w:tcPr>
+          <w:p>
+            <w:pPr>
+              <w:spacing w:line="240"/>
+              <w:jc w:val="left"/>
+            </w:pPr>
+            <w:r>
+              <w:rPr>
+                <w:rFonts w:ascii="Times New Roman" w:cs="Times New Roman" w:eastAsia="Times New Roman" w:hAnsi="Times New Roman"/>
+                <w:b w:val="false"/>
+                <w:bCs w:val="false"/>
+                <w:sz w:val="18"/>
+                <w:szCs w:val="18"/>
+              </w:rPr>
+              <w:t xml:space="preserve">UAN_YOUTUBE_CHAVE</w:t>
+            </w:r>
+          </w:p>
+        </w:tc>
+        <w:tc>
+          <w:tcPr>
+            <w:tcW w:type="dxa" w:w="1900"/>
+            <w:tcBorders>
+              <w:top w:val="none" w:color="FFFFFF" w:sz="0"/>
+              <w:left w:val="none" w:color="FFFFFF" w:sz="0"/>
+              <w:bottom w:val="none" w:color="FFFFFF" w:sz="0"/>
+              <w:right w:val="none" w:color="FFFFFF" w:sz="0"/>
+            </w:tcBorders>
+            <w:tcMar>
+              <w:top w:type="dxa" w:w="50"/>
+              <w:left w:type="dxa" w:w="80"/>
+              <w:bottom w:type="dxa" w:w="50"/>
+              <w:right w:type="dxa" w:w="80"/>
+            </w:tcMar>
+            <w:vAlign w:val="center"/>
+          </w:tcPr>
+          <w:p>
+            <w:pPr>
+              <w:spacing w:line="240"/>
+              <w:jc w:val="center"/>
+            </w:pPr>
+            <w:r>
+              <w:rPr>
+                <w:rFonts w:ascii="Times New Roman" w:cs="Times New Roman" w:eastAsia="Times New Roman" w:hAnsi="Times New Roman"/>
+                <w:b w:val="false"/>
+                <w:bCs w:val="false"/>
+                <w:sz w:val="18"/>
+                <w:szCs w:val="18"/>
+              </w:rPr>
+              <w:t xml:space="preserve">(vazio)</w:t>
+            </w:r>
+          </w:p>
+        </w:tc>
+        <w:tc>
+          <w:tcPr>
+            <w:tcW w:type="dxa" w:w="3920"/>
+            <w:tcBorders>
+              <w:top w:val="none" w:color="FFFFFF" w:sz="0"/>
+              <w:left w:val="none" w:color="FFFFFF" w:sz="0"/>
+              <w:bottom w:val="none" w:color="FFFFFF" w:sz="0"/>
+              <w:right w:val="none" w:color="FFFFFF" w:sz="0"/>
+            </w:tcBorders>
+            <w:tcMar>
+              <w:top w:type="dxa" w:w="50"/>
+              <w:left w:type="dxa" w:w="80"/>
+              <w:bottom w:type="dxa" w:w="50"/>
+              <w:right w:type="dxa" w:w="80"/>
+            </w:tcMar>
+            <w:vAlign w:val="center"/>
+          </w:tcPr>
+          <w:p>
+            <w:pPr>
+              <w:spacing w:line="240"/>
+              <w:jc w:val="left"/>
+            </w:pPr>
+            <w:r>
+              <w:rPr>
+                <w:rFonts w:ascii="Times New Roman" w:cs="Times New Roman" w:eastAsia="Times New Roman" w:hAnsi="Times New Roman"/>
+                <w:b w:val="false"/>
+                <w:bCs w:val="false"/>
+                <w:sz w:val="18"/>
+                <w:szCs w:val="18"/>
+              </w:rPr>
+              <w:t xml:space="preserve">Chave da YouTube Data API v3; vazio limita a recolha às fontes web</w:t>
+            </w:r>
+          </w:p>
+        </w:tc>
+      </w:tr>
+      <w:tr>
+        <w:trPr>
+          <w:cantSplit/>
+          <w:tblHeader w:val="false"/>
+        </w:trPr>
+        <w:tc>
+          <w:tcPr>
+            <w:tcW w:type="dxa" w:w="2400"/>
+            <w:tcBorders>
+              <w:top w:val="none" w:color="FFFFFF" w:sz="0"/>
+              <w:left w:val="none" w:color="FFFFFF" w:sz="0"/>
+              <w:bottom w:val="none" w:color="FFFFFF" w:sz="0"/>
+              <w:right w:val="none" w:color="FFFFFF" w:sz="0"/>
+            </w:tcBorders>
+            <w:tcMar>
+              <w:top w:type="dxa" w:w="50"/>
+              <w:left w:type="dxa" w:w="80"/>
+              <w:bottom w:type="dxa" w:w="50"/>
+              <w:right w:type="dxa" w:w="80"/>
+            </w:tcMar>
+            <w:vAlign w:val="center"/>
+          </w:tcPr>
+          <w:p>
+            <w:pPr>
+              <w:spacing w:line="240"/>
+              <w:jc w:val="left"/>
+            </w:pPr>
+            <w:r>
+              <w:rPr>
+                <w:rFonts w:ascii="Times New Roman" w:cs="Times New Roman" w:eastAsia="Times New Roman" w:hAnsi="Times New Roman"/>
+                <w:b w:val="false"/>
+                <w:bCs w:val="false"/>
+                <w:sz w:val="18"/>
+                <w:szCs w:val="18"/>
+              </w:rPr>
+              <w:t xml:space="preserve">UAN_RECOLHA_INTERVALO</w:t>
+            </w:r>
+          </w:p>
+        </w:tc>
+        <w:tc>
+          <w:tcPr>
+            <w:tcW w:type="dxa" w:w="1900"/>
+            <w:tcBorders>
+              <w:top w:val="none" w:color="FFFFFF" w:sz="0"/>
+              <w:left w:val="none" w:color="FFFFFF" w:sz="0"/>
+              <w:bottom w:val="none" w:color="FFFFFF" w:sz="0"/>
+              <w:right w:val="none" w:color="FFFFFF" w:sz="0"/>
+            </w:tcBorders>
+            <w:tcMar>
+              <w:top w:type="dxa" w:w="50"/>
+              <w:left w:type="dxa" w:w="80"/>
+              <w:bottom w:type="dxa" w:w="50"/>
+              <w:right w:type="dxa" w:w="80"/>
+            </w:tcMar>
+            <w:vAlign w:val="center"/>
+          </w:tcPr>
+          <w:p>
+            <w:pPr>
+              <w:spacing w:line="240"/>
+              <w:jc w:val="center"/>
+            </w:pPr>
+            <w:r>
+              <w:rPr>
+                <w:rFonts w:ascii="Times New Roman" w:cs="Times New Roman" w:eastAsia="Times New Roman" w:hAnsi="Times New Roman"/>
+                <w:b w:val="false"/>
+                <w:bCs w:val="false"/>
+                <w:sz w:val="18"/>
+                <w:szCs w:val="18"/>
+              </w:rPr>
+              <w:t xml:space="preserve">3</w:t>
+            </w:r>
+          </w:p>
+        </w:tc>
+        <w:tc>
+          <w:tcPr>
+            <w:tcW w:type="dxa" w:w="3920"/>
+            <w:tcBorders>
+              <w:top w:val="none" w:color="FFFFFF" w:sz="0"/>
+              <w:left w:val="none" w:color="FFFFFF" w:sz="0"/>
+              <w:bottom w:val="none" w:color="FFFFFF" w:sz="0"/>
+              <w:right w:val="none" w:color="FFFFFF" w:sz="0"/>
+            </w:tcBorders>
+            <w:tcMar>
+              <w:top w:type="dxa" w:w="50"/>
+              <w:left w:type="dxa" w:w="80"/>
+              <w:bottom w:type="dxa" w:w="50"/>
+              <w:right w:type="dxa" w:w="80"/>
+            </w:tcMar>
+            <w:vAlign w:val="center"/>
+          </w:tcPr>
+          <w:p>
+            <w:pPr>
+              <w:spacing w:line="240"/>
+              <w:jc w:val="left"/>
+            </w:pPr>
+            <w:r>
+              <w:rPr>
+                <w:rFonts w:ascii="Times New Roman" w:cs="Times New Roman" w:eastAsia="Times New Roman" w:hAnsi="Times New Roman"/>
+                <w:b w:val="false"/>
+                <w:bCs w:val="false"/>
+                <w:sz w:val="18"/>
+                <w:szCs w:val="18"/>
+              </w:rPr>
+              <w:t xml:space="preserve">Segundos entre pedidos ao mesmo sítio</w:t>
+            </w:r>
+          </w:p>
+        </w:tc>
+      </w:tr>
+      <w:tr>
+        <w:trPr>
+          <w:cantSplit/>
+          <w:tblHeader w:val="false"/>
+        </w:trPr>
+        <w:tc>
+          <w:tcPr>
+            <w:tcW w:type="dxa" w:w="2400"/>
+            <w:tcBorders>
+              <w:top w:val="none" w:color="FFFFFF" w:sz="0"/>
+              <w:left w:val="none" w:color="FFFFFF" w:sz="0"/>
+              <w:bottom w:val="single" w:color="000000" w:sz="4"/>
+              <w:right w:val="none" w:color="FFFFFF" w:sz="0"/>
+            </w:tcBorders>
+            <w:tcMar>
+              <w:top w:type="dxa" w:w="50"/>
+              <w:left w:type="dxa" w:w="80"/>
+              <w:bottom w:type="dxa" w:w="50"/>
+              <w:right w:type="dxa" w:w="80"/>
+            </w:tcMar>
+            <w:vAlign w:val="center"/>
+          </w:tcPr>
+          <w:p>
+            <w:pPr>
+              <w:spacing w:line="240"/>
+              <w:jc w:val="left"/>
+            </w:pPr>
+            <w:r>
+              <w:rPr>
+                <w:rFonts w:ascii="Times New Roman" w:cs="Times New Roman" w:eastAsia="Times New Roman" w:hAnsi="Times New Roman"/>
+                <w:b w:val="false"/>
+                <w:bCs w:val="false"/>
+                <w:sz w:val="18"/>
+                <w:szCs w:val="18"/>
+              </w:rPr>
+              <w:t xml:space="preserve">UAN_RECOLHA_MAX_PAGINAS</w:t>
+            </w:r>
+          </w:p>
+        </w:tc>
+        <w:tc>
+          <w:tcPr>
+            <w:tcW w:type="dxa" w:w="1900"/>
+            <w:tcBorders>
+              <w:top w:val="none" w:color="FFFFFF" w:sz="0"/>
+              <w:left w:val="none" w:color="FFFFFF" w:sz="0"/>
+              <w:bottom w:val="single" w:color="000000" w:sz="4"/>
+              <w:right w:val="none" w:color="FFFFFF" w:sz="0"/>
+            </w:tcBorders>
+            <w:tcMar>
+              <w:top w:type="dxa" w:w="50"/>
+              <w:left w:type="dxa" w:w="80"/>
+              <w:bottom w:type="dxa" w:w="50"/>
+              <w:right w:type="dxa" w:w="80"/>
+            </w:tcMar>
+            <w:vAlign w:val="center"/>
+          </w:tcPr>
+          <w:p>
+            <w:pPr>
+              <w:spacing w:line="240"/>
+              <w:jc w:val="center"/>
+            </w:pPr>
+            <w:r>
+              <w:rPr>
+                <w:rFonts w:ascii="Times New Roman" w:cs="Times New Roman" w:eastAsia="Times New Roman" w:hAnsi="Times New Roman"/>
+                <w:b w:val="false"/>
+                <w:bCs w:val="false"/>
+                <w:sz w:val="18"/>
+                <w:szCs w:val="18"/>
+              </w:rPr>
+              <w:t xml:space="preserve">40</w:t>
+            </w:r>
+          </w:p>
+        </w:tc>
+        <w:tc>
+          <w:tcPr>
+            <w:tcW w:type="dxa" w:w="3920"/>
+            <w:tcBorders>
+              <w:top w:val="none" w:color="FFFFFF" w:sz="0"/>
+              <w:left w:val="none" w:color="FFFFFF" w:sz="0"/>
+              <w:bottom w:val="single" w:color="000000" w:sz="4"/>
+              <w:right w:val="none" w:color="FFFFFF" w:sz="0"/>
+            </w:tcBorders>
+            <w:tcMar>
+              <w:top w:type="dxa" w:w="50"/>
+              <w:left w:type="dxa" w:w="80"/>
+              <w:bottom w:type="dxa" w:w="50"/>
+              <w:right w:type="dxa" w:w="80"/>
+            </w:tcMar>
+            <w:vAlign w:val="center"/>
+          </w:tcPr>
+          <w:p>
+            <w:pPr>
+              <w:spacing w:line="240"/>
+              <w:jc w:val="left"/>
+            </w:pPr>
+            <w:r>
+              <w:rPr>
+                <w:rFonts w:ascii="Times New Roman" w:cs="Times New Roman" w:eastAsia="Times New Roman" w:hAnsi="Times New Roman"/>
+                <w:b w:val="false"/>
+                <w:bCs w:val="false"/>
+                <w:sz w:val="18"/>
+                <w:szCs w:val="18"/>
+              </w:rPr>
+              <w:t xml:space="preserve">Máximo de páginas visitadas por fonte em cada recolha</w:t>
             </w:r>
           </w:p>
         </w:tc>
@@ -46457,7 +47176,7 @@
                 <w:sz w:val="18"/>
                 <w:szCs w:val="18"/>
               </w:rPr>
-              <w:t xml:space="preserve">Lotes</w:t>
+              <w:t xml:space="preserve">Fontes e recolha</w:t>
             </w:r>
           </w:p>
         </w:tc>
@@ -46491,7 +47210,7 @@
                 <w:sz w:val="18"/>
                 <w:szCs w:val="18"/>
               </w:rPr>
-              <w:t xml:space="preserve">Todos (importar: supervisor)</w:t>
+              <w:t xml:space="preserve">Supervisor</w:t>
             </w:r>
           </w:p>
         </w:tc>
@@ -46525,7 +47244,7 @@
                 <w:sz w:val="18"/>
                 <w:szCs w:val="18"/>
               </w:rPr>
-              <w:t xml:space="preserve">Importação, proveniência e classificação de pendentes</w:t>
+              <w:t xml:space="preserve">Registo de fontes públicas (YouTube, RSS, páginas e sítios) e recolha</w:t>
             </w:r>
           </w:p>
         </w:tc>
@@ -46565,7 +47284,7 @@
                 <w:sz w:val="18"/>
                 <w:szCs w:val="18"/>
               </w:rPr>
-              <w:t xml:space="preserve">Métricas</w:t>
+              <w:t xml:space="preserve">Lotes</w:t>
             </w:r>
           </w:p>
         </w:tc>
@@ -46599,7 +47318,7 @@
                 <w:sz w:val="18"/>
                 <w:szCs w:val="18"/>
               </w:rPr>
-              <w:t xml:space="preserve">Supervisor</w:t>
+              <w:t xml:space="preserve">Todos (importar: supervisor)</w:t>
             </w:r>
           </w:p>
         </w:tc>
@@ -46633,7 +47352,7 @@
                 <w:sz w:val="18"/>
                 <w:szCs w:val="18"/>
               </w:rPr>
-              <w:t xml:space="preserve">Precisão@K, κ analista–sistema e entre analistas, sensibilidade, latência; exportações</w:t>
+              <w:t xml:space="preserve">Importação, proveniência e classificação de pendentes</w:t>
             </w:r>
           </w:p>
         </w:tc>
@@ -46673,7 +47392,7 @@
                 <w:sz w:val="18"/>
                 <w:szCs w:val="18"/>
               </w:rPr>
-              <w:t xml:space="preserve">Utilizadores</w:t>
+              <w:t xml:space="preserve">Métricas</w:t>
             </w:r>
           </w:p>
         </w:tc>
@@ -46741,7 +47460,7 @@
                 <w:sz w:val="18"/>
                 <w:szCs w:val="18"/>
               </w:rPr>
-              <w:t xml:space="preserve">Criação, desactivação e redefinição de palavra-passe</w:t>
+              <w:t xml:space="preserve">Precisão@K, κ analista–sistema e entre analistas, sensibilidade, latência; exportações</w:t>
             </w:r>
           </w:p>
         </w:tc>
@@ -46781,7 +47500,7 @@
                 <w:sz w:val="18"/>
                 <w:szCs w:val="18"/>
               </w:rPr>
-              <w:t xml:space="preserve">Auditoria</w:t>
+              <w:t xml:space="preserve">Utilizadores</w:t>
             </w:r>
           </w:p>
         </w:tc>
@@ -46849,7 +47568,7 @@
                 <w:sz w:val="18"/>
                 <w:szCs w:val="18"/>
               </w:rPr>
-              <w:t xml:space="preserve">Registo de todas as acções relevantes</w:t>
+              <w:t xml:space="preserve">Criação, desactivação e redefinição de palavra-passe</w:t>
             </w:r>
           </w:p>
         </w:tc>
@@ -46865,6 +47584,114 @@
             <w:tcBorders>
               <w:top w:val="none" w:color="FFFFFF" w:sz="0"/>
               <w:left w:val="none" w:color="FFFFFF" w:sz="0"/>
+              <w:bottom w:val="none" w:color="FFFFFF" w:sz="0"/>
+              <w:right w:val="none" w:color="FFFFFF" w:sz="0"/>
+            </w:tcBorders>
+            <w:tcMar>
+              <w:top w:type="dxa" w:w="50"/>
+              <w:left w:type="dxa" w:w="80"/>
+              <w:bottom w:type="dxa" w:w="50"/>
+              <w:right w:type="dxa" w:w="80"/>
+            </w:tcMar>
+            <w:vAlign w:val="center"/>
+          </w:tcPr>
+          <w:p>
+            <w:pPr>
+              <w:spacing w:line="240"/>
+              <w:jc w:val="left"/>
+            </w:pPr>
+            <w:r>
+              <w:rPr>
+                <w:rFonts w:ascii="Times New Roman" w:cs="Times New Roman" w:eastAsia="Times New Roman" w:hAnsi="Times New Roman"/>
+                <w:b w:val="false"/>
+                <w:bCs w:val="false"/>
+                <w:sz w:val="18"/>
+                <w:szCs w:val="18"/>
+              </w:rPr>
+              <w:t xml:space="preserve">Auditoria</w:t>
+            </w:r>
+          </w:p>
+        </w:tc>
+        <w:tc>
+          <w:tcPr>
+            <w:tcW w:type="dxa" w:w="2100"/>
+            <w:tcBorders>
+              <w:top w:val="none" w:color="FFFFFF" w:sz="0"/>
+              <w:left w:val="none" w:color="FFFFFF" w:sz="0"/>
+              <w:bottom w:val="none" w:color="FFFFFF" w:sz="0"/>
+              <w:right w:val="none" w:color="FFFFFF" w:sz="0"/>
+            </w:tcBorders>
+            <w:tcMar>
+              <w:top w:type="dxa" w:w="50"/>
+              <w:left w:type="dxa" w:w="80"/>
+              <w:bottom w:type="dxa" w:w="50"/>
+              <w:right w:type="dxa" w:w="80"/>
+            </w:tcMar>
+            <w:vAlign w:val="center"/>
+          </w:tcPr>
+          <w:p>
+            <w:pPr>
+              <w:spacing w:line="240"/>
+              <w:jc w:val="left"/>
+            </w:pPr>
+            <w:r>
+              <w:rPr>
+                <w:rFonts w:ascii="Times New Roman" w:cs="Times New Roman" w:eastAsia="Times New Roman" w:hAnsi="Times New Roman"/>
+                <w:b w:val="false"/>
+                <w:bCs w:val="false"/>
+                <w:sz w:val="18"/>
+                <w:szCs w:val="18"/>
+              </w:rPr>
+              <w:t xml:space="preserve">Supervisor</w:t>
+            </w:r>
+          </w:p>
+        </w:tc>
+        <w:tc>
+          <w:tcPr>
+            <w:tcW w:type="dxa" w:w="4120"/>
+            <w:tcBorders>
+              <w:top w:val="none" w:color="FFFFFF" w:sz="0"/>
+              <w:left w:val="none" w:color="FFFFFF" w:sz="0"/>
+              <w:bottom w:val="none" w:color="FFFFFF" w:sz="0"/>
+              <w:right w:val="none" w:color="FFFFFF" w:sz="0"/>
+            </w:tcBorders>
+            <w:tcMar>
+              <w:top w:type="dxa" w:w="50"/>
+              <w:left w:type="dxa" w:w="80"/>
+              <w:bottom w:type="dxa" w:w="50"/>
+              <w:right w:type="dxa" w:w="80"/>
+            </w:tcMar>
+            <w:vAlign w:val="center"/>
+          </w:tcPr>
+          <w:p>
+            <w:pPr>
+              <w:spacing w:line="240"/>
+              <w:jc w:val="left"/>
+            </w:pPr>
+            <w:r>
+              <w:rPr>
+                <w:rFonts w:ascii="Times New Roman" w:cs="Times New Roman" w:eastAsia="Times New Roman" w:hAnsi="Times New Roman"/>
+                <w:b w:val="false"/>
+                <w:bCs w:val="false"/>
+                <w:sz w:val="18"/>
+                <w:szCs w:val="18"/>
+              </w:rPr>
+              <w:t xml:space="preserve">Registo de todas as acções relevantes</w:t>
+            </w:r>
+          </w:p>
+        </w:tc>
+      </w:tr>
+      <w:tr>
+        <w:trPr>
+          <w:cantSplit/>
+          <w:tblHeader w:val="false"/>
+        </w:trPr>
+        <w:tc>
+          <w:tcPr>
+            <w:tcW w:type="dxa" w:w="2000"/>
+            <w:tcBorders>
+              <w:top w:val="none" w:color="FFFFFF" w:sz="0"/>
+              <w:left w:val="none" w:color="FFFFFF" w:sz="0"/>
               <w:bottom w:val="single" w:color="000000" w:sz="4"/>
               <w:right w:val="none" w:color="FFFFFF" w:sz="0"/>
             </w:tcBorders>
@@ -46984,7 +47811,40 @@
           <w:sz w:val="26"/>
           <w:szCs w:val="26"/>
         </w:rPr>
-        <w:t xml:space="preserve">F.4 Linha de comandos</w:t>
+        <w:t xml:space="preserve">F.4 Recolha de novos dados</w:t>
+      </w:r>
+    </w:p>
+    <w:p>
+      <w:pPr>
+        <w:spacing w:after="120" w:before="0" w:line="360"/>
+        <w:ind w:firstLine="567"/>
+        <w:jc w:val="both"/>
+      </w:pPr>
+      <w:r>
+        <w:rPr>
+          <w:rFonts w:ascii="Times New Roman" w:cs="Times New Roman" w:eastAsia="Times New Roman" w:hAnsi="Times New Roman"/>
+          <w:sz w:val="24"/>
+          <w:szCs w:val="24"/>
+        </w:rPr>
+        <w:t xml:space="preserve">Na página Fontes e recolha, o supervisor regista cada fonte pelo tipo e pelo endereço: a ligação de um vídeo ou de um canal do YouTube (por exemplo, https://www.youtube.com/@canal), o endereço de um feed RSS, a ligação de um artigo ou a página inicial de um sítio de notícias. O botão Recolher percorre as fontes activas, cria um lote por fonte e envia-o para classificação. A recolha do YouTube exige a chave UAN_YOUTUBE_CHAVE, obtida na Google Cloud Console. Para recolha periódica, agenda-se o comando python uan.py recolher no Agendador de Tarefas do Windows. Só se recolhe conteúdo público: o sistema respeita o robots.txt, ignora páginas que pedem palavra-passe e não contorna protecções; o conteúdo de redes que exigem conta entra por importação de ficheiros.</w:t>
+      </w:r>
+    </w:p>
+    <w:p>
+      <w:pPr>
+        <w:pStyle w:val="Heading2"/>
+        <w:keepNext/>
+        <w:keepLines/>
+        <w:spacing w:after="160" w:before="360" w:line="300"/>
+      </w:pPr>
+      <w:r>
+        <w:rPr>
+          <w:rFonts w:ascii="Times New Roman" w:cs="Times New Roman" w:eastAsia="Times New Roman" w:hAnsi="Times New Roman"/>
+          <w:b/>
+          <w:bCs/>
+          <w:sz w:val="26"/>
+          <w:szCs w:val="26"/>
+        </w:rPr>
+        <w:t xml:space="preserve">F.5 Linha de comandos</w:t>
       </w:r>
     </w:p>
     <w:p>
@@ -47355,7 +48215,7 @@
                 <w:sz w:val="17"/>
                 <w:szCs w:val="17"/>
               </w:rPr>
-              <w:t xml:space="preserve">python uan.py classificar</w:t>
+              <w:t xml:space="preserve">python uan.py fonte-adicionar --tipo sitio --endereco https://exemplo.ao --nome "Jornal"</w:t>
             </w:r>
           </w:p>
         </w:tc>
@@ -47389,7 +48249,7 @@
                 <w:sz w:val="17"/>
                 <w:szCs w:val="17"/>
               </w:rPr>
-              <w:t xml:space="preserve">Classifica as publicações pendentes</w:t>
+              <w:t xml:space="preserve">Regista uma fonte pública (tipos: youtube_video, youtube_canal, rss, pagina, sitio)</w:t>
             </w:r>
           </w:p>
         </w:tc>
@@ -47429,7 +48289,7 @@
                 <w:sz w:val="17"/>
                 <w:szCs w:val="17"/>
               </w:rPr>
-              <w:t xml:space="preserve">python uan.py metricas</w:t>
+              <w:t xml:space="preserve">python uan.py fontes</w:t>
             </w:r>
           </w:p>
         </w:tc>
@@ -47463,7 +48323,7 @@
                 <w:sz w:val="17"/>
                 <w:szCs w:val="17"/>
               </w:rPr>
-              <w:t xml:space="preserve">Calcula as métricas operacionais</w:t>
+              <w:t xml:space="preserve">Lista as fontes e o estado da última recolha</w:t>
             </w:r>
           </w:p>
         </w:tc>
@@ -47503,7 +48363,7 @@
                 <w:sz w:val="17"/>
                 <w:szCs w:val="17"/>
               </w:rPr>
-              <w:t xml:space="preserve">python uan.py exportar revisoes.csv</w:t>
+              <w:t xml:space="preserve">python uan.py recolher</w:t>
             </w:r>
           </w:p>
         </w:tc>
@@ -47537,7 +48397,7 @@
                 <w:sz w:val="17"/>
                 <w:szCs w:val="17"/>
               </w:rPr>
-              <w:t xml:space="preserve">Exporta as revisões para novo treino</w:t>
+              <w:t xml:space="preserve">Recolhe as fontes activas, cria um lote por fonte e classifica</w:t>
             </w:r>
           </w:p>
         </w:tc>
@@ -47577,7 +48437,7 @@
                 <w:sz w:val="17"/>
                 <w:szCs w:val="17"/>
               </w:rPr>
-              <w:t xml:space="preserve">python uan.py limpar --dias 180</w:t>
+              <w:t xml:space="preserve">python uan.py classificar</w:t>
             </w:r>
           </w:p>
         </w:tc>
@@ -47611,7 +48471,7 @@
                 <w:sz w:val="17"/>
                 <w:szCs w:val="17"/>
               </w:rPr>
-              <w:t xml:space="preserve">Aplica o prazo de conservação</w:t>
+              <w:t xml:space="preserve">Classifica as publicações pendentes</w:t>
             </w:r>
           </w:p>
         </w:tc>
@@ -47651,7 +48511,7 @@
                 <w:sz w:val="17"/>
                 <w:szCs w:val="17"/>
               </w:rPr>
-              <w:t xml:space="preserve">python uan.py copia</w:t>
+              <w:t xml:space="preserve">python uan.py metricas</w:t>
             </w:r>
           </w:p>
         </w:tc>
@@ -47685,7 +48545,7 @@
                 <w:sz w:val="17"/>
                 <w:szCs w:val="17"/>
               </w:rPr>
-              <w:t xml:space="preserve">Cria uma cópia de segurança da base de dados</w:t>
+              <w:t xml:space="preserve">Calcula as métricas operacionais</w:t>
             </w:r>
           </w:p>
         </w:tc>
@@ -47701,6 +48561,228 @@
             <w:tcBorders>
               <w:top w:val="none" w:color="FFFFFF" w:sz="0"/>
               <w:left w:val="none" w:color="FFFFFF" w:sz="0"/>
+              <w:bottom w:val="none" w:color="FFFFFF" w:sz="0"/>
+              <w:right w:val="none" w:color="FFFFFF" w:sz="0"/>
+            </w:tcBorders>
+            <w:tcMar>
+              <w:top w:type="dxa" w:w="50"/>
+              <w:left w:type="dxa" w:w="80"/>
+              <w:bottom w:type="dxa" w:w="50"/>
+              <w:right w:type="dxa" w:w="80"/>
+            </w:tcMar>
+            <w:vAlign w:val="center"/>
+          </w:tcPr>
+          <w:p>
+            <w:pPr>
+              <w:spacing w:line="240"/>
+              <w:jc w:val="left"/>
+            </w:pPr>
+            <w:r>
+              <w:rPr>
+                <w:rFonts w:ascii="Times New Roman" w:cs="Times New Roman" w:eastAsia="Times New Roman" w:hAnsi="Times New Roman"/>
+                <w:b w:val="false"/>
+                <w:bCs w:val="false"/>
+                <w:sz w:val="17"/>
+                <w:szCs w:val="17"/>
+              </w:rPr>
+              <w:t xml:space="preserve">python uan.py exportar revisoes.csv</w:t>
+            </w:r>
+          </w:p>
+        </w:tc>
+        <w:tc>
+          <w:tcPr>
+            <w:tcW w:type="dxa" w:w="3620"/>
+            <w:tcBorders>
+              <w:top w:val="none" w:color="FFFFFF" w:sz="0"/>
+              <w:left w:val="none" w:color="FFFFFF" w:sz="0"/>
+              <w:bottom w:val="none" w:color="FFFFFF" w:sz="0"/>
+              <w:right w:val="none" w:color="FFFFFF" w:sz="0"/>
+            </w:tcBorders>
+            <w:tcMar>
+              <w:top w:type="dxa" w:w="50"/>
+              <w:left w:type="dxa" w:w="80"/>
+              <w:bottom w:type="dxa" w:w="50"/>
+              <w:right w:type="dxa" w:w="80"/>
+            </w:tcMar>
+            <w:vAlign w:val="center"/>
+          </w:tcPr>
+          <w:p>
+            <w:pPr>
+              <w:spacing w:line="240"/>
+              <w:jc w:val="left"/>
+            </w:pPr>
+            <w:r>
+              <w:rPr>
+                <w:rFonts w:ascii="Times New Roman" w:cs="Times New Roman" w:eastAsia="Times New Roman" w:hAnsi="Times New Roman"/>
+                <w:b w:val="false"/>
+                <w:bCs w:val="false"/>
+                <w:sz w:val="17"/>
+                <w:szCs w:val="17"/>
+              </w:rPr>
+              <w:t xml:space="preserve">Exporta as revisões para novo treino</w:t>
+            </w:r>
+          </w:p>
+        </w:tc>
+      </w:tr>
+      <w:tr>
+        <w:trPr>
+          <w:cantSplit/>
+          <w:tblHeader w:val="false"/>
+        </w:trPr>
+        <w:tc>
+          <w:tcPr>
+            <w:tcW w:type="dxa" w:w="4600"/>
+            <w:tcBorders>
+              <w:top w:val="none" w:color="FFFFFF" w:sz="0"/>
+              <w:left w:val="none" w:color="FFFFFF" w:sz="0"/>
+              <w:bottom w:val="none" w:color="FFFFFF" w:sz="0"/>
+              <w:right w:val="none" w:color="FFFFFF" w:sz="0"/>
+            </w:tcBorders>
+            <w:tcMar>
+              <w:top w:type="dxa" w:w="50"/>
+              <w:left w:type="dxa" w:w="80"/>
+              <w:bottom w:type="dxa" w:w="50"/>
+              <w:right w:type="dxa" w:w="80"/>
+            </w:tcMar>
+            <w:vAlign w:val="center"/>
+          </w:tcPr>
+          <w:p>
+            <w:pPr>
+              <w:spacing w:line="240"/>
+              <w:jc w:val="left"/>
+            </w:pPr>
+            <w:r>
+              <w:rPr>
+                <w:rFonts w:ascii="Times New Roman" w:cs="Times New Roman" w:eastAsia="Times New Roman" w:hAnsi="Times New Roman"/>
+                <w:b w:val="false"/>
+                <w:bCs w:val="false"/>
+                <w:sz w:val="17"/>
+                <w:szCs w:val="17"/>
+              </w:rPr>
+              <w:t xml:space="preserve">python uan.py limpar --dias 180</w:t>
+            </w:r>
+          </w:p>
+        </w:tc>
+        <w:tc>
+          <w:tcPr>
+            <w:tcW w:type="dxa" w:w="3620"/>
+            <w:tcBorders>
+              <w:top w:val="none" w:color="FFFFFF" w:sz="0"/>
+              <w:left w:val="none" w:color="FFFFFF" w:sz="0"/>
+              <w:bottom w:val="none" w:color="FFFFFF" w:sz="0"/>
+              <w:right w:val="none" w:color="FFFFFF" w:sz="0"/>
+            </w:tcBorders>
+            <w:tcMar>
+              <w:top w:type="dxa" w:w="50"/>
+              <w:left w:type="dxa" w:w="80"/>
+              <w:bottom w:type="dxa" w:w="50"/>
+              <w:right w:type="dxa" w:w="80"/>
+            </w:tcMar>
+            <w:vAlign w:val="center"/>
+          </w:tcPr>
+          <w:p>
+            <w:pPr>
+              <w:spacing w:line="240"/>
+              <w:jc w:val="left"/>
+            </w:pPr>
+            <w:r>
+              <w:rPr>
+                <w:rFonts w:ascii="Times New Roman" w:cs="Times New Roman" w:eastAsia="Times New Roman" w:hAnsi="Times New Roman"/>
+                <w:b w:val="false"/>
+                <w:bCs w:val="false"/>
+                <w:sz w:val="17"/>
+                <w:szCs w:val="17"/>
+              </w:rPr>
+              <w:t xml:space="preserve">Aplica o prazo de conservação</w:t>
+            </w:r>
+          </w:p>
+        </w:tc>
+      </w:tr>
+      <w:tr>
+        <w:trPr>
+          <w:cantSplit/>
+          <w:tblHeader w:val="false"/>
+        </w:trPr>
+        <w:tc>
+          <w:tcPr>
+            <w:tcW w:type="dxa" w:w="4600"/>
+            <w:tcBorders>
+              <w:top w:val="none" w:color="FFFFFF" w:sz="0"/>
+              <w:left w:val="none" w:color="FFFFFF" w:sz="0"/>
+              <w:bottom w:val="none" w:color="FFFFFF" w:sz="0"/>
+              <w:right w:val="none" w:color="FFFFFF" w:sz="0"/>
+            </w:tcBorders>
+            <w:tcMar>
+              <w:top w:type="dxa" w:w="50"/>
+              <w:left w:type="dxa" w:w="80"/>
+              <w:bottom w:type="dxa" w:w="50"/>
+              <w:right w:type="dxa" w:w="80"/>
+            </w:tcMar>
+            <w:vAlign w:val="center"/>
+          </w:tcPr>
+          <w:p>
+            <w:pPr>
+              <w:spacing w:line="240"/>
+              <w:jc w:val="left"/>
+            </w:pPr>
+            <w:r>
+              <w:rPr>
+                <w:rFonts w:ascii="Times New Roman" w:cs="Times New Roman" w:eastAsia="Times New Roman" w:hAnsi="Times New Roman"/>
+                <w:b w:val="false"/>
+                <w:bCs w:val="false"/>
+                <w:sz w:val="17"/>
+                <w:szCs w:val="17"/>
+              </w:rPr>
+              <w:t xml:space="preserve">python uan.py copia</w:t>
+            </w:r>
+          </w:p>
+        </w:tc>
+        <w:tc>
+          <w:tcPr>
+            <w:tcW w:type="dxa" w:w="3620"/>
+            <w:tcBorders>
+              <w:top w:val="none" w:color="FFFFFF" w:sz="0"/>
+              <w:left w:val="none" w:color="FFFFFF" w:sz="0"/>
+              <w:bottom w:val="none" w:color="FFFFFF" w:sz="0"/>
+              <w:right w:val="none" w:color="FFFFFF" w:sz="0"/>
+            </w:tcBorders>
+            <w:tcMar>
+              <w:top w:type="dxa" w:w="50"/>
+              <w:left w:type="dxa" w:w="80"/>
+              <w:bottom w:type="dxa" w:w="50"/>
+              <w:right w:type="dxa" w:w="80"/>
+            </w:tcMar>
+            <w:vAlign w:val="center"/>
+          </w:tcPr>
+          <w:p>
+            <w:pPr>
+              <w:spacing w:line="240"/>
+              <w:jc w:val="left"/>
+            </w:pPr>
+            <w:r>
+              <w:rPr>
+                <w:rFonts w:ascii="Times New Roman" w:cs="Times New Roman" w:eastAsia="Times New Roman" w:hAnsi="Times New Roman"/>
+                <w:b w:val="false"/>
+                <w:bCs w:val="false"/>
+                <w:sz w:val="17"/>
+                <w:szCs w:val="17"/>
+              </w:rPr>
+              <w:t xml:space="preserve">Cria uma cópia de segurança da base de dados</w:t>
+            </w:r>
+          </w:p>
+        </w:tc>
+      </w:tr>
+      <w:tr>
+        <w:trPr>
+          <w:cantSplit/>
+          <w:tblHeader w:val="false"/>
+        </w:trPr>
+        <w:tc>
+          <w:tcPr>
+            <w:tcW w:type="dxa" w:w="4600"/>
+            <w:tcBorders>
+              <w:top w:val="none" w:color="FFFFFF" w:sz="0"/>
+              <w:left w:val="none" w:color="FFFFFF" w:sz="0"/>
               <w:bottom w:val="single" w:color="000000" w:sz="4"/>
               <w:right w:val="none" w:color="FFFFFF" w:sz="0"/>
             </w:tcBorders>
@@ -47786,7 +48868,7 @@
           <w:sz w:val="26"/>
           <w:szCs w:val="26"/>
         </w:rPr>
-        <w:t xml:space="preserve">F.5 Guardar o modelo depois do treino</w:t>
+        <w:t xml:space="preserve">F.6 Guardar o modelo depois do treino</w:t>
       </w:r>
     </w:p>
     <w:p>

</xml_diff>

<commit_message>
Dissertação: alertas, mapa por província e relatório (requisitos, 3.8, Figuras 3.3-3.6 e 3.8, limitações, Apêndice F)
Co-Authored-By: Claude Opus 5.5 <noreply@anthropic.com>
Claude-Session: https://claude.ai/code/session_01RTNCrmFuFcvA7Trjn3iBm1
</commit_message>
<xml_diff>
--- a/docs/Dissertacao_UAN.docx
+++ b/docs/Dissertacao_UAN.docx
@@ -1596,7 +1596,7 @@
           <w:sz w:val="24"/>
           <w:szCs w:val="24"/>
         </w:rPr>
-        <w:t xml:space="preserve">), enquanto o Bi-LSTM não se distinguiu da Floresta Aleatória. Nas publicações angolanas, porém, o F1-macro do BERTimbau caiu para 0,533, contra 0,919 no corpus público, uma diferença de 38,6 pontos percentuais. A queda foi maior na Desinformação, sinal de que o modelo aprendeu sobretudo o estilo das notícias do Fake.br. Com base nestes resultados, desenvolveu-se uma aplicação web com contas individuais, anonimização à entrada conforme a Lei n.º 22/11, registo de proveniência, auditoria e uma fila de revisão ordenada por prioridade, sem decisões automáticas. Num computador sem GPU, o sistema processou cada publicação em cerca de 0,63 segundos e, gravando as classificações por sublotes, pôs as primeiras publicações na fila em 36 segundos, o que confirma com condições a hipótese sobre o tempo de processamento. A antecedência de detecção não foi testada. Os principais contributos são o corpus angolano anotado, a medida da lacuna de domínio e uma arquitectura reprodutível e de baixo custo para triagem com revisão humana.</w:t>
+        <w:t xml:space="preserve">), enquanto o Bi-LSTM não se distinguiu da Floresta Aleatória. Nas publicações angolanas, porém, o F1-macro do BERTimbau caiu para 0,533, contra 0,919 no corpus público, uma diferença de 38,6 pontos percentuais. A queda foi maior na Desinformação, sinal de que o modelo aprendeu sobretudo o estilo das notícias do Fake.br. Com base nestes resultados, desenvolveu-se uma aplicação web com contas individuais, anonimização à entrada conforme a Lei n.º 22/11, registo de proveniência, auditoria e uma fila de revisão ordenada por prioridade, sem decisões automáticas. As ameaças confirmadas pelos analistas geram alertas na aplicação e por e-mail, e um mapa por província mostra a sua concentração e evolução. Num computador sem GPU, o sistema processou cada publicação em cerca de 0,63 segundos e, gravando as classificações por sublotes, pôs as primeiras publicações na fila em 36 segundos, o que confirma com condições a hipótese sobre o tempo de processamento. A antecedência de detecção não foi testada. Os principais contributos são o corpus angolano anotado, a medida da lacuna de domínio e uma arquitectura reprodutível e de baixo custo para triagem com revisão humana.</w:t>
       </w:r>
     </w:p>
     <w:p>
@@ -1669,7 +1669,7 @@
           <w:sz w:val="24"/>
           <w:szCs w:val="24"/>
         </w:rPr>
-        <w:t xml:space="preserve">), while the Bi-LSTM did not differ from the Random Forest. On Angolan posts, however, BERTimbau's macro-F1 fell to 0.533, against 0.919 on the public corpus, a gap of 38.6 percentage points. The drop was largest for disinformation, a sign that the model learned mainly the style of the Fake.br news articles. Building on these results, a web application was developed with individual accounts, anonymisation at ingestion in line with Angolan Law No. 22/11, provenance records, auditing and a review queue ordered by priority, with no automatic decisions. On a computer without a GPU, the system processed each post in about 0.63 seconds and, by writing classifications in sub-batches, placed the first posts in the queue within 36 seconds, which conditionally supports the processing-time hypothesis. Early warning was not tested. The main contributions are the annotated Angolan corpus, the measurement of the domain gap and a reproducible, low-cost architecture for human-in-the-loop triage.</w:t>
+        <w:t xml:space="preserve">), while the Bi-LSTM did not differ from the Random Forest. On Angolan posts, however, BERTimbau's macro-F1 fell to 0.533, against 0.919 on the public corpus, a gap of 38.6 percentage points. The drop was largest for disinformation, a sign that the model learned mainly the style of the Fake.br news articles. Building on these results, a web application was developed with individual accounts, anonymisation at ingestion in line with Angolan Law No. 22/11, provenance records, auditing and a review queue ordered by priority, with no automatic decisions. Threats confirmed by analysts trigger alerts in the application and by e-mail, and a province map shows their concentration and change over time. On a computer without a GPU, the system processed each post in about 0.63 seconds and, by writing classifications in sub-batches, placed the first posts in the queue within 36 seconds, which conditionally supports the processing-time hypothesis. Early warning was not tested. The main contributions are the annotated Angolan corpus, the measurement of the domain gap and a reproducible, low-cost architecture for human-in-the-loop triage.</w:t>
       </w:r>
     </w:p>
     <w:p>
@@ -5099,7 +5099,7 @@
               <w:sz w:val="24"/>
               <w:szCs w:val="24"/>
             </w:rPr>
-            <w:t>22</w:t>
+            <w:t>23</w:t>
           </w:r>
         </w:p>
         <w:p>
@@ -5133,7 +5133,7 @@
               <w:sz w:val="24"/>
               <w:szCs w:val="24"/>
             </w:rPr>
-            <w:t>25</w:t>
+            <w:t>26</w:t>
           </w:r>
         </w:p>
         <w:p>
@@ -5167,7 +5167,7 @@
               <w:sz w:val="24"/>
               <w:szCs w:val="24"/>
             </w:rPr>
-            <w:t>27</w:t>
+            <w:t>28</w:t>
           </w:r>
         </w:p>
         <w:p>
@@ -5201,7 +5201,7 @@
               <w:sz w:val="24"/>
               <w:szCs w:val="24"/>
             </w:rPr>
-            <w:t>28</w:t>
+            <w:t>30</w:t>
           </w:r>
         </w:p>
         <w:p>
@@ -5235,7 +5235,7 @@
               <w:sz w:val="24"/>
               <w:szCs w:val="24"/>
             </w:rPr>
-            <w:t>29</w:t>
+            <w:t>31</w:t>
           </w:r>
         </w:p>
         <w:p>
@@ -5271,7 +5271,7 @@
               <w:sz w:val="24"/>
               <w:szCs w:val="24"/>
             </w:rPr>
-            <w:t>30</w:t>
+            <w:t>33</w:t>
           </w:r>
         </w:p>
         <w:p>
@@ -5305,7 +5305,7 @@
               <w:sz w:val="24"/>
               <w:szCs w:val="24"/>
             </w:rPr>
-            <w:t>30</w:t>
+            <w:t>33</w:t>
           </w:r>
         </w:p>
         <w:p>
@@ -5339,7 +5339,7 @@
               <w:sz w:val="24"/>
               <w:szCs w:val="24"/>
             </w:rPr>
-            <w:t>31</w:t>
+            <w:t>34</w:t>
           </w:r>
         </w:p>
         <w:p>
@@ -5373,7 +5373,7 @@
               <w:sz w:val="24"/>
               <w:szCs w:val="24"/>
             </w:rPr>
-            <w:t>32</w:t>
+            <w:t>35</w:t>
           </w:r>
         </w:p>
         <w:p>
@@ -5407,7 +5407,7 @@
               <w:sz w:val="24"/>
               <w:szCs w:val="24"/>
             </w:rPr>
-            <w:t>33</w:t>
+            <w:t>36</w:t>
           </w:r>
         </w:p>
         <w:p>
@@ -5441,7 +5441,7 @@
               <w:sz w:val="24"/>
               <w:szCs w:val="24"/>
             </w:rPr>
-            <w:t>36</w:t>
+            <w:t>39</w:t>
           </w:r>
         </w:p>
         <w:p>
@@ -5475,7 +5475,7 @@
               <w:sz w:val="24"/>
               <w:szCs w:val="24"/>
             </w:rPr>
-            <w:t>36</w:t>
+            <w:t>39</w:t>
           </w:r>
         </w:p>
         <w:p>
@@ -5509,7 +5509,7 @@
               <w:sz w:val="24"/>
               <w:szCs w:val="24"/>
             </w:rPr>
-            <w:t>37</w:t>
+            <w:t>40</w:t>
           </w:r>
         </w:p>
         <w:p>
@@ -5543,7 +5543,7 @@
               <w:sz w:val="24"/>
               <w:szCs w:val="24"/>
             </w:rPr>
-            <w:t>38</w:t>
+            <w:t>41</w:t>
           </w:r>
         </w:p>
         <w:p>
@@ -5577,7 +5577,7 @@
               <w:sz w:val="24"/>
               <w:szCs w:val="24"/>
             </w:rPr>
-            <w:t>39</w:t>
+            <w:t>42</w:t>
           </w:r>
         </w:p>
         <w:p>
@@ -5611,7 +5611,7 @@
               <w:sz w:val="24"/>
               <w:szCs w:val="24"/>
             </w:rPr>
-            <w:t>39</w:t>
+            <w:t>42</w:t>
           </w:r>
         </w:p>
         <w:p>
@@ -5645,7 +5645,7 @@
               <w:sz w:val="24"/>
               <w:szCs w:val="24"/>
             </w:rPr>
-            <w:t>41</w:t>
+            <w:t>44</w:t>
           </w:r>
         </w:p>
         <w:p>
@@ -5679,7 +5679,7 @@
               <w:sz w:val="24"/>
               <w:szCs w:val="24"/>
             </w:rPr>
-            <w:t>41</w:t>
+            <w:t>44</w:t>
           </w:r>
         </w:p>
         <w:p>
@@ -5713,7 +5713,7 @@
               <w:sz w:val="24"/>
               <w:szCs w:val="24"/>
             </w:rPr>
-            <w:t>41</w:t>
+            <w:t>44</w:t>
           </w:r>
         </w:p>
         <w:p>
@@ -5749,7 +5749,7 @@
               <w:sz w:val="24"/>
               <w:szCs w:val="24"/>
             </w:rPr>
-            <w:t>44</w:t>
+            <w:t>47</w:t>
           </w:r>
         </w:p>
         <w:p>
@@ -5783,7 +5783,7 @@
               <w:sz w:val="24"/>
               <w:szCs w:val="24"/>
             </w:rPr>
-            <w:t>44</w:t>
+            <w:t>47</w:t>
           </w:r>
         </w:p>
         <w:p>
@@ -5817,7 +5817,7 @@
               <w:sz w:val="24"/>
               <w:szCs w:val="24"/>
             </w:rPr>
-            <w:t>44</w:t>
+            <w:t>47</w:t>
           </w:r>
         </w:p>
         <w:p>
@@ -5851,7 +5851,7 @@
               <w:sz w:val="24"/>
               <w:szCs w:val="24"/>
             </w:rPr>
-            <w:t>45</w:t>
+            <w:t>48</w:t>
           </w:r>
         </w:p>
         <w:p>
@@ -5885,7 +5885,7 @@
               <w:sz w:val="24"/>
               <w:szCs w:val="24"/>
             </w:rPr>
-            <w:t>45</w:t>
+            <w:t>48</w:t>
           </w:r>
         </w:p>
         <w:p>
@@ -5919,7 +5919,7 @@
               <w:sz w:val="24"/>
               <w:szCs w:val="24"/>
             </w:rPr>
-            <w:t>46</w:t>
+            <w:t>49</w:t>
           </w:r>
         </w:p>
         <w:p>
@@ -5953,7 +5953,7 @@
               <w:sz w:val="24"/>
               <w:szCs w:val="24"/>
             </w:rPr>
-            <w:t>47</w:t>
+            <w:t>50</w:t>
           </w:r>
         </w:p>
         <w:p>
@@ -5989,7 +5989,7 @@
               <w:sz w:val="24"/>
               <w:szCs w:val="24"/>
             </w:rPr>
-            <w:t>48</w:t>
+            <w:t>51</w:t>
           </w:r>
         </w:p>
         <w:p>
@@ -6025,7 +6025,7 @@
               <w:sz w:val="24"/>
               <w:szCs w:val="24"/>
             </w:rPr>
-            <w:t>52</w:t>
+            <w:t>55</w:t>
           </w:r>
         </w:p>
         <w:p>
@@ -6989,7 +6989,7 @@
               <w:sz w:val="24"/>
               <w:szCs w:val="24"/>
             </w:rPr>
-            <w:t>F2</w:t>
+            <w:t>F3</w:t>
           </w:r>
         </w:p>
         <w:p>
@@ -7007,7 +7007,7 @@
               <w:sz w:val="24"/>
               <w:szCs w:val="24"/>
             </w:rPr>
-            <w:t xml:space="preserve">F.5 Linha de comandos</w:t>
+            <w:t xml:space="preserve">F.5 Alertas, mapa e relatório</w:t>
           </w:r>
           <w:r>
             <w:rPr>
@@ -7041,7 +7041,7 @@
               <w:sz w:val="24"/>
               <w:szCs w:val="24"/>
             </w:rPr>
-            <w:t xml:space="preserve">F.6 Guardar o modelo depois do treino</w:t>
+            <w:t xml:space="preserve">F.6 Linha de comandos</w:t>
           </w:r>
           <w:r>
             <w:rPr>
@@ -7058,6 +7058,40 @@
               <w:szCs w:val="24"/>
             </w:rPr>
             <w:t>F3</w:t>
+          </w:r>
+        </w:p>
+        <w:p>
+          <w:pPr>
+            <w:tabs>
+              <w:tab w:val="right" w:leader="dot" w:pos="8221"/>
+            </w:tabs>
+            <w:spacing w:before="0" w:after="60" w:line="276" w:lineRule="auto"/>
+            <w:ind w:left="400" w:right="560" w:hanging="0"/>
+            <w:jc w:val="left"/>
+          </w:pPr>
+          <w:r>
+            <w:rPr>
+              <w:rFonts w:ascii="Times New Roman" w:hAnsi="Times New Roman" w:cs="Times New Roman"/>
+              <w:sz w:val="24"/>
+              <w:szCs w:val="24"/>
+            </w:rPr>
+            <w:t xml:space="preserve">F.7 Guardar o modelo depois do treino</w:t>
+          </w:r>
+          <w:r>
+            <w:rPr>
+              <w:rFonts w:ascii="Times New Roman" w:hAnsi="Times New Roman" w:cs="Times New Roman"/>
+              <w:sz w:val="24"/>
+              <w:szCs w:val="24"/>
+            </w:rPr>
+            <w:tab/>
+          </w:r>
+          <w:r>
+            <w:rPr>
+              <w:rFonts w:ascii="Times New Roman" w:hAnsi="Times New Roman" w:cs="Times New Roman"/>
+              <w:sz w:val="24"/>
+              <w:szCs w:val="24"/>
+            </w:rPr>
+            <w:t>F4</w:t>
           </w:r>
         </w:p>
         <w:p>
@@ -7332,7 +7366,7 @@
               <w:sz w:val="24"/>
               <w:szCs w:val="24"/>
             </w:rPr>
-            <w:t>29</w:t>
+            <w:t>32</w:t>
           </w:r>
         </w:p>
         <w:p>
@@ -7366,7 +7400,7 @@
               <w:sz w:val="24"/>
               <w:szCs w:val="24"/>
             </w:rPr>
-            <w:t>30</w:t>
+            <w:t>33</w:t>
           </w:r>
         </w:p>
         <w:p>
@@ -7400,7 +7434,7 @@
               <w:sz w:val="24"/>
               <w:szCs w:val="24"/>
             </w:rPr>
-            <w:t>31</w:t>
+            <w:t>34</w:t>
           </w:r>
         </w:p>
         <w:p>
@@ -7434,7 +7468,7 @@
               <w:sz w:val="24"/>
               <w:szCs w:val="24"/>
             </w:rPr>
-            <w:t>33</w:t>
+            <w:t>36</w:t>
           </w:r>
         </w:p>
         <w:p>
@@ -7468,7 +7502,7 @@
               <w:sz w:val="24"/>
               <w:szCs w:val="24"/>
             </w:rPr>
-            <w:t>33</w:t>
+            <w:t>36</w:t>
           </w:r>
         </w:p>
         <w:p>
@@ -7502,7 +7536,7 @@
               <w:sz w:val="24"/>
               <w:szCs w:val="24"/>
             </w:rPr>
-            <w:t>36</w:t>
+            <w:t>39</w:t>
           </w:r>
         </w:p>
         <w:p>
@@ -7536,7 +7570,7 @@
               <w:sz w:val="24"/>
               <w:szCs w:val="24"/>
             </w:rPr>
-            <w:t>37</w:t>
+            <w:t>40</w:t>
           </w:r>
         </w:p>
         <w:p>
@@ -7570,7 +7604,7 @@
               <w:sz w:val="24"/>
               <w:szCs w:val="24"/>
             </w:rPr>
-            <w:t>38</w:t>
+            <w:t>41</w:t>
           </w:r>
         </w:p>
         <w:p>
@@ -7604,7 +7638,7 @@
               <w:sz w:val="24"/>
               <w:szCs w:val="24"/>
             </w:rPr>
-            <w:t>40</w:t>
+            <w:t>43</w:t>
           </w:r>
         </w:p>
         <w:p>
@@ -7638,7 +7672,7 @@
               <w:sz w:val="24"/>
               <w:szCs w:val="24"/>
             </w:rPr>
-            <w:t>41</w:t>
+            <w:t>44</w:t>
           </w:r>
         </w:p>
         <w:p>
@@ -7672,7 +7706,7 @@
               <w:sz w:val="24"/>
               <w:szCs w:val="24"/>
             </w:rPr>
-            <w:t>44</w:t>
+            <w:t>47</w:t>
           </w:r>
         </w:p>
         <w:p>
@@ -8151,7 +8185,7 @@
               <w:sz w:val="24"/>
               <w:szCs w:val="24"/>
             </w:rPr>
-            <w:t>25</w:t>
+            <w:t>26</w:t>
           </w:r>
         </w:p>
         <w:p>
@@ -8185,7 +8219,7 @@
               <w:sz w:val="24"/>
               <w:szCs w:val="24"/>
             </w:rPr>
-            <w:t>26</w:t>
+            <w:t>27</w:t>
           </w:r>
         </w:p>
         <w:p>
@@ -8219,7 +8253,7 @@
               <w:sz w:val="24"/>
               <w:szCs w:val="24"/>
             </w:rPr>
-            <w:t>26</w:t>
+            <w:t>28</w:t>
           </w:r>
         </w:p>
         <w:p>
@@ -8253,7 +8287,41 @@
               <w:sz w:val="24"/>
               <w:szCs w:val="24"/>
             </w:rPr>
-            <w:t>27</w:t>
+            <w:t>29</w:t>
+          </w:r>
+        </w:p>
+        <w:p>
+          <w:pPr>
+            <w:tabs>
+              <w:tab w:val="right" w:leader="dot" w:pos="8221"/>
+            </w:tabs>
+            <w:spacing w:before="60" w:after="60" w:line="276" w:lineRule="auto"/>
+            <w:ind w:left="400" w:right="560" w:hanging="400"/>
+            <w:jc w:val="left"/>
+          </w:pPr>
+          <w:r>
+            <w:rPr>
+              <w:rFonts w:ascii="Times New Roman" w:hAnsi="Times New Roman" w:cs="Times New Roman"/>
+              <w:sz w:val="24"/>
+              <w:szCs w:val="24"/>
+            </w:rPr>
+            <w:t xml:space="preserve">Figura 3.8 – Mapa por província na aplicação web</w:t>
+          </w:r>
+          <w:r>
+            <w:rPr>
+              <w:rFonts w:ascii="Times New Roman" w:hAnsi="Times New Roman" w:cs="Times New Roman"/>
+              <w:sz w:val="24"/>
+              <w:szCs w:val="24"/>
+            </w:rPr>
+            <w:tab/>
+          </w:r>
+          <w:r>
+            <w:rPr>
+              <w:rFonts w:ascii="Times New Roman" w:hAnsi="Times New Roman" w:cs="Times New Roman"/>
+              <w:sz w:val="24"/>
+              <w:szCs w:val="24"/>
+            </w:rPr>
+            <w:t>30</w:t>
           </w:r>
         </w:p>
         <w:p>
@@ -8287,7 +8355,7 @@
               <w:sz w:val="24"/>
               <w:szCs w:val="24"/>
             </w:rPr>
-            <w:t>32</w:t>
+            <w:t>35</w:t>
           </w:r>
         </w:p>
         <w:p>
@@ -8321,7 +8389,7 @@
               <w:sz w:val="24"/>
               <w:szCs w:val="24"/>
             </w:rPr>
-            <w:t>35</w:t>
+            <w:t>38</w:t>
           </w:r>
         </w:p>
         <w:p>
@@ -8355,7 +8423,7 @@
               <w:sz w:val="24"/>
               <w:szCs w:val="24"/>
             </w:rPr>
-            <w:t>38</w:t>
+            <w:t>41</w:t>
           </w:r>
         </w:p>
         <w:p>
@@ -8975,7 +9043,7 @@
           <w:sz w:val="24"/>
           <w:szCs w:val="24"/>
         </w:rPr>
-        <w:t xml:space="preserve"> Desenvolver um protótipo de sistema de triagem com fila de revisão, painel do analista e serviço de inferência, e definir o protocolo da sua avaliação operacional.</w:t>
+        <w:t xml:space="preserve"> Desenvolver um protótipo de sistema de triagem com fila de revisão, painel do analista, serviço de inferência, alertas e mapa por província, e definir o protocolo da sua avaliação operacional.</w:t>
       </w:r>
     </w:p>
     <w:p>
@@ -15372,6 +15440,228 @@
                 <w:sz w:val="19"/>
                 <w:szCs w:val="19"/>
               </w:rPr>
+              <w:t xml:space="preserve">RF11</w:t>
+            </w:r>
+          </w:p>
+        </w:tc>
+        <w:tc>
+          <w:tcPr>
+            <w:tcW w:type="dxa" w:w="7120"/>
+            <w:tcBorders>
+              <w:top w:val="none" w:color="FFFFFF" w:sz="0"/>
+              <w:left w:val="none" w:color="FFFFFF" w:sz="0"/>
+              <w:bottom w:val="none" w:color="FFFFFF" w:sz="0"/>
+              <w:right w:val="none" w:color="FFFFFF" w:sz="0"/>
+            </w:tcBorders>
+            <w:tcMar>
+              <w:top w:type="dxa" w:w="50"/>
+              <w:left w:type="dxa" w:w="80"/>
+              <w:bottom w:type="dxa" w:w="50"/>
+              <w:right w:type="dxa" w:w="80"/>
+            </w:tcMar>
+            <w:vAlign w:val="center"/>
+          </w:tcPr>
+          <w:p>
+            <w:pPr>
+              <w:spacing w:line="240"/>
+              <w:jc w:val="left"/>
+            </w:pPr>
+            <w:r>
+              <w:rPr>
+                <w:rFonts w:ascii="Times New Roman" w:cs="Times New Roman" w:eastAsia="Times New Roman" w:hAnsi="Times New Roman"/>
+                <w:b w:val="false"/>
+                <w:bCs w:val="false"/>
+                <w:sz w:val="19"/>
+                <w:szCs w:val="19"/>
+              </w:rPr>
+              <w:t xml:space="preserve">Gerar alertas a partir de ameaças confirmadas por analistas e de tendências de crescimento, na aplicação e por e-mail</w:t>
+            </w:r>
+          </w:p>
+        </w:tc>
+      </w:tr>
+      <w:tr>
+        <w:trPr>
+          <w:cantSplit/>
+          <w:tblHeader w:val="false"/>
+        </w:trPr>
+        <w:tc>
+          <w:tcPr>
+            <w:tcW w:type="dxa" w:w="1100"/>
+            <w:tcBorders>
+              <w:top w:val="none" w:color="FFFFFF" w:sz="0"/>
+              <w:left w:val="none" w:color="FFFFFF" w:sz="0"/>
+              <w:bottom w:val="none" w:color="FFFFFF" w:sz="0"/>
+              <w:right w:val="none" w:color="FFFFFF" w:sz="0"/>
+            </w:tcBorders>
+            <w:tcMar>
+              <w:top w:type="dxa" w:w="50"/>
+              <w:left w:type="dxa" w:w="80"/>
+              <w:bottom w:type="dxa" w:w="50"/>
+              <w:right w:type="dxa" w:w="80"/>
+            </w:tcMar>
+            <w:vAlign w:val="center"/>
+          </w:tcPr>
+          <w:p>
+            <w:pPr>
+              <w:spacing w:line="240"/>
+              <w:jc w:val="left"/>
+            </w:pPr>
+            <w:r>
+              <w:rPr>
+                <w:rFonts w:ascii="Times New Roman" w:cs="Times New Roman" w:eastAsia="Times New Roman" w:hAnsi="Times New Roman"/>
+                <w:b w:val="false"/>
+                <w:bCs w:val="false"/>
+                <w:sz w:val="19"/>
+                <w:szCs w:val="19"/>
+              </w:rPr>
+              <w:t xml:space="preserve">RF12</w:t>
+            </w:r>
+          </w:p>
+        </w:tc>
+        <w:tc>
+          <w:tcPr>
+            <w:tcW w:type="dxa" w:w="7120"/>
+            <w:tcBorders>
+              <w:top w:val="none" w:color="FFFFFF" w:sz="0"/>
+              <w:left w:val="none" w:color="FFFFFF" w:sz="0"/>
+              <w:bottom w:val="none" w:color="FFFFFF" w:sz="0"/>
+              <w:right w:val="none" w:color="FFFFFF" w:sz="0"/>
+            </w:tcBorders>
+            <w:tcMar>
+              <w:top w:type="dxa" w:w="50"/>
+              <w:left w:type="dxa" w:w="80"/>
+              <w:bottom w:type="dxa" w:w="50"/>
+              <w:right w:type="dxa" w:w="80"/>
+            </w:tcMar>
+            <w:vAlign w:val="center"/>
+          </w:tcPr>
+          <w:p>
+            <w:pPr>
+              <w:spacing w:line="240"/>
+              <w:jc w:val="left"/>
+            </w:pPr>
+            <w:r>
+              <w:rPr>
+                <w:rFonts w:ascii="Times New Roman" w:cs="Times New Roman" w:eastAsia="Times New Roman" w:hAnsi="Times New Roman"/>
+                <w:b w:val="false"/>
+                <w:bCs w:val="false"/>
+                <w:sz w:val="19"/>
+                <w:szCs w:val="19"/>
+              </w:rPr>
+              <w:t xml:space="preserve">Mostrar num mapa, por província, a concentração e a evolução das ameaças no período escolhido</w:t>
+            </w:r>
+          </w:p>
+        </w:tc>
+      </w:tr>
+      <w:tr>
+        <w:trPr>
+          <w:cantSplit/>
+          <w:tblHeader w:val="false"/>
+        </w:trPr>
+        <w:tc>
+          <w:tcPr>
+            <w:tcW w:type="dxa" w:w="1100"/>
+            <w:tcBorders>
+              <w:top w:val="none" w:color="FFFFFF" w:sz="0"/>
+              <w:left w:val="none" w:color="FFFFFF" w:sz="0"/>
+              <w:bottom w:val="none" w:color="FFFFFF" w:sz="0"/>
+              <w:right w:val="none" w:color="FFFFFF" w:sz="0"/>
+            </w:tcBorders>
+            <w:tcMar>
+              <w:top w:type="dxa" w:w="50"/>
+              <w:left w:type="dxa" w:w="80"/>
+              <w:bottom w:type="dxa" w:w="50"/>
+              <w:right w:type="dxa" w:w="80"/>
+            </w:tcMar>
+            <w:vAlign w:val="center"/>
+          </w:tcPr>
+          <w:p>
+            <w:pPr>
+              <w:spacing w:line="240"/>
+              <w:jc w:val="left"/>
+            </w:pPr>
+            <w:r>
+              <w:rPr>
+                <w:rFonts w:ascii="Times New Roman" w:cs="Times New Roman" w:eastAsia="Times New Roman" w:hAnsi="Times New Roman"/>
+                <w:b w:val="false"/>
+                <w:bCs w:val="false"/>
+                <w:sz w:val="19"/>
+                <w:szCs w:val="19"/>
+              </w:rPr>
+              <w:t xml:space="preserve">RF13</w:t>
+            </w:r>
+          </w:p>
+        </w:tc>
+        <w:tc>
+          <w:tcPr>
+            <w:tcW w:type="dxa" w:w="7120"/>
+            <w:tcBorders>
+              <w:top w:val="none" w:color="FFFFFF" w:sz="0"/>
+              <w:left w:val="none" w:color="FFFFFF" w:sz="0"/>
+              <w:bottom w:val="none" w:color="FFFFFF" w:sz="0"/>
+              <w:right w:val="none" w:color="FFFFFF" w:sz="0"/>
+            </w:tcBorders>
+            <w:tcMar>
+              <w:top w:type="dxa" w:w="50"/>
+              <w:left w:type="dxa" w:w="80"/>
+              <w:bottom w:type="dxa" w:w="50"/>
+              <w:right w:type="dxa" w:w="80"/>
+            </w:tcMar>
+            <w:vAlign w:val="center"/>
+          </w:tcPr>
+          <w:p>
+            <w:pPr>
+              <w:spacing w:line="240"/>
+              <w:jc w:val="left"/>
+            </w:pPr>
+            <w:r>
+              <w:rPr>
+                <w:rFonts w:ascii="Times New Roman" w:cs="Times New Roman" w:eastAsia="Times New Roman" w:hAnsi="Times New Roman"/>
+                <w:b w:val="false"/>
+                <w:bCs w:val="false"/>
+                <w:sz w:val="19"/>
+                <w:szCs w:val="19"/>
+              </w:rPr>
+              <w:t xml:space="preserve">Produzir o relatório de alertas de ameaças de um período, para impressão, exportação e envio por e-mail</w:t>
+            </w:r>
+          </w:p>
+        </w:tc>
+      </w:tr>
+      <w:tr>
+        <w:trPr>
+          <w:cantSplit/>
+          <w:tblHeader w:val="false"/>
+        </w:trPr>
+        <w:tc>
+          <w:tcPr>
+            <w:tcW w:type="dxa" w:w="1100"/>
+            <w:tcBorders>
+              <w:top w:val="none" w:color="FFFFFF" w:sz="0"/>
+              <w:left w:val="none" w:color="FFFFFF" w:sz="0"/>
+              <w:bottom w:val="none" w:color="FFFFFF" w:sz="0"/>
+              <w:right w:val="none" w:color="FFFFFF" w:sz="0"/>
+            </w:tcBorders>
+            <w:tcMar>
+              <w:top w:type="dxa" w:w="50"/>
+              <w:left w:type="dxa" w:w="80"/>
+              <w:bottom w:type="dxa" w:w="50"/>
+              <w:right w:type="dxa" w:w="80"/>
+            </w:tcMar>
+            <w:vAlign w:val="center"/>
+          </w:tcPr>
+          <w:p>
+            <w:pPr>
+              <w:spacing w:line="240"/>
+              <w:jc w:val="left"/>
+            </w:pPr>
+            <w:r>
+              <w:rPr>
+                <w:rFonts w:ascii="Times New Roman" w:cs="Times New Roman" w:eastAsia="Times New Roman" w:hAnsi="Times New Roman"/>
+                <w:b w:val="false"/>
+                <w:bCs w:val="false"/>
+                <w:sz w:val="19"/>
+                <w:szCs w:val="19"/>
+              </w:rPr>
               <w:t xml:space="preserve">RNF1</w:t>
             </w:r>
           </w:p>
@@ -16970,7 +17260,7 @@
           <w:sz w:val="24"/>
           <w:szCs w:val="24"/>
         </w:rPr>
-        <w:t xml:space="preserve"> O armazenamento usa SQLite, um motor de base de dados relacional que guarda tudo num único ficheiro (por omissão, dados\sistema.db), não precisa de servidor próprio e suporta transacções e chaves estrangeiras. A base de dados guarda as fontes de recolha, os lotes, as publicações, as classificações, as revisões (uma por analista e publicação), a amostra de controlo, os utilizadores e as sessões, as definições e o registo de auditoria (Figura 3.4). O modo de diário WAL permite que a classificação em segundo plano grave enquanto os analistas consultam a fila. A cópia de segurança é feita com a função de cópia em linha do SQLite, sem parar o serviço. Para vários servidores ou volumes maiores, o mesmo esquema pode passar para PostgreSQL.</w:t>
+        <w:t xml:space="preserve"> O armazenamento usa SQLite, um motor de base de dados relacional que guarda tudo num único ficheiro (por omissão, dados\sistema.db), não precisa de servidor próprio e suporta transacções e chaves estrangeiras. A base de dados guarda as fontes de recolha, os lotes, as publicações, as classificações, as revisões (uma por analista e publicação), a amostra de controlo, os utilizadores e as sessões, as definições e o registo de auditoria (Figura 3.4). Duas tabelas servem os alertas: uma liga cada publicação às províncias que menciona e outra guarda os alertas e quem já os viu. O modo de diário WAL permite que a classificação em segundo plano grave enquanto os analistas consultam a fila. A cópia de segurança é feita com a função de cópia em linha do SQLite, sem parar o serviço. Para vários servidores ou volumes maiores, o mesmo esquema pode passar para PostgreSQL.</w:t>
       </w:r>
     </w:p>
     <w:p>
@@ -17028,7 +17318,36 @@
           <w:sz w:val="24"/>
           <w:szCs w:val="24"/>
         </w:rPr>
-        <w:t xml:space="preserve"> Uma aplicação web, acedida pelo navegador, mostra a fila de revisão, a amostra de controlo, o panorama agregado, os lotes e, para o supervisor, as métricas, as contas e a auditoria. As métricas podem ser exportadas para relatórios, incluindo ferramentas como o Power BI, sem que estas tenham acesso aos textos.</w:t>
+        <w:t xml:space="preserve"> Uma aplicação web, acedida pelo navegador, mostra a fila de revisão, a amostra de controlo, o panorama agregado, os alertas, o mapa por província, o relatório de alertas e os lotes e, para o supervisor, as métricas, as contas e a auditoria. As métricas podem ser exportadas para relatórios, incluindo ferramentas como o Power BI, sem que estas tenham acesso aos textos.</w:t>
+      </w:r>
+    </w:p>
+    <w:p>
+      <w:pPr>
+        <w:pStyle w:val="ListParagraph"/>
+        <w:numPr>
+          <w:ilvl w:val="0"/>
+          <w:numId w:val="2"/>
+        </w:numPr>
+        <w:spacing w:after="60" w:line="360"/>
+        <w:jc w:val="both"/>
+      </w:pPr>
+      <w:r>
+        <w:rPr>
+          <w:rFonts w:ascii="Times New Roman" w:cs="Times New Roman" w:eastAsia="Times New Roman" w:hAnsi="Times New Roman"/>
+          <w:b/>
+          <w:bCs/>
+          <w:sz w:val="24"/>
+          <w:szCs w:val="24"/>
+        </w:rPr>
+        <w:t xml:space="preserve">Alertas e relatório.</w:t>
+      </w:r>
+      <w:r>
+        <w:rPr>
+          <w:rFonts w:ascii="Times New Roman" w:cs="Times New Roman" w:eastAsia="Times New Roman" w:hAnsi="Times New Roman"/>
+          <w:sz w:val="24"/>
+          <w:szCs w:val="24"/>
+        </w:rPr>
+        <w:t xml:space="preserve"> Os alertas nascem apenas de decisões humanas. Um alerta de ameaça confirmada surge quando o número de analistas definido pelo supervisor (um, por omissão) escolhe uma categoria de ameaça e há mais decisões de ameaça do que de Normal. Um alerta de tendência surge quando as ameaças confirmadas numa província, ou no país, chegam a um mínimo de casos numa janela (cinco em sete dias, por omissão), crescem pelo menos 50% face à janela anterior e ganham peso no total de publicações recolhidas; esta última condição impede que um simples aumento da recolha pareça um aumento de ameaça. Os alertas aparecem na aplicação e são enviados por e-mail aos destinatários definidos pelo supervisor, sem o texto da publicação nem o pseudónimo do autor, apenas com a categoria, a província, a data e a ligação para o sistema. Nunca são enviados automaticamente a terceiros. O relatório de alertas de ameaças reúne, para o período escolhido, os indicadores, o mapa, as categorias, os alertas e as ameaças confirmadas, e pode ser impresso, guardado em PDF, exportado em CSV ou enviado por e-mail.</w:t>
       </w:r>
     </w:p>
     <w:p>
@@ -17043,6 +17362,21 @@
           <w:sz w:val="24"/>
           <w:szCs w:val="24"/>
         </w:rPr>
+        <w:t xml:space="preserve">A localização usada nos alertas e no mapa é o lugar mencionado na publicação, não a localização de quem a escreveu, que os dados públicos não revelam. À entrada, o texto e o contexto são comparados com uma lista de topónimos (nomes das províncias, capitais e municípios mais citados), da qual se excluíram nomes com outro significado corrente, como Belas ou Cela, e termos ambíguos, como Kwanza sem Norte ou Sul. A localização fica ao nível da província, para não se aproximar de um perfil de pessoas, e as publicações sem lugar mencionado contam como «sem localização». O mapa usa as 18 províncias com os limites em vigor de 2011 a 2024, anteriores à divisão político-administrativa que entrou em vigor em Janeiro de 2025, a partir dos limites do geoBoundaries, de domínio público (Runfola et al., 2020). A cor de cada província é a taxa de ameaças confirmadas sobre as publicações que a mencionam, de modo que falar muito de Luanda não a torne, por si só, a província mais ameaçada; abaixo de cinco publicações, a taxa não é calculada. Setas indicam a variação face ao período anterior com a mesma duração (Figura 3.8).</w:t>
+      </w:r>
+    </w:p>
+    <w:p>
+      <w:pPr>
+        <w:spacing w:after="120" w:before="0" w:line="360"/>
+        <w:ind w:firstLine="567"/>
+        <w:jc w:val="both"/>
+      </w:pPr>
+      <w:r>
+        <w:rPr>
+          <w:rFonts w:ascii="Times New Roman" w:cs="Times New Roman" w:eastAsia="Times New Roman" w:hAnsi="Times New Roman"/>
+          <w:sz w:val="24"/>
+          <w:szCs w:val="24"/>
+        </w:rPr>
         <w:t xml:space="preserve">As revisões do analista são exportadas com a origem </w:t>
       </w:r>
       <w:r>
@@ -17071,7 +17405,7 @@
       <w:r>
         <w:drawing>
           <wp:inline distT="0" distB="0" distL="0" distR="0">
-            <wp:extent cx="5400675" cy="4333875"/>
+            <wp:extent cx="5400675" cy="4667250"/>
             <wp:effectExtent t="0" r="0" b="0" l="0"/>
             <wp:docPr id="1" name="fig3_4_dados.png" descr="fig3_4_dados.png" title="fig3_4_dados.png"/>
             <wp:cNvGraphicFramePr>
@@ -17096,7 +17430,7 @@
                   <pic:spPr bwMode="auto">
                     <a:xfrm>
                       <a:off x="0" y="0"/>
-                      <a:ext cx="5400675" cy="4333875"/>
+                      <a:ext cx="5400675" cy="4667250"/>
                     </a:xfrm>
                     <a:prstGeom prst="rect">
                       <a:avLst/>
@@ -17155,7 +17489,7 @@
           <w:sz w:val="24"/>
           <w:szCs w:val="24"/>
         </w:rPr>
-        <w:t xml:space="preserve">O sistema tem quatro actores (Figura 3.5). O analista revê a sua fila e a amostra de controlo e consulta o panorama. O supervisor, que também pode rever, regista as fontes públicas e lança a recolha, importa lotes, sorteia a amostra de controlo, gere as contas, consulta métricas e auditoria, activa a revisão cega e aplica o prazo de conservação. O serviço de inferência classifica em segundo plano cada lote recolhido ou importado. O investigador exporta as revisões e treina novas versões do modelo.</w:t>
+        <w:t xml:space="preserve">O sistema tem cinco actores (Figura 3.5). O analista revê a sua fila e a amostra de controlo, consulta o panorama, os alertas e o mapa e gera o relatório de alertas. O supervisor, que também pode rever, regista as fontes públicas e lança a recolha, importa lotes, define as regras e os destinatários dos alertas, envia o relatório por e-mail, sorteia a amostra de controlo, gere as contas, consulta métricas e auditoria, activa a revisão cega e aplica o prazo de conservação. O serviço de inferência classifica em segundo plano cada lote recolhido ou importado. O investigador exporta as revisões e treina novas versões do modelo. O destinatário do e-mail, designado pelo supervisor, recebe os alertas e o resumo do relatório sem ter acesso ao sistema.</w:t>
       </w:r>
     </w:p>
     <w:p>
@@ -17167,7 +17501,7 @@
       <w:r>
         <w:drawing>
           <wp:inline distT="0" distB="0" distL="0" distR="0">
-            <wp:extent cx="5038725" cy="3438525"/>
+            <wp:extent cx="5038725" cy="4305300"/>
             <wp:effectExtent t="0" r="0" b="0" l="0"/>
             <wp:docPr id="1" name="fig3_5_casos_uso.png" descr="fig3_5_casos_uso.png" title="fig3_5_casos_uso.png"/>
             <wp:cNvGraphicFramePr>
@@ -17192,7 +17526,7 @@
                   <pic:spPr bwMode="auto">
                     <a:xfrm>
                       <a:off x="0" y="0"/>
-                      <a:ext cx="5038725" cy="3438525"/>
+                      <a:ext cx="5038725" cy="4305300"/>
                     </a:xfrm>
                     <a:prstGeom prst="rect">
                       <a:avLst/>
@@ -17234,7 +17568,7 @@
           <w:sz w:val="24"/>
           <w:szCs w:val="24"/>
         </w:rPr>
-        <w:t xml:space="preserve">A Figura 3.6 mostra a sequência de operações desde a recolha ou importação de um lote até à gravação da decisão do analista.</w:t>
+        <w:t xml:space="preserve">A Figura 3.6 mostra a sequência de operações desde a recolha ou importação de um lote até à gravação da decisão do analista e aos alertas que dela resultam.</w:t>
       </w:r>
     </w:p>
     <w:p>
@@ -17246,7 +17580,7 @@
       <w:r>
         <w:drawing>
           <wp:inline distT="0" distB="0" distL="0" distR="0">
-            <wp:extent cx="5581650" cy="3457575"/>
+            <wp:extent cx="5581650" cy="3981450"/>
             <wp:effectExtent t="0" r="0" b="0" l="0"/>
             <wp:docPr id="1" name="fig3_6_sequencia.png" descr="fig3_6_sequencia.png" title="fig3_6_sequencia.png"/>
             <wp:cNvGraphicFramePr>
@@ -17271,7 +17605,7 @@
                   <pic:spPr bwMode="auto">
                     <a:xfrm>
                       <a:off x="0" y="0"/>
-                      <a:ext cx="5581650" cy="3457575"/>
+                      <a:ext cx="5581650" cy="3981450"/>
                     </a:xfrm>
                     <a:prstGeom prst="rect">
                       <a:avLst/>
@@ -17430,6 +17764,86 @@
     </w:p>
     <w:p>
       <w:pPr>
+        <w:keepNext/>
+        <w:spacing w:after="40" w:before="160"/>
+        <w:jc w:val="center"/>
+      </w:pPr>
+      <w:r>
+        <w:drawing>
+          <wp:inline distT="0" distB="0" distL="0" distR="0">
+            <wp:extent cx="5581650" cy="5476875"/>
+            <wp:effectExtent t="0" r="0" b="0" l="0"/>
+            <wp:docPr id="1" name="fig3_8_mapa.png" descr="fig3_8_mapa.png" title="fig3_8_mapa.png"/>
+            <wp:cNvGraphicFramePr>
+              <a:graphicFrameLocks xmlns:a="http://schemas.openxmlformats.org/drawingml/2006/main" noChangeAspect="1"/>
+            </wp:cNvGraphicFramePr>
+            <a:graphic xmlns:a="http://schemas.openxmlformats.org/drawingml/2006/main">
+              <a:graphicData uri="http://schemas.openxmlformats.org/drawingml/2006/picture">
+                <pic:pic xmlns:pic="http://schemas.openxmlformats.org/drawingml/2006/picture">
+                  <pic:nvPicPr>
+                    <pic:cNvPr id="0" name="" descr=""/>
+                    <pic:cNvPicPr>
+                      <a:picLocks noChangeAspect="1" noChangeArrowheads="1"/>
+                    </pic:cNvPicPr>
+                  </pic:nvPicPr>
+                  <pic:blipFill>
+                    <a:blip r:embed="rId49" cstate="none"/>
+                    <a:srcRect/>
+                    <a:stretch>
+                      <a:fillRect/>
+                    </a:stretch>
+                  </pic:blipFill>
+                  <pic:spPr bwMode="auto">
+                    <a:xfrm>
+                      <a:off x="0" y="0"/>
+                      <a:ext cx="5581650" cy="5476875"/>
+                    </a:xfrm>
+                    <a:prstGeom prst="rect">
+                      <a:avLst/>
+                    </a:prstGeom>
+                  </pic:spPr>
+                </pic:pic>
+              </a:graphicData>
+            </a:graphic>
+          </wp:inline>
+        </w:drawing>
+      </w:r>
+    </w:p>
+    <w:p>
+      <w:pPr>
+        <w:pStyle w:val="LegendaFigura"/>
+        <w:spacing w:after="120" w:before="60" w:line="240"/>
+        <w:jc w:val="center"/>
+      </w:pPr>
+      <w:r>
+        <w:rPr>
+          <w:rFonts w:ascii="Times New Roman" w:cs="Times New Roman" w:eastAsia="Times New Roman" w:hAnsi="Times New Roman"/>
+          <w:b/>
+          <w:bCs/>
+          <w:sz w:val="20"/>
+          <w:szCs w:val="20"/>
+        </w:rPr>
+        <w:t xml:space="preserve">Figura 3.8 – Mapa por província na aplicação web</w:t>
+      </w:r>
+    </w:p>
+    <w:p>
+      <w:pPr>
+        <w:spacing w:after="240" w:before="0" w:line="240"/>
+        <w:jc w:val="center"/>
+      </w:pPr>
+      <w:r>
+        <w:rPr>
+          <w:rFonts w:ascii="Times New Roman" w:cs="Times New Roman" w:eastAsia="Times New Roman" w:hAnsi="Times New Roman"/>
+          <w:i/>
+          <w:iCs/>
+          <w:sz w:val="18"/>
+          <w:szCs w:val="18"/>
+        </w:rPr>
+        <w:t xml:space="preserve">Nota: dados fictícios e classificador de demonstração, usados apenas para ilustrar a interface.</w:t>
+      </w:r>
+    </w:p>
+    <w:p>
+      <w:pPr>
         <w:spacing w:after="120" w:before="0" w:line="360"/>
         <w:ind w:firstLine="567"/>
         <w:jc w:val="both"/>
@@ -17440,7 +17854,7 @@
           <w:sz w:val="24"/>
           <w:szCs w:val="24"/>
         </w:rPr>
-        <w:t xml:space="preserve">As principais funções estão também disponíveis numa interface de programação JSON, protegida por chave, para integração com outros componentes, e numa linha de comandos, para tarefas agendadas como a recolha periódica das fontes, a importação, a limpeza e as cópias de segurança. O manual de instalação e utilização consta do Apêndice F.</w:t>
+        <w:t xml:space="preserve">As principais funções estão também disponíveis numa interface de programação JSON, protegida por chave, para integração com outros componentes, e numa linha de comandos, para tarefas agendadas como a recolha periódica das fontes, a importação, a verificação de tendências, o relatório periódico, a limpeza e as cópias de segurança. O manual de instalação e utilização consta do Apêndice F.</w:t>
       </w:r>
     </w:p>
     <w:p>
@@ -17473,7 +17887,7 @@
           <w:sz w:val="24"/>
           <w:szCs w:val="24"/>
         </w:rPr>
-        <w:t xml:space="preserve">O sistema tem 42 testes automáticos. Cobrem a anonimização (máscaras e pseudónimos), a importação (deduplicação e rejeição de vias não previstas), a recolha (com um sítio de notícias simulado localmente, verifica-se que o robots.txt é respeitado, que as páginas com início de sessão e as de outros sítios ficam de fora, que os feeds RSS são lidos e que os comentários do YouTube, obtidos de um cliente simulado, chegam anonimizados à base de dados), o fluxo completo de importação, classificação, revisão, métricas e exportação, a gravação por sublotes, o prazo de conservação e as cópias de segurança, o carregamento de um modelo BERT guardado em disco e a interface de programação. Do lado da aplicação web, testam o controlo de acesso por papel, o bloqueio após tentativas falhadas, a protecção CSRF, o escape de texto malicioso, a revisão independente por dois analistas, a revisão cega, a amostra de controlo reprodutível e a migração automática do esquema da base de dados. Os testes são executados com o comando </w:t>
+        <w:t xml:space="preserve">O sistema tem 57 testes automáticos. Cobrem a anonimização (máscaras e pseudónimos), a importação (deduplicação e rejeição de vias não previstas), a recolha (com um sítio de notícias simulado localmente, verifica-se que o robots.txt é respeitado, que as páginas com início de sessão e as de outros sítios ficam de fora, que os feeds RSS são lidos e que os comentários do YouTube, obtidos de um cliente simulado, chegam anonimizados à base de dados), os alertas (o número mínimo de confirmações, a ausência de alertas repetidos, o alerta de tendência e a sua normalização pelo volume recolhido, o conteúdo dos e-mails, sem texto nem autor, e o registo de falhas de envio sem perda da decisão), a detecção de províncias e os seus casos ambíguos, o mapa e o relatório, o fluxo completo de importação, classificação, revisão, métricas e exportação, a gravação por sublotes, o prazo de conservação e as cópias de segurança, o carregamento de um modelo BERT guardado em disco e a interface de programação. Do lado da aplicação web, testam o controlo de acesso por papel, o bloqueio após tentativas falhadas, a protecção CSRF, o escape de texto malicioso, a revisão independente por dois analistas, a revisão cega, a amostra de controlo reprodutível e a migração automática do esquema da base de dados. Os testes são executados com o comando </w:t>
       </w:r>
       <w:r>
         <w:rPr>
@@ -20857,7 +21271,7 @@
                     </pic:cNvPicPr>
                   </pic:nvPicPr>
                   <pic:blipFill>
-                    <a:blip r:embed="rId49" cstate="none"/>
+                    <a:blip r:embed="rId50" cstate="none"/>
                     <a:srcRect/>
                     <a:stretch>
                       <a:fillRect/>
@@ -24304,7 +24718,7 @@
                     </pic:cNvPicPr>
                   </pic:nvPicPr>
                   <pic:blipFill>
-                    <a:blip r:embed="rId50" cstate="none"/>
+                    <a:blip r:embed="rId51" cstate="none"/>
                     <a:srcRect/>
                     <a:stretch>
                       <a:fillRect/>
@@ -27874,7 +28288,7 @@
                     </pic:cNvPicPr>
                   </pic:nvPicPr>
                   <pic:blipFill>
-                    <a:blip r:embed="rId51" cstate="none"/>
+                    <a:blip r:embed="rId52" cstate="none"/>
                     <a:srcRect/>
                     <a:stretch>
                       <a:fillRect/>
@@ -30184,7 +30598,7 @@
                 <w:sz w:val="18"/>
                 <w:szCs w:val="18"/>
               </w:rPr>
-              <w:t xml:space="preserve">Aplicação web com contas e papéis, ingestão anonimizada, base de dados auditada, classificação em segundo plano, fila por analista, revisão cega e amostra de controlo; recolha integrada do YouTube e de sítios públicos; base de dados SQLite; 42 testes; tempo de processamento medido (0,63 s por publicação em CPU; primeiras publicações na fila em 36 s com sublotes); avaliação com analistas por fazer</w:t>
+              <w:t xml:space="preserve">Aplicação web com contas e papéis, ingestão anonimizada, base de dados auditada, classificação em segundo plano, fila por analista, revisão cega e amostra de controlo; recolha integrada do YouTube e de sítios públicos; base de dados SQLite; alertas na aplicação e por e-mail, mapa por província e relatório de alertas; 57 testes; tempo de processamento medido (0,63 s por publicação em CPU; primeiras publicações na fila em 36 s com sublotes); avaliação com analistas por fazer</w:t>
             </w:r>
           </w:p>
         </w:tc>
@@ -30764,6 +31178,31 @@
           <w:sz w:val="24"/>
           <w:szCs w:val="24"/>
         </w:rPr>
+        <w:t xml:space="preserve">Localização.</w:t>
+      </w:r>
+      <w:r>
+        <w:rPr>
+          <w:rFonts w:ascii="Times New Roman" w:cs="Times New Roman" w:eastAsia="Times New Roman" w:hAnsi="Times New Roman"/>
+          <w:sz w:val="24"/>
+          <w:szCs w:val="24"/>
+        </w:rPr>
+        <w:t xml:space="preserve"> O mapa e os alertas por província usam o lugar mencionado nas publicações, não a localização de quem as escreveu. Uma província muito citada em notícias nacionais pode aparecer com mais ameaças do que aquelas que nela ocorrem, e as publicações sem lugar mencionado ficam fora do mapa. A lista de topónimos deixa de fora nomes ambíguos, o que reduz falsos positivos à custa de alguma cobertura.</w:t>
+      </w:r>
+    </w:p>
+    <w:p>
+      <w:pPr>
+        <w:spacing w:after="120" w:before="0" w:line="360"/>
+        <w:ind w:firstLine="567"/>
+        <w:jc w:val="both"/>
+      </w:pPr>
+      <w:r>
+        <w:rPr>
+          <w:rFonts w:ascii="Times New Roman" w:cs="Times New Roman" w:eastAsia="Times New Roman" w:hAnsi="Times New Roman"/>
+          <w:b/>
+          <w:bCs/>
+          <w:sz w:val="24"/>
+          <w:szCs w:val="24"/>
+        </w:rPr>
         <w:t xml:space="preserve">Fronteira entre protesto e mobilização hostil.</w:t>
       </w:r>
       <w:r>
@@ -30980,7 +31419,7 @@
           <w:sz w:val="24"/>
           <w:szCs w:val="24"/>
         </w:rPr>
-        <w:t xml:space="preserve"> Constituir um corpus datado em torno de eventos documentados, com divisão cronológica estrita, e acrescentar ao sistema indicadores agregados no tempo, incluindo métricas de análise de redes para detectar publicação coordenada.</w:t>
+        <w:t xml:space="preserve"> Constituir um corpus datado em torno de eventos documentados, com divisão cronológica estrita, e verificar se os alertas de tendência do sistema surgem antes desses eventos; acrescentar métricas de análise de redes para detectar publicação coordenada.</w:t>
       </w:r>
     </w:p>
     <w:p>
@@ -32290,6 +32729,39 @@
           <w:szCs w:val="24"/>
         </w:rPr>
         <w:t xml:space="preserve">, I Série.</w:t>
+      </w:r>
+    </w:p>
+    <w:p>
+      <w:pPr>
+        <w:spacing w:after="240" w:line="240"/>
+        <w:ind w:left="567" w:hanging="567"/>
+        <w:jc w:val="left"/>
+      </w:pPr>
+      <w:r>
+        <w:rPr>
+          <w:rFonts w:ascii="Times New Roman" w:cs="Times New Roman" w:eastAsia="Times New Roman" w:hAnsi="Times New Roman"/>
+          <w:sz w:val="24"/>
+          <w:szCs w:val="24"/>
+        </w:rPr>
+        <w:t xml:space="preserve">Runfola, D., Anderson, A., Baier, H., Crittenden, M., Dowker, E., Fuhrig, S., Goodman, S., Grimsley, G., Layko, R., Melville, G., Mulder, M., Oberman, R., Panganiban, J., Peck, A., Seitz, L., Shea, S., Slevin, H., Youngerman, R., &amp; Hobbs, L. (2020). geoBoundaries: A global database of political administrative boundaries. </w:t>
+      </w:r>
+      <w:r>
+        <w:rPr>
+          <w:rFonts w:ascii="Times New Roman" w:cs="Times New Roman" w:eastAsia="Times New Roman" w:hAnsi="Times New Roman"/>
+          <w:i/>
+          <w:iCs/>
+          <w:sz w:val="24"/>
+          <w:szCs w:val="24"/>
+        </w:rPr>
+        <w:t xml:space="preserve">PLoS ONE, 15</w:t>
+      </w:r>
+      <w:r>
+        <w:rPr>
+          <w:rFonts w:ascii="Times New Roman" w:cs="Times New Roman" w:eastAsia="Times New Roman" w:hAnsi="Times New Roman"/>
+          <w:sz w:val="24"/>
+          <w:szCs w:val="24"/>
+        </w:rPr>
+        <w:t xml:space="preserve">(4), e0231866. https://doi.org/10.1371/journal.pone.0231866</w:t>
       </w:r>
     </w:p>
     <w:p>
@@ -46518,7 +46990,7 @@
             <w:tcBorders>
               <w:top w:val="none" w:color="FFFFFF" w:sz="0"/>
               <w:left w:val="none" w:color="FFFFFF" w:sz="0"/>
-              <w:bottom w:val="single" w:color="000000" w:sz="4"/>
+              <w:bottom w:val="none" w:color="FFFFFF" w:sz="0"/>
               <w:right w:val="none" w:color="FFFFFF" w:sz="0"/>
             </w:tcBorders>
             <w:tcMar>
@@ -46552,7 +47024,7 @@
             <w:tcBorders>
               <w:top w:val="none" w:color="FFFFFF" w:sz="0"/>
               <w:left w:val="none" w:color="FFFFFF" w:sz="0"/>
-              <w:bottom w:val="single" w:color="000000" w:sz="4"/>
+              <w:bottom w:val="none" w:color="FFFFFF" w:sz="0"/>
               <w:right w:val="none" w:color="FFFFFF" w:sz="0"/>
             </w:tcBorders>
             <w:tcMar>
@@ -46586,7 +47058,7 @@
             <w:tcBorders>
               <w:top w:val="none" w:color="FFFFFF" w:sz="0"/>
               <w:left w:val="none" w:color="FFFFFF" w:sz="0"/>
-              <w:bottom w:val="single" w:color="000000" w:sz="4"/>
+              <w:bottom w:val="none" w:color="FFFFFF" w:sz="0"/>
               <w:right w:val="none" w:color="FFFFFF" w:sz="0"/>
             </w:tcBorders>
             <w:tcMar>
@@ -46611,6 +47083,546 @@
                 <w:szCs w:val="18"/>
               </w:rPr>
               <w:t xml:space="preserve">Máximo de páginas visitadas por fonte em cada recolha</w:t>
+            </w:r>
+          </w:p>
+        </w:tc>
+      </w:tr>
+      <w:tr>
+        <w:trPr>
+          <w:cantSplit/>
+          <w:tblHeader w:val="false"/>
+        </w:trPr>
+        <w:tc>
+          <w:tcPr>
+            <w:tcW w:type="dxa" w:w="2400"/>
+            <w:tcBorders>
+              <w:top w:val="none" w:color="FFFFFF" w:sz="0"/>
+              <w:left w:val="none" w:color="FFFFFF" w:sz="0"/>
+              <w:bottom w:val="none" w:color="FFFFFF" w:sz="0"/>
+              <w:right w:val="none" w:color="FFFFFF" w:sz="0"/>
+            </w:tcBorders>
+            <w:tcMar>
+              <w:top w:type="dxa" w:w="50"/>
+              <w:left w:type="dxa" w:w="80"/>
+              <w:bottom w:type="dxa" w:w="50"/>
+              <w:right w:type="dxa" w:w="80"/>
+            </w:tcMar>
+            <w:vAlign w:val="center"/>
+          </w:tcPr>
+          <w:p>
+            <w:pPr>
+              <w:spacing w:line="240"/>
+              <w:jc w:val="left"/>
+            </w:pPr>
+            <w:r>
+              <w:rPr>
+                <w:rFonts w:ascii="Times New Roman" w:cs="Times New Roman" w:eastAsia="Times New Roman" w:hAnsi="Times New Roman"/>
+                <w:b w:val="false"/>
+                <w:bCs w:val="false"/>
+                <w:sz w:val="18"/>
+                <w:szCs w:val="18"/>
+              </w:rPr>
+              <w:t xml:space="preserve">UAN_SMTP_SERVIDOR</w:t>
+            </w:r>
+          </w:p>
+        </w:tc>
+        <w:tc>
+          <w:tcPr>
+            <w:tcW w:type="dxa" w:w="1900"/>
+            <w:tcBorders>
+              <w:top w:val="none" w:color="FFFFFF" w:sz="0"/>
+              <w:left w:val="none" w:color="FFFFFF" w:sz="0"/>
+              <w:bottom w:val="none" w:color="FFFFFF" w:sz="0"/>
+              <w:right w:val="none" w:color="FFFFFF" w:sz="0"/>
+            </w:tcBorders>
+            <w:tcMar>
+              <w:top w:type="dxa" w:w="50"/>
+              <w:left w:type="dxa" w:w="80"/>
+              <w:bottom w:type="dxa" w:w="50"/>
+              <w:right w:type="dxa" w:w="80"/>
+            </w:tcMar>
+            <w:vAlign w:val="center"/>
+          </w:tcPr>
+          <w:p>
+            <w:pPr>
+              <w:spacing w:line="240"/>
+              <w:jc w:val="center"/>
+            </w:pPr>
+            <w:r>
+              <w:rPr>
+                <w:rFonts w:ascii="Times New Roman" w:cs="Times New Roman" w:eastAsia="Times New Roman" w:hAnsi="Times New Roman"/>
+                <w:b w:val="false"/>
+                <w:bCs w:val="false"/>
+                <w:sz w:val="18"/>
+                <w:szCs w:val="18"/>
+              </w:rPr>
+              <w:t xml:space="preserve">(vazio)</w:t>
+            </w:r>
+          </w:p>
+        </w:tc>
+        <w:tc>
+          <w:tcPr>
+            <w:tcW w:type="dxa" w:w="3920"/>
+            <w:tcBorders>
+              <w:top w:val="none" w:color="FFFFFF" w:sz="0"/>
+              <w:left w:val="none" w:color="FFFFFF" w:sz="0"/>
+              <w:bottom w:val="none" w:color="FFFFFF" w:sz="0"/>
+              <w:right w:val="none" w:color="FFFFFF" w:sz="0"/>
+            </w:tcBorders>
+            <w:tcMar>
+              <w:top w:type="dxa" w:w="50"/>
+              <w:left w:type="dxa" w:w="80"/>
+              <w:bottom w:type="dxa" w:w="50"/>
+              <w:right w:type="dxa" w:w="80"/>
+            </w:tcMar>
+            <w:vAlign w:val="center"/>
+          </w:tcPr>
+          <w:p>
+            <w:pPr>
+              <w:spacing w:line="240"/>
+              <w:jc w:val="left"/>
+            </w:pPr>
+            <w:r>
+              <w:rPr>
+                <w:rFonts w:ascii="Times New Roman" w:cs="Times New Roman" w:eastAsia="Times New Roman" w:hAnsi="Times New Roman"/>
+                <w:b w:val="false"/>
+                <w:bCs w:val="false"/>
+                <w:sz w:val="18"/>
+                <w:szCs w:val="18"/>
+              </w:rPr>
+              <w:t xml:space="preserve">Servidor de e-mail dos alertas; vazio deixa os alertas só na aplicação</w:t>
+            </w:r>
+          </w:p>
+        </w:tc>
+      </w:tr>
+      <w:tr>
+        <w:trPr>
+          <w:cantSplit/>
+          <w:tblHeader w:val="false"/>
+        </w:trPr>
+        <w:tc>
+          <w:tcPr>
+            <w:tcW w:type="dxa" w:w="2400"/>
+            <w:tcBorders>
+              <w:top w:val="none" w:color="FFFFFF" w:sz="0"/>
+              <w:left w:val="none" w:color="FFFFFF" w:sz="0"/>
+              <w:bottom w:val="none" w:color="FFFFFF" w:sz="0"/>
+              <w:right w:val="none" w:color="FFFFFF" w:sz="0"/>
+            </w:tcBorders>
+            <w:tcMar>
+              <w:top w:type="dxa" w:w="50"/>
+              <w:left w:type="dxa" w:w="80"/>
+              <w:bottom w:type="dxa" w:w="50"/>
+              <w:right w:type="dxa" w:w="80"/>
+            </w:tcMar>
+            <w:vAlign w:val="center"/>
+          </w:tcPr>
+          <w:p>
+            <w:pPr>
+              <w:spacing w:line="240"/>
+              <w:jc w:val="left"/>
+            </w:pPr>
+            <w:r>
+              <w:rPr>
+                <w:rFonts w:ascii="Times New Roman" w:cs="Times New Roman" w:eastAsia="Times New Roman" w:hAnsi="Times New Roman"/>
+                <w:b w:val="false"/>
+                <w:bCs w:val="false"/>
+                <w:sz w:val="18"/>
+                <w:szCs w:val="18"/>
+              </w:rPr>
+              <w:t xml:space="preserve">UAN_SMTP_PORTA</w:t>
+            </w:r>
+          </w:p>
+        </w:tc>
+        <w:tc>
+          <w:tcPr>
+            <w:tcW w:type="dxa" w:w="1900"/>
+            <w:tcBorders>
+              <w:top w:val="none" w:color="FFFFFF" w:sz="0"/>
+              <w:left w:val="none" w:color="FFFFFF" w:sz="0"/>
+              <w:bottom w:val="none" w:color="FFFFFF" w:sz="0"/>
+              <w:right w:val="none" w:color="FFFFFF" w:sz="0"/>
+            </w:tcBorders>
+            <w:tcMar>
+              <w:top w:type="dxa" w:w="50"/>
+              <w:left w:type="dxa" w:w="80"/>
+              <w:bottom w:type="dxa" w:w="50"/>
+              <w:right w:type="dxa" w:w="80"/>
+            </w:tcMar>
+            <w:vAlign w:val="center"/>
+          </w:tcPr>
+          <w:p>
+            <w:pPr>
+              <w:spacing w:line="240"/>
+              <w:jc w:val="center"/>
+            </w:pPr>
+            <w:r>
+              <w:rPr>
+                <w:rFonts w:ascii="Times New Roman" w:cs="Times New Roman" w:eastAsia="Times New Roman" w:hAnsi="Times New Roman"/>
+                <w:b w:val="false"/>
+                <w:bCs w:val="false"/>
+                <w:sz w:val="18"/>
+                <w:szCs w:val="18"/>
+              </w:rPr>
+              <w:t xml:space="preserve">587</w:t>
+            </w:r>
+          </w:p>
+        </w:tc>
+        <w:tc>
+          <w:tcPr>
+            <w:tcW w:type="dxa" w:w="3920"/>
+            <w:tcBorders>
+              <w:top w:val="none" w:color="FFFFFF" w:sz="0"/>
+              <w:left w:val="none" w:color="FFFFFF" w:sz="0"/>
+              <w:bottom w:val="none" w:color="FFFFFF" w:sz="0"/>
+              <w:right w:val="none" w:color="FFFFFF" w:sz="0"/>
+            </w:tcBorders>
+            <w:tcMar>
+              <w:top w:type="dxa" w:w="50"/>
+              <w:left w:type="dxa" w:w="80"/>
+              <w:bottom w:type="dxa" w:w="50"/>
+              <w:right w:type="dxa" w:w="80"/>
+            </w:tcMar>
+            <w:vAlign w:val="center"/>
+          </w:tcPr>
+          <w:p>
+            <w:pPr>
+              <w:spacing w:line="240"/>
+              <w:jc w:val="left"/>
+            </w:pPr>
+            <w:r>
+              <w:rPr>
+                <w:rFonts w:ascii="Times New Roman" w:cs="Times New Roman" w:eastAsia="Times New Roman" w:hAnsi="Times New Roman"/>
+                <w:b w:val="false"/>
+                <w:bCs w:val="false"/>
+                <w:sz w:val="18"/>
+                <w:szCs w:val="18"/>
+              </w:rPr>
+              <w:t xml:space="preserve">587 com STARTTLS ou 465 com SSL</w:t>
+            </w:r>
+          </w:p>
+        </w:tc>
+      </w:tr>
+      <w:tr>
+        <w:trPr>
+          <w:cantSplit/>
+          <w:tblHeader w:val="false"/>
+        </w:trPr>
+        <w:tc>
+          <w:tcPr>
+            <w:tcW w:type="dxa" w:w="2400"/>
+            <w:tcBorders>
+              <w:top w:val="none" w:color="FFFFFF" w:sz="0"/>
+              <w:left w:val="none" w:color="FFFFFF" w:sz="0"/>
+              <w:bottom w:val="none" w:color="FFFFFF" w:sz="0"/>
+              <w:right w:val="none" w:color="FFFFFF" w:sz="0"/>
+            </w:tcBorders>
+            <w:tcMar>
+              <w:top w:type="dxa" w:w="50"/>
+              <w:left w:type="dxa" w:w="80"/>
+              <w:bottom w:type="dxa" w:w="50"/>
+              <w:right w:type="dxa" w:w="80"/>
+            </w:tcMar>
+            <w:vAlign w:val="center"/>
+          </w:tcPr>
+          <w:p>
+            <w:pPr>
+              <w:spacing w:line="240"/>
+              <w:jc w:val="left"/>
+            </w:pPr>
+            <w:r>
+              <w:rPr>
+                <w:rFonts w:ascii="Times New Roman" w:cs="Times New Roman" w:eastAsia="Times New Roman" w:hAnsi="Times New Roman"/>
+                <w:b w:val="false"/>
+                <w:bCs w:val="false"/>
+                <w:sz w:val="18"/>
+                <w:szCs w:val="18"/>
+              </w:rPr>
+              <w:t xml:space="preserve">UAN_SMTP_UTILIZADOR, UAN_SMTP_SENHA</w:t>
+            </w:r>
+          </w:p>
+        </w:tc>
+        <w:tc>
+          <w:tcPr>
+            <w:tcW w:type="dxa" w:w="1900"/>
+            <w:tcBorders>
+              <w:top w:val="none" w:color="FFFFFF" w:sz="0"/>
+              <w:left w:val="none" w:color="FFFFFF" w:sz="0"/>
+              <w:bottom w:val="none" w:color="FFFFFF" w:sz="0"/>
+              <w:right w:val="none" w:color="FFFFFF" w:sz="0"/>
+            </w:tcBorders>
+            <w:tcMar>
+              <w:top w:type="dxa" w:w="50"/>
+              <w:left w:type="dxa" w:w="80"/>
+              <w:bottom w:type="dxa" w:w="50"/>
+              <w:right w:type="dxa" w:w="80"/>
+            </w:tcMar>
+            <w:vAlign w:val="center"/>
+          </w:tcPr>
+          <w:p>
+            <w:pPr>
+              <w:spacing w:line="240"/>
+              <w:jc w:val="center"/>
+            </w:pPr>
+            <w:r>
+              <w:rPr>
+                <w:rFonts w:ascii="Times New Roman" w:cs="Times New Roman" w:eastAsia="Times New Roman" w:hAnsi="Times New Roman"/>
+                <w:b w:val="false"/>
+                <w:bCs w:val="false"/>
+                <w:sz w:val="18"/>
+                <w:szCs w:val="18"/>
+              </w:rPr>
+              <w:t xml:space="preserve">(vazio)</w:t>
+            </w:r>
+          </w:p>
+        </w:tc>
+        <w:tc>
+          <w:tcPr>
+            <w:tcW w:type="dxa" w:w="3920"/>
+            <w:tcBorders>
+              <w:top w:val="none" w:color="FFFFFF" w:sz="0"/>
+              <w:left w:val="none" w:color="FFFFFF" w:sz="0"/>
+              <w:bottom w:val="none" w:color="FFFFFF" w:sz="0"/>
+              <w:right w:val="none" w:color="FFFFFF" w:sz="0"/>
+            </w:tcBorders>
+            <w:tcMar>
+              <w:top w:type="dxa" w:w="50"/>
+              <w:left w:type="dxa" w:w="80"/>
+              <w:bottom w:type="dxa" w:w="50"/>
+              <w:right w:type="dxa" w:w="80"/>
+            </w:tcMar>
+            <w:vAlign w:val="center"/>
+          </w:tcPr>
+          <w:p>
+            <w:pPr>
+              <w:spacing w:line="240"/>
+              <w:jc w:val="left"/>
+            </w:pPr>
+            <w:r>
+              <w:rPr>
+                <w:rFonts w:ascii="Times New Roman" w:cs="Times New Roman" w:eastAsia="Times New Roman" w:hAnsi="Times New Roman"/>
+                <w:b w:val="false"/>
+                <w:bCs w:val="false"/>
+                <w:sz w:val="18"/>
+                <w:szCs w:val="18"/>
+              </w:rPr>
+              <w:t xml:space="preserve">Conta de envio, quando o servidor exige autenticação</w:t>
+            </w:r>
+          </w:p>
+        </w:tc>
+      </w:tr>
+      <w:tr>
+        <w:trPr>
+          <w:cantSplit/>
+          <w:tblHeader w:val="false"/>
+        </w:trPr>
+        <w:tc>
+          <w:tcPr>
+            <w:tcW w:type="dxa" w:w="2400"/>
+            <w:tcBorders>
+              <w:top w:val="none" w:color="FFFFFF" w:sz="0"/>
+              <w:left w:val="none" w:color="FFFFFF" w:sz="0"/>
+              <w:bottom w:val="none" w:color="FFFFFF" w:sz="0"/>
+              <w:right w:val="none" w:color="FFFFFF" w:sz="0"/>
+            </w:tcBorders>
+            <w:tcMar>
+              <w:top w:type="dxa" w:w="50"/>
+              <w:left w:type="dxa" w:w="80"/>
+              <w:bottom w:type="dxa" w:w="50"/>
+              <w:right w:type="dxa" w:w="80"/>
+            </w:tcMar>
+            <w:vAlign w:val="center"/>
+          </w:tcPr>
+          <w:p>
+            <w:pPr>
+              <w:spacing w:line="240"/>
+              <w:jc w:val="left"/>
+            </w:pPr>
+            <w:r>
+              <w:rPr>
+                <w:rFonts w:ascii="Times New Roman" w:cs="Times New Roman" w:eastAsia="Times New Roman" w:hAnsi="Times New Roman"/>
+                <w:b w:val="false"/>
+                <w:bCs w:val="false"/>
+                <w:sz w:val="18"/>
+                <w:szCs w:val="18"/>
+              </w:rPr>
+              <w:t xml:space="preserve">UAN_SMTP_REMETENTE</w:t>
+            </w:r>
+          </w:p>
+        </w:tc>
+        <w:tc>
+          <w:tcPr>
+            <w:tcW w:type="dxa" w:w="1900"/>
+            <w:tcBorders>
+              <w:top w:val="none" w:color="FFFFFF" w:sz="0"/>
+              <w:left w:val="none" w:color="FFFFFF" w:sz="0"/>
+              <w:bottom w:val="none" w:color="FFFFFF" w:sz="0"/>
+              <w:right w:val="none" w:color="FFFFFF" w:sz="0"/>
+            </w:tcBorders>
+            <w:tcMar>
+              <w:top w:type="dxa" w:w="50"/>
+              <w:left w:type="dxa" w:w="80"/>
+              <w:bottom w:type="dxa" w:w="50"/>
+              <w:right w:type="dxa" w:w="80"/>
+            </w:tcMar>
+            <w:vAlign w:val="center"/>
+          </w:tcPr>
+          <w:p>
+            <w:pPr>
+              <w:spacing w:line="240"/>
+              <w:jc w:val="center"/>
+            </w:pPr>
+            <w:r>
+              <w:rPr>
+                <w:rFonts w:ascii="Times New Roman" w:cs="Times New Roman" w:eastAsia="Times New Roman" w:hAnsi="Times New Roman"/>
+                <w:b w:val="false"/>
+                <w:bCs w:val="false"/>
+                <w:sz w:val="18"/>
+                <w:szCs w:val="18"/>
+              </w:rPr>
+              <w:t xml:space="preserve">(vazio)</w:t>
+            </w:r>
+          </w:p>
+        </w:tc>
+        <w:tc>
+          <w:tcPr>
+            <w:tcW w:type="dxa" w:w="3920"/>
+            <w:tcBorders>
+              <w:top w:val="none" w:color="FFFFFF" w:sz="0"/>
+              <w:left w:val="none" w:color="FFFFFF" w:sz="0"/>
+              <w:bottom w:val="none" w:color="FFFFFF" w:sz="0"/>
+              <w:right w:val="none" w:color="FFFFFF" w:sz="0"/>
+            </w:tcBorders>
+            <w:tcMar>
+              <w:top w:type="dxa" w:w="50"/>
+              <w:left w:type="dxa" w:w="80"/>
+              <w:bottom w:type="dxa" w:w="50"/>
+              <w:right w:type="dxa" w:w="80"/>
+            </w:tcMar>
+            <w:vAlign w:val="center"/>
+          </w:tcPr>
+          <w:p>
+            <w:pPr>
+              <w:spacing w:line="240"/>
+              <w:jc w:val="left"/>
+            </w:pPr>
+            <w:r>
+              <w:rPr>
+                <w:rFonts w:ascii="Times New Roman" w:cs="Times New Roman" w:eastAsia="Times New Roman" w:hAnsi="Times New Roman"/>
+                <w:b w:val="false"/>
+                <w:bCs w:val="false"/>
+                <w:sz w:val="18"/>
+                <w:szCs w:val="18"/>
+              </w:rPr>
+              <w:t xml:space="preserve">Endereço que aparece como remetente</w:t>
+            </w:r>
+          </w:p>
+        </w:tc>
+      </w:tr>
+      <w:tr>
+        <w:trPr>
+          <w:cantSplit/>
+          <w:tblHeader w:val="false"/>
+        </w:trPr>
+        <w:tc>
+          <w:tcPr>
+            <w:tcW w:type="dxa" w:w="2400"/>
+            <w:tcBorders>
+              <w:top w:val="none" w:color="FFFFFF" w:sz="0"/>
+              <w:left w:val="none" w:color="FFFFFF" w:sz="0"/>
+              <w:bottom w:val="single" w:color="000000" w:sz="4"/>
+              <w:right w:val="none" w:color="FFFFFF" w:sz="0"/>
+            </w:tcBorders>
+            <w:tcMar>
+              <w:top w:type="dxa" w:w="50"/>
+              <w:left w:type="dxa" w:w="80"/>
+              <w:bottom w:type="dxa" w:w="50"/>
+              <w:right w:type="dxa" w:w="80"/>
+            </w:tcMar>
+            <w:vAlign w:val="center"/>
+          </w:tcPr>
+          <w:p>
+            <w:pPr>
+              <w:spacing w:line="240"/>
+              <w:jc w:val="left"/>
+            </w:pPr>
+            <w:r>
+              <w:rPr>
+                <w:rFonts w:ascii="Times New Roman" w:cs="Times New Roman" w:eastAsia="Times New Roman" w:hAnsi="Times New Roman"/>
+                <w:b w:val="false"/>
+                <w:bCs w:val="false"/>
+                <w:sz w:val="18"/>
+                <w:szCs w:val="18"/>
+              </w:rPr>
+              <w:t xml:space="preserve">UAN_URL_BASE</w:t>
+            </w:r>
+          </w:p>
+        </w:tc>
+        <w:tc>
+          <w:tcPr>
+            <w:tcW w:type="dxa" w:w="1900"/>
+            <w:tcBorders>
+              <w:top w:val="none" w:color="FFFFFF" w:sz="0"/>
+              <w:left w:val="none" w:color="FFFFFF" w:sz="0"/>
+              <w:bottom w:val="single" w:color="000000" w:sz="4"/>
+              <w:right w:val="none" w:color="FFFFFF" w:sz="0"/>
+            </w:tcBorders>
+            <w:tcMar>
+              <w:top w:type="dxa" w:w="50"/>
+              <w:left w:type="dxa" w:w="80"/>
+              <w:bottom w:type="dxa" w:w="50"/>
+              <w:right w:type="dxa" w:w="80"/>
+            </w:tcMar>
+            <w:vAlign w:val="center"/>
+          </w:tcPr>
+          <w:p>
+            <w:pPr>
+              <w:spacing w:line="240"/>
+              <w:jc w:val="center"/>
+            </w:pPr>
+            <w:r>
+              <w:rPr>
+                <w:rFonts w:ascii="Times New Roman" w:cs="Times New Roman" w:eastAsia="Times New Roman" w:hAnsi="Times New Roman"/>
+                <w:b w:val="false"/>
+                <w:bCs w:val="false"/>
+                <w:sz w:val="18"/>
+                <w:szCs w:val="18"/>
+              </w:rPr>
+              <w:t xml:space="preserve">http://127.0.0.1:8000</w:t>
+            </w:r>
+          </w:p>
+        </w:tc>
+        <w:tc>
+          <w:tcPr>
+            <w:tcW w:type="dxa" w:w="3920"/>
+            <w:tcBorders>
+              <w:top w:val="none" w:color="FFFFFF" w:sz="0"/>
+              <w:left w:val="none" w:color="FFFFFF" w:sz="0"/>
+              <w:bottom w:val="single" w:color="000000" w:sz="4"/>
+              <w:right w:val="none" w:color="FFFFFF" w:sz="0"/>
+            </w:tcBorders>
+            <w:tcMar>
+              <w:top w:type="dxa" w:w="50"/>
+              <w:left w:type="dxa" w:w="80"/>
+              <w:bottom w:type="dxa" w:w="50"/>
+              <w:right w:type="dxa" w:w="80"/>
+            </w:tcMar>
+            <w:vAlign w:val="center"/>
+          </w:tcPr>
+          <w:p>
+            <w:pPr>
+              <w:spacing w:line="240"/>
+              <w:jc w:val="left"/>
+            </w:pPr>
+            <w:r>
+              <w:rPr>
+                <w:rFonts w:ascii="Times New Roman" w:cs="Times New Roman" w:eastAsia="Times New Roman" w:hAnsi="Times New Roman"/>
+                <w:b w:val="false"/>
+                <w:bCs w:val="false"/>
+                <w:sz w:val="18"/>
+                <w:szCs w:val="18"/>
+              </w:rPr>
+              <w:t xml:space="preserve">Endereço do sistema, usado nas ligações dos e-mails</w:t>
             </w:r>
           </w:p>
         </w:tc>
@@ -47284,7 +48296,7 @@
                 <w:sz w:val="18"/>
                 <w:szCs w:val="18"/>
               </w:rPr>
-              <w:t xml:space="preserve">Lotes</w:t>
+              <w:t xml:space="preserve">Alertas</w:t>
             </w:r>
           </w:p>
         </w:tc>
@@ -47318,7 +48330,7 @@
                 <w:sz w:val="18"/>
                 <w:szCs w:val="18"/>
               </w:rPr>
-              <w:t xml:space="preserve">Todos (importar: supervisor)</w:t>
+              <w:t xml:space="preserve">Todos</w:t>
             </w:r>
           </w:p>
         </w:tc>
@@ -47352,7 +48364,7 @@
                 <w:sz w:val="18"/>
                 <w:szCs w:val="18"/>
               </w:rPr>
-              <w:t xml:space="preserve">Importação, proveniência e classificação de pendentes</w:t>
+              <w:t xml:space="preserve">Ameaças confirmadas e tendências, com contador de alertas por ver</w:t>
             </w:r>
           </w:p>
         </w:tc>
@@ -47392,7 +48404,7 @@
                 <w:sz w:val="18"/>
                 <w:szCs w:val="18"/>
               </w:rPr>
-              <w:t xml:space="preserve">Métricas</w:t>
+              <w:t xml:space="preserve">Mapa</w:t>
             </w:r>
           </w:p>
         </w:tc>
@@ -47426,7 +48438,7 @@
                 <w:sz w:val="18"/>
                 <w:szCs w:val="18"/>
               </w:rPr>
-              <w:t xml:space="preserve">Supervisor</w:t>
+              <w:t xml:space="preserve">Todos</w:t>
             </w:r>
           </w:p>
         </w:tc>
@@ -47460,7 +48472,7 @@
                 <w:sz w:val="18"/>
                 <w:szCs w:val="18"/>
               </w:rPr>
-              <w:t xml:space="preserve">Precisão@K, κ analista–sistema e entre analistas, sensibilidade, latência; exportações</w:t>
+              <w:t xml:space="preserve">Taxa de ameaças por província e variação face ao período anterior, no período escolhido</w:t>
             </w:r>
           </w:p>
         </w:tc>
@@ -47500,7 +48512,7 @@
                 <w:sz w:val="18"/>
                 <w:szCs w:val="18"/>
               </w:rPr>
-              <w:t xml:space="preserve">Utilizadores</w:t>
+              <w:t xml:space="preserve">Relatório</w:t>
             </w:r>
           </w:p>
         </w:tc>
@@ -47534,7 +48546,7 @@
                 <w:sz w:val="18"/>
                 <w:szCs w:val="18"/>
               </w:rPr>
-              <w:t xml:space="preserve">Supervisor</w:t>
+              <w:t xml:space="preserve">Todos (enviar: supervisor)</w:t>
             </w:r>
           </w:p>
         </w:tc>
@@ -47568,7 +48580,7 @@
                 <w:sz w:val="18"/>
                 <w:szCs w:val="18"/>
               </w:rPr>
-              <w:t xml:space="preserve">Criação, desactivação e redefinição de palavra-passe</w:t>
+              <w:t xml:space="preserve">Relatório de alertas de ameaças: imprimir, PDF, CSV e e-mail</w:t>
             </w:r>
           </w:p>
         </w:tc>
@@ -47608,7 +48620,7 @@
                 <w:sz w:val="18"/>
                 <w:szCs w:val="18"/>
               </w:rPr>
-              <w:t xml:space="preserve">Auditoria</w:t>
+              <w:t xml:space="preserve">Lotes</w:t>
             </w:r>
           </w:p>
         </w:tc>
@@ -47642,7 +48654,7 @@
                 <w:sz w:val="18"/>
                 <w:szCs w:val="18"/>
               </w:rPr>
-              <w:t xml:space="preserve">Supervisor</w:t>
+              <w:t xml:space="preserve">Todos (importar: supervisor)</w:t>
             </w:r>
           </w:p>
         </w:tc>
@@ -47676,7 +48688,7 @@
                 <w:sz w:val="18"/>
                 <w:szCs w:val="18"/>
               </w:rPr>
-              <w:t xml:space="preserve">Registo de todas as acções relevantes</w:t>
+              <w:t xml:space="preserve">Importação, proveniência e classificação de pendentes</w:t>
             </w:r>
           </w:p>
         </w:tc>
@@ -47692,7 +48704,7 @@
             <w:tcBorders>
               <w:top w:val="none" w:color="FFFFFF" w:sz="0"/>
               <w:left w:val="none" w:color="FFFFFF" w:sz="0"/>
-              <w:bottom w:val="single" w:color="000000" w:sz="4"/>
+              <w:bottom w:val="none" w:color="FFFFFF" w:sz="0"/>
               <w:right w:val="none" w:color="FFFFFF" w:sz="0"/>
             </w:tcBorders>
             <w:tcMar>
@@ -47716,7 +48728,7 @@
                 <w:sz w:val="18"/>
                 <w:szCs w:val="18"/>
               </w:rPr>
-              <w:t xml:space="preserve">Definições</w:t>
+              <w:t xml:space="preserve">Métricas</w:t>
             </w:r>
           </w:p>
         </w:tc>
@@ -47726,7 +48738,7 @@
             <w:tcBorders>
               <w:top w:val="none" w:color="FFFFFF" w:sz="0"/>
               <w:left w:val="none" w:color="FFFFFF" w:sz="0"/>
-              <w:bottom w:val="single" w:color="000000" w:sz="4"/>
+              <w:bottom w:val="none" w:color="FFFFFF" w:sz="0"/>
               <w:right w:val="none" w:color="FFFFFF" w:sz="0"/>
             </w:tcBorders>
             <w:tcMar>
@@ -47760,7 +48772,7 @@
             <w:tcBorders>
               <w:top w:val="none" w:color="FFFFFF" w:sz="0"/>
               <w:left w:val="none" w:color="FFFFFF" w:sz="0"/>
-              <w:bottom w:val="single" w:color="000000" w:sz="4"/>
+              <w:bottom w:val="none" w:color="FFFFFF" w:sz="0"/>
               <w:right w:val="none" w:color="FFFFFF" w:sz="0"/>
             </w:tcBorders>
             <w:tcMar>
@@ -47784,7 +48796,331 @@
                 <w:sz w:val="18"/>
                 <w:szCs w:val="18"/>
               </w:rPr>
-              <w:t xml:space="preserve">Revisão cega, limpeza de conservação e cópias de segurança</w:t>
+              <w:t xml:space="preserve">Precisão@K, κ analista–sistema e entre analistas, sensibilidade, latência; exportações</w:t>
+            </w:r>
+          </w:p>
+        </w:tc>
+      </w:tr>
+      <w:tr>
+        <w:trPr>
+          <w:cantSplit/>
+          <w:tblHeader w:val="false"/>
+        </w:trPr>
+        <w:tc>
+          <w:tcPr>
+            <w:tcW w:type="dxa" w:w="2000"/>
+            <w:tcBorders>
+              <w:top w:val="none" w:color="FFFFFF" w:sz="0"/>
+              <w:left w:val="none" w:color="FFFFFF" w:sz="0"/>
+              <w:bottom w:val="none" w:color="FFFFFF" w:sz="0"/>
+              <w:right w:val="none" w:color="FFFFFF" w:sz="0"/>
+            </w:tcBorders>
+            <w:tcMar>
+              <w:top w:type="dxa" w:w="50"/>
+              <w:left w:type="dxa" w:w="80"/>
+              <w:bottom w:type="dxa" w:w="50"/>
+              <w:right w:type="dxa" w:w="80"/>
+            </w:tcMar>
+            <w:vAlign w:val="center"/>
+          </w:tcPr>
+          <w:p>
+            <w:pPr>
+              <w:spacing w:line="240"/>
+              <w:jc w:val="left"/>
+            </w:pPr>
+            <w:r>
+              <w:rPr>
+                <w:rFonts w:ascii="Times New Roman" w:cs="Times New Roman" w:eastAsia="Times New Roman" w:hAnsi="Times New Roman"/>
+                <w:b w:val="false"/>
+                <w:bCs w:val="false"/>
+                <w:sz w:val="18"/>
+                <w:szCs w:val="18"/>
+              </w:rPr>
+              <w:t xml:space="preserve">Utilizadores</w:t>
+            </w:r>
+          </w:p>
+        </w:tc>
+        <w:tc>
+          <w:tcPr>
+            <w:tcW w:type="dxa" w:w="2100"/>
+            <w:tcBorders>
+              <w:top w:val="none" w:color="FFFFFF" w:sz="0"/>
+              <w:left w:val="none" w:color="FFFFFF" w:sz="0"/>
+              <w:bottom w:val="none" w:color="FFFFFF" w:sz="0"/>
+              <w:right w:val="none" w:color="FFFFFF" w:sz="0"/>
+            </w:tcBorders>
+            <w:tcMar>
+              <w:top w:type="dxa" w:w="50"/>
+              <w:left w:type="dxa" w:w="80"/>
+              <w:bottom w:type="dxa" w:w="50"/>
+              <w:right w:type="dxa" w:w="80"/>
+            </w:tcMar>
+            <w:vAlign w:val="center"/>
+          </w:tcPr>
+          <w:p>
+            <w:pPr>
+              <w:spacing w:line="240"/>
+              <w:jc w:val="left"/>
+            </w:pPr>
+            <w:r>
+              <w:rPr>
+                <w:rFonts w:ascii="Times New Roman" w:cs="Times New Roman" w:eastAsia="Times New Roman" w:hAnsi="Times New Roman"/>
+                <w:b w:val="false"/>
+                <w:bCs w:val="false"/>
+                <w:sz w:val="18"/>
+                <w:szCs w:val="18"/>
+              </w:rPr>
+              <w:t xml:space="preserve">Supervisor</w:t>
+            </w:r>
+          </w:p>
+        </w:tc>
+        <w:tc>
+          <w:tcPr>
+            <w:tcW w:type="dxa" w:w="4120"/>
+            <w:tcBorders>
+              <w:top w:val="none" w:color="FFFFFF" w:sz="0"/>
+              <w:left w:val="none" w:color="FFFFFF" w:sz="0"/>
+              <w:bottom w:val="none" w:color="FFFFFF" w:sz="0"/>
+              <w:right w:val="none" w:color="FFFFFF" w:sz="0"/>
+            </w:tcBorders>
+            <w:tcMar>
+              <w:top w:type="dxa" w:w="50"/>
+              <w:left w:type="dxa" w:w="80"/>
+              <w:bottom w:type="dxa" w:w="50"/>
+              <w:right w:type="dxa" w:w="80"/>
+            </w:tcMar>
+            <w:vAlign w:val="center"/>
+          </w:tcPr>
+          <w:p>
+            <w:pPr>
+              <w:spacing w:line="240"/>
+              <w:jc w:val="left"/>
+            </w:pPr>
+            <w:r>
+              <w:rPr>
+                <w:rFonts w:ascii="Times New Roman" w:cs="Times New Roman" w:eastAsia="Times New Roman" w:hAnsi="Times New Roman"/>
+                <w:b w:val="false"/>
+                <w:bCs w:val="false"/>
+                <w:sz w:val="18"/>
+                <w:szCs w:val="18"/>
+              </w:rPr>
+              <w:t xml:space="preserve">Criação, desactivação e redefinição de palavra-passe</w:t>
+            </w:r>
+          </w:p>
+        </w:tc>
+      </w:tr>
+      <w:tr>
+        <w:trPr>
+          <w:cantSplit/>
+          <w:tblHeader w:val="false"/>
+        </w:trPr>
+        <w:tc>
+          <w:tcPr>
+            <w:tcW w:type="dxa" w:w="2000"/>
+            <w:tcBorders>
+              <w:top w:val="none" w:color="FFFFFF" w:sz="0"/>
+              <w:left w:val="none" w:color="FFFFFF" w:sz="0"/>
+              <w:bottom w:val="none" w:color="FFFFFF" w:sz="0"/>
+              <w:right w:val="none" w:color="FFFFFF" w:sz="0"/>
+            </w:tcBorders>
+            <w:tcMar>
+              <w:top w:type="dxa" w:w="50"/>
+              <w:left w:type="dxa" w:w="80"/>
+              <w:bottom w:type="dxa" w:w="50"/>
+              <w:right w:type="dxa" w:w="80"/>
+            </w:tcMar>
+            <w:vAlign w:val="center"/>
+          </w:tcPr>
+          <w:p>
+            <w:pPr>
+              <w:spacing w:line="240"/>
+              <w:jc w:val="left"/>
+            </w:pPr>
+            <w:r>
+              <w:rPr>
+                <w:rFonts w:ascii="Times New Roman" w:cs="Times New Roman" w:eastAsia="Times New Roman" w:hAnsi="Times New Roman"/>
+                <w:b w:val="false"/>
+                <w:bCs w:val="false"/>
+                <w:sz w:val="18"/>
+                <w:szCs w:val="18"/>
+              </w:rPr>
+              <w:t xml:space="preserve">Auditoria</w:t>
+            </w:r>
+          </w:p>
+        </w:tc>
+        <w:tc>
+          <w:tcPr>
+            <w:tcW w:type="dxa" w:w="2100"/>
+            <w:tcBorders>
+              <w:top w:val="none" w:color="FFFFFF" w:sz="0"/>
+              <w:left w:val="none" w:color="FFFFFF" w:sz="0"/>
+              <w:bottom w:val="none" w:color="FFFFFF" w:sz="0"/>
+              <w:right w:val="none" w:color="FFFFFF" w:sz="0"/>
+            </w:tcBorders>
+            <w:tcMar>
+              <w:top w:type="dxa" w:w="50"/>
+              <w:left w:type="dxa" w:w="80"/>
+              <w:bottom w:type="dxa" w:w="50"/>
+              <w:right w:type="dxa" w:w="80"/>
+            </w:tcMar>
+            <w:vAlign w:val="center"/>
+          </w:tcPr>
+          <w:p>
+            <w:pPr>
+              <w:spacing w:line="240"/>
+              <w:jc w:val="left"/>
+            </w:pPr>
+            <w:r>
+              <w:rPr>
+                <w:rFonts w:ascii="Times New Roman" w:cs="Times New Roman" w:eastAsia="Times New Roman" w:hAnsi="Times New Roman"/>
+                <w:b w:val="false"/>
+                <w:bCs w:val="false"/>
+                <w:sz w:val="18"/>
+                <w:szCs w:val="18"/>
+              </w:rPr>
+              <w:t xml:space="preserve">Supervisor</w:t>
+            </w:r>
+          </w:p>
+        </w:tc>
+        <w:tc>
+          <w:tcPr>
+            <w:tcW w:type="dxa" w:w="4120"/>
+            <w:tcBorders>
+              <w:top w:val="none" w:color="FFFFFF" w:sz="0"/>
+              <w:left w:val="none" w:color="FFFFFF" w:sz="0"/>
+              <w:bottom w:val="none" w:color="FFFFFF" w:sz="0"/>
+              <w:right w:val="none" w:color="FFFFFF" w:sz="0"/>
+            </w:tcBorders>
+            <w:tcMar>
+              <w:top w:type="dxa" w:w="50"/>
+              <w:left w:type="dxa" w:w="80"/>
+              <w:bottom w:type="dxa" w:w="50"/>
+              <w:right w:type="dxa" w:w="80"/>
+            </w:tcMar>
+            <w:vAlign w:val="center"/>
+          </w:tcPr>
+          <w:p>
+            <w:pPr>
+              <w:spacing w:line="240"/>
+              <w:jc w:val="left"/>
+            </w:pPr>
+            <w:r>
+              <w:rPr>
+                <w:rFonts w:ascii="Times New Roman" w:cs="Times New Roman" w:eastAsia="Times New Roman" w:hAnsi="Times New Roman"/>
+                <w:b w:val="false"/>
+                <w:bCs w:val="false"/>
+                <w:sz w:val="18"/>
+                <w:szCs w:val="18"/>
+              </w:rPr>
+              <w:t xml:space="preserve">Registo de todas as acções relevantes</w:t>
+            </w:r>
+          </w:p>
+        </w:tc>
+      </w:tr>
+      <w:tr>
+        <w:trPr>
+          <w:cantSplit/>
+          <w:tblHeader w:val="false"/>
+        </w:trPr>
+        <w:tc>
+          <w:tcPr>
+            <w:tcW w:type="dxa" w:w="2000"/>
+            <w:tcBorders>
+              <w:top w:val="none" w:color="FFFFFF" w:sz="0"/>
+              <w:left w:val="none" w:color="FFFFFF" w:sz="0"/>
+              <w:bottom w:val="single" w:color="000000" w:sz="4"/>
+              <w:right w:val="none" w:color="FFFFFF" w:sz="0"/>
+            </w:tcBorders>
+            <w:tcMar>
+              <w:top w:type="dxa" w:w="50"/>
+              <w:left w:type="dxa" w:w="80"/>
+              <w:bottom w:type="dxa" w:w="50"/>
+              <w:right w:type="dxa" w:w="80"/>
+            </w:tcMar>
+            <w:vAlign w:val="center"/>
+          </w:tcPr>
+          <w:p>
+            <w:pPr>
+              <w:spacing w:line="240"/>
+              <w:jc w:val="left"/>
+            </w:pPr>
+            <w:r>
+              <w:rPr>
+                <w:rFonts w:ascii="Times New Roman" w:cs="Times New Roman" w:eastAsia="Times New Roman" w:hAnsi="Times New Roman"/>
+                <w:b w:val="false"/>
+                <w:bCs w:val="false"/>
+                <w:sz w:val="18"/>
+                <w:szCs w:val="18"/>
+              </w:rPr>
+              <w:t xml:space="preserve">Definições</w:t>
+            </w:r>
+          </w:p>
+        </w:tc>
+        <w:tc>
+          <w:tcPr>
+            <w:tcW w:type="dxa" w:w="2100"/>
+            <w:tcBorders>
+              <w:top w:val="none" w:color="FFFFFF" w:sz="0"/>
+              <w:left w:val="none" w:color="FFFFFF" w:sz="0"/>
+              <w:bottom w:val="single" w:color="000000" w:sz="4"/>
+              <w:right w:val="none" w:color="FFFFFF" w:sz="0"/>
+            </w:tcBorders>
+            <w:tcMar>
+              <w:top w:type="dxa" w:w="50"/>
+              <w:left w:type="dxa" w:w="80"/>
+              <w:bottom w:type="dxa" w:w="50"/>
+              <w:right w:type="dxa" w:w="80"/>
+            </w:tcMar>
+            <w:vAlign w:val="center"/>
+          </w:tcPr>
+          <w:p>
+            <w:pPr>
+              <w:spacing w:line="240"/>
+              <w:jc w:val="left"/>
+            </w:pPr>
+            <w:r>
+              <w:rPr>
+                <w:rFonts w:ascii="Times New Roman" w:cs="Times New Roman" w:eastAsia="Times New Roman" w:hAnsi="Times New Roman"/>
+                <w:b w:val="false"/>
+                <w:bCs w:val="false"/>
+                <w:sz w:val="18"/>
+                <w:szCs w:val="18"/>
+              </w:rPr>
+              <w:t xml:space="preserve">Supervisor</w:t>
+            </w:r>
+          </w:p>
+        </w:tc>
+        <w:tc>
+          <w:tcPr>
+            <w:tcW w:type="dxa" w:w="4120"/>
+            <w:tcBorders>
+              <w:top w:val="none" w:color="FFFFFF" w:sz="0"/>
+              <w:left w:val="none" w:color="FFFFFF" w:sz="0"/>
+              <w:bottom w:val="single" w:color="000000" w:sz="4"/>
+              <w:right w:val="none" w:color="FFFFFF" w:sz="0"/>
+            </w:tcBorders>
+            <w:tcMar>
+              <w:top w:type="dxa" w:w="50"/>
+              <w:left w:type="dxa" w:w="80"/>
+              <w:bottom w:type="dxa" w:w="50"/>
+              <w:right w:type="dxa" w:w="80"/>
+            </w:tcMar>
+            <w:vAlign w:val="center"/>
+          </w:tcPr>
+          <w:p>
+            <w:pPr>
+              <w:spacing w:line="240"/>
+              <w:jc w:val="left"/>
+            </w:pPr>
+            <w:r>
+              <w:rPr>
+                <w:rFonts w:ascii="Times New Roman" w:cs="Times New Roman" w:eastAsia="Times New Roman" w:hAnsi="Times New Roman"/>
+                <w:b w:val="false"/>
+                <w:bCs w:val="false"/>
+                <w:sz w:val="18"/>
+                <w:szCs w:val="18"/>
+              </w:rPr>
+              <w:t xml:space="preserve">Revisão cega, regras e destinatários dos alertas, limpeza de conservação e cópias de segurança</w:t>
             </w:r>
           </w:p>
         </w:tc>
@@ -47844,7 +49180,40 @@
           <w:sz w:val="26"/>
           <w:szCs w:val="26"/>
         </w:rPr>
-        <w:t xml:space="preserve">F.5 Linha de comandos</w:t>
+        <w:t xml:space="preserve">F.5 Alertas, mapa e relatório</w:t>
+      </w:r>
+    </w:p>
+    <w:p>
+      <w:pPr>
+        <w:spacing w:after="120" w:before="0" w:line="360"/>
+        <w:ind w:firstLine="567"/>
+        <w:jc w:val="both"/>
+      </w:pPr>
+      <w:r>
+        <w:rPr>
+          <w:rFonts w:ascii="Times New Roman" w:cs="Times New Roman" w:eastAsia="Times New Roman" w:hAnsi="Times New Roman"/>
+          <w:sz w:val="24"/>
+          <w:szCs w:val="24"/>
+        </w:rPr>
+        <w:t xml:space="preserve">Para os alertas por e-mail, definem-se no uan.env o servidor de envio (UAN_SMTP_SERVIDOR) e o remetente (UAN_SMTP_REMETENTE) e, na página Definições, os destinatários. Na mesma página o supervisor ajusta o número de analistas que confirmam uma ameaça, a janela e o mínimo de casos da tendência e o crescimento mínimo, e pode enviar um e-mail de teste. Sem servidor configurado, os alertas ficam apenas na aplicação. A página Mapa e a página Relatório aceitam um período escolhido pelo utilizador (datas ou 7, 30 e 90 dias). O relatório pode ser impresso ou guardado em PDF a partir do navegador, descarregado em CSV ou, pelo supervisor, enviado por e-mail. Para um relatório periódico, agenda-se python uan.py relatorio --dias 7 --email no Agendador de Tarefas do Windows.</w:t>
+      </w:r>
+    </w:p>
+    <w:p>
+      <w:pPr>
+        <w:pStyle w:val="Heading2"/>
+        <w:keepNext/>
+        <w:keepLines/>
+        <w:spacing w:after="160" w:before="360" w:line="300"/>
+      </w:pPr>
+      <w:r>
+        <w:rPr>
+          <w:rFonts w:ascii="Times New Roman" w:cs="Times New Roman" w:eastAsia="Times New Roman" w:hAnsi="Times New Roman"/>
+          <w:b/>
+          <w:bCs/>
+          <w:sz w:val="26"/>
+          <w:szCs w:val="26"/>
+        </w:rPr>
+        <w:t xml:space="preserve">F.6 Linha de comandos</w:t>
       </w:r>
     </w:p>
     <w:p>
@@ -48511,7 +49880,7 @@
                 <w:sz w:val="17"/>
                 <w:szCs w:val="17"/>
               </w:rPr>
-              <w:t xml:space="preserve">python uan.py metricas</w:t>
+              <w:t xml:space="preserve">python uan.py alertas</w:t>
             </w:r>
           </w:p>
         </w:tc>
@@ -48545,7 +49914,7 @@
                 <w:sz w:val="17"/>
                 <w:szCs w:val="17"/>
               </w:rPr>
-              <w:t xml:space="preserve">Calcula as métricas operacionais</w:t>
+              <w:t xml:space="preserve">Verifica tendências, envia os alertas por e-mail e lista os mais recentes</w:t>
             </w:r>
           </w:p>
         </w:tc>
@@ -48585,7 +49954,7 @@
                 <w:sz w:val="17"/>
                 <w:szCs w:val="17"/>
               </w:rPr>
-              <w:t xml:space="preserve">python uan.py exportar revisoes.csv</w:t>
+              <w:t xml:space="preserve">python uan.py relatorio --dias 30 --csv relatorio.csv --email</w:t>
             </w:r>
           </w:p>
         </w:tc>
@@ -48619,7 +49988,7 @@
                 <w:sz w:val="17"/>
                 <w:szCs w:val="17"/>
               </w:rPr>
-              <w:t xml:space="preserve">Exporta as revisões para novo treino</w:t>
+              <w:t xml:space="preserve">Gera o relatório de alertas do período; grava em CSV e envia o resumo</w:t>
             </w:r>
           </w:p>
         </w:tc>
@@ -48659,7 +50028,7 @@
                 <w:sz w:val="17"/>
                 <w:szCs w:val="17"/>
               </w:rPr>
-              <w:t xml:space="preserve">python uan.py limpar --dias 180</w:t>
+              <w:t xml:space="preserve">python uan.py metricas</w:t>
             </w:r>
           </w:p>
         </w:tc>
@@ -48693,7 +50062,7 @@
                 <w:sz w:val="17"/>
                 <w:szCs w:val="17"/>
               </w:rPr>
-              <w:t xml:space="preserve">Aplica o prazo de conservação</w:t>
+              <w:t xml:space="preserve">Calcula as métricas operacionais</w:t>
             </w:r>
           </w:p>
         </w:tc>
@@ -48733,7 +50102,7 @@
                 <w:sz w:val="17"/>
                 <w:szCs w:val="17"/>
               </w:rPr>
-              <w:t xml:space="preserve">python uan.py copia</w:t>
+              <w:t xml:space="preserve">python uan.py exportar revisoes.csv</w:t>
             </w:r>
           </w:p>
         </w:tc>
@@ -48767,7 +50136,7 @@
                 <w:sz w:val="17"/>
                 <w:szCs w:val="17"/>
               </w:rPr>
-              <w:t xml:space="preserve">Cria uma cópia de segurança da base de dados</w:t>
+              <w:t xml:space="preserve">Exporta as revisões para novo treino</w:t>
             </w:r>
           </w:p>
         </w:tc>
@@ -48783,6 +50152,154 @@
             <w:tcBorders>
               <w:top w:val="none" w:color="FFFFFF" w:sz="0"/>
               <w:left w:val="none" w:color="FFFFFF" w:sz="0"/>
+              <w:bottom w:val="none" w:color="FFFFFF" w:sz="0"/>
+              <w:right w:val="none" w:color="FFFFFF" w:sz="0"/>
+            </w:tcBorders>
+            <w:tcMar>
+              <w:top w:type="dxa" w:w="50"/>
+              <w:left w:type="dxa" w:w="80"/>
+              <w:bottom w:type="dxa" w:w="50"/>
+              <w:right w:type="dxa" w:w="80"/>
+            </w:tcMar>
+            <w:vAlign w:val="center"/>
+          </w:tcPr>
+          <w:p>
+            <w:pPr>
+              <w:spacing w:line="240"/>
+              <w:jc w:val="left"/>
+            </w:pPr>
+            <w:r>
+              <w:rPr>
+                <w:rFonts w:ascii="Times New Roman" w:cs="Times New Roman" w:eastAsia="Times New Roman" w:hAnsi="Times New Roman"/>
+                <w:b w:val="false"/>
+                <w:bCs w:val="false"/>
+                <w:sz w:val="17"/>
+                <w:szCs w:val="17"/>
+              </w:rPr>
+              <w:t xml:space="preserve">python uan.py limpar --dias 180</w:t>
+            </w:r>
+          </w:p>
+        </w:tc>
+        <w:tc>
+          <w:tcPr>
+            <w:tcW w:type="dxa" w:w="3620"/>
+            <w:tcBorders>
+              <w:top w:val="none" w:color="FFFFFF" w:sz="0"/>
+              <w:left w:val="none" w:color="FFFFFF" w:sz="0"/>
+              <w:bottom w:val="none" w:color="FFFFFF" w:sz="0"/>
+              <w:right w:val="none" w:color="FFFFFF" w:sz="0"/>
+            </w:tcBorders>
+            <w:tcMar>
+              <w:top w:type="dxa" w:w="50"/>
+              <w:left w:type="dxa" w:w="80"/>
+              <w:bottom w:type="dxa" w:w="50"/>
+              <w:right w:type="dxa" w:w="80"/>
+            </w:tcMar>
+            <w:vAlign w:val="center"/>
+          </w:tcPr>
+          <w:p>
+            <w:pPr>
+              <w:spacing w:line="240"/>
+              <w:jc w:val="left"/>
+            </w:pPr>
+            <w:r>
+              <w:rPr>
+                <w:rFonts w:ascii="Times New Roman" w:cs="Times New Roman" w:eastAsia="Times New Roman" w:hAnsi="Times New Roman"/>
+                <w:b w:val="false"/>
+                <w:bCs w:val="false"/>
+                <w:sz w:val="17"/>
+                <w:szCs w:val="17"/>
+              </w:rPr>
+              <w:t xml:space="preserve">Aplica o prazo de conservação</w:t>
+            </w:r>
+          </w:p>
+        </w:tc>
+      </w:tr>
+      <w:tr>
+        <w:trPr>
+          <w:cantSplit/>
+          <w:tblHeader w:val="false"/>
+        </w:trPr>
+        <w:tc>
+          <w:tcPr>
+            <w:tcW w:type="dxa" w:w="4600"/>
+            <w:tcBorders>
+              <w:top w:val="none" w:color="FFFFFF" w:sz="0"/>
+              <w:left w:val="none" w:color="FFFFFF" w:sz="0"/>
+              <w:bottom w:val="none" w:color="FFFFFF" w:sz="0"/>
+              <w:right w:val="none" w:color="FFFFFF" w:sz="0"/>
+            </w:tcBorders>
+            <w:tcMar>
+              <w:top w:type="dxa" w:w="50"/>
+              <w:left w:type="dxa" w:w="80"/>
+              <w:bottom w:type="dxa" w:w="50"/>
+              <w:right w:type="dxa" w:w="80"/>
+            </w:tcMar>
+            <w:vAlign w:val="center"/>
+          </w:tcPr>
+          <w:p>
+            <w:pPr>
+              <w:spacing w:line="240"/>
+              <w:jc w:val="left"/>
+            </w:pPr>
+            <w:r>
+              <w:rPr>
+                <w:rFonts w:ascii="Times New Roman" w:cs="Times New Roman" w:eastAsia="Times New Roman" w:hAnsi="Times New Roman"/>
+                <w:b w:val="false"/>
+                <w:bCs w:val="false"/>
+                <w:sz w:val="17"/>
+                <w:szCs w:val="17"/>
+              </w:rPr>
+              <w:t xml:space="preserve">python uan.py copia</w:t>
+            </w:r>
+          </w:p>
+        </w:tc>
+        <w:tc>
+          <w:tcPr>
+            <w:tcW w:type="dxa" w:w="3620"/>
+            <w:tcBorders>
+              <w:top w:val="none" w:color="FFFFFF" w:sz="0"/>
+              <w:left w:val="none" w:color="FFFFFF" w:sz="0"/>
+              <w:bottom w:val="none" w:color="FFFFFF" w:sz="0"/>
+              <w:right w:val="none" w:color="FFFFFF" w:sz="0"/>
+            </w:tcBorders>
+            <w:tcMar>
+              <w:top w:type="dxa" w:w="50"/>
+              <w:left w:type="dxa" w:w="80"/>
+              <w:bottom w:type="dxa" w:w="50"/>
+              <w:right w:type="dxa" w:w="80"/>
+            </w:tcMar>
+            <w:vAlign w:val="center"/>
+          </w:tcPr>
+          <w:p>
+            <w:pPr>
+              <w:spacing w:line="240"/>
+              <w:jc w:val="left"/>
+            </w:pPr>
+            <w:r>
+              <w:rPr>
+                <w:rFonts w:ascii="Times New Roman" w:cs="Times New Roman" w:eastAsia="Times New Roman" w:hAnsi="Times New Roman"/>
+                <w:b w:val="false"/>
+                <w:bCs w:val="false"/>
+                <w:sz w:val="17"/>
+                <w:szCs w:val="17"/>
+              </w:rPr>
+              <w:t xml:space="preserve">Cria uma cópia de segurança da base de dados</w:t>
+            </w:r>
+          </w:p>
+        </w:tc>
+      </w:tr>
+      <w:tr>
+        <w:trPr>
+          <w:cantSplit/>
+          <w:tblHeader w:val="false"/>
+        </w:trPr>
+        <w:tc>
+          <w:tcPr>
+            <w:tcW w:type="dxa" w:w="4600"/>
+            <w:tcBorders>
+              <w:top w:val="none" w:color="FFFFFF" w:sz="0"/>
+              <w:left w:val="none" w:color="FFFFFF" w:sz="0"/>
               <w:bottom w:val="single" w:color="000000" w:sz="4"/>
               <w:right w:val="none" w:color="FFFFFF" w:sz="0"/>
             </w:tcBorders>
@@ -48868,7 +50385,7 @@
           <w:sz w:val="26"/>
           <w:szCs w:val="26"/>
         </w:rPr>
-        <w:t xml:space="preserve">F.6 Guardar o modelo depois do treino</w:t>
+        <w:t xml:space="preserve">F.7 Guardar o modelo depois do treino</w:t>
       </w:r>
     </w:p>
     <w:p>

</xml_diff>